<commit_message>
adds Kdb and Kds factors to AASHTO 5.7.3.5-1&2
</commit_message>
<xml_diff>
--- a/Equations/LongitudinalReinforcementForShear.docx
+++ b/Equations/LongitudinalReinforcementForShear.docx
@@ -1,6 +1,6 @@
 
 <file path=word/document.xml><?xml version="1.0" encoding="utf-8"?>
-<w:document xmlns:wpc="http://schemas.microsoft.com/office/word/2010/wordprocessingCanvas" xmlns:cx="http://schemas.microsoft.com/office/drawing/2014/chartex" xmlns:cx1="http://schemas.microsoft.com/office/drawing/2015/9/8/chartex" xmlns:cx2="http://schemas.microsoft.com/office/drawing/2015/10/21/chartex" xmlns:cx3="http://schemas.microsoft.com/office/drawing/2016/5/9/chartex" xmlns:cx4="http://schemas.microsoft.com/office/drawing/2016/5/10/chartex" xmlns:cx5="http://schemas.microsoft.com/office/drawing/2016/5/11/chartex" xmlns:cx6="http://schemas.microsoft.com/office/drawing/2016/5/12/chartex" xmlns:cx7="http://schemas.microsoft.com/office/drawing/2016/5/13/chartex" xmlns:cx8="http://schemas.microsoft.com/office/drawing/2016/5/14/chartex" xmlns:mc="http://schemas.openxmlformats.org/markup-compatibility/2006" xmlns:aink="http://schemas.microsoft.com/office/drawing/2016/ink" xmlns:am3d="http://schemas.microsoft.com/office/drawing/2017/model3d" xmlns:o="urn:schemas-microsoft-com:office:office" xmlns:r="http://schemas.openxmlformats.org/officeDocument/2006/relationships" xmlns:m="http://schemas.openxmlformats.org/officeDocument/2006/math" xmlns:v="urn:schemas-microsoft-com:vml" xmlns:wp14="http://schemas.microsoft.com/office/word/2010/wordprocessingDrawing" xmlns:wp="http://schemas.openxmlformats.org/drawingml/2006/wordprocessingDrawing" xmlns:w10="urn:schemas-microsoft-com:office:word" xmlns:w="http://schemas.openxmlformats.org/wordprocessingml/2006/main" xmlns:w14="http://schemas.microsoft.com/office/word/2010/wordml" xmlns:w15="http://schemas.microsoft.com/office/word/2012/wordml" xmlns:w16cex="http://schemas.microsoft.com/office/word/2018/wordml/cex" xmlns:w16cid="http://schemas.microsoft.com/office/word/2016/wordml/cid" xmlns:w16="http://schemas.microsoft.com/office/word/2018/wordml" xmlns:w16se="http://schemas.microsoft.com/office/word/2015/wordml/symex" xmlns:wpg="http://schemas.microsoft.com/office/word/2010/wordprocessingGroup" xmlns:wpi="http://schemas.microsoft.com/office/word/2010/wordprocessingInk" xmlns:wne="http://schemas.microsoft.com/office/word/2006/wordml" xmlns:wps="http://schemas.microsoft.com/office/word/2010/wordprocessingShape" mc:Ignorable="w14 w15 w16se w16cid w16 w16cex wp14">
+<w:document xmlns:wpc="http://schemas.microsoft.com/office/word/2010/wordprocessingCanvas" xmlns:cx="http://schemas.microsoft.com/office/drawing/2014/chartex" xmlns:cx1="http://schemas.microsoft.com/office/drawing/2015/9/8/chartex" xmlns:cx2="http://schemas.microsoft.com/office/drawing/2015/10/21/chartex" xmlns:cx3="http://schemas.microsoft.com/office/drawing/2016/5/9/chartex" xmlns:cx4="http://schemas.microsoft.com/office/drawing/2016/5/10/chartex" xmlns:cx5="http://schemas.microsoft.com/office/drawing/2016/5/11/chartex" xmlns:cx6="http://schemas.microsoft.com/office/drawing/2016/5/12/chartex" xmlns:cx7="http://schemas.microsoft.com/office/drawing/2016/5/13/chartex" xmlns:cx8="http://schemas.microsoft.com/office/drawing/2016/5/14/chartex" xmlns:mc="http://schemas.openxmlformats.org/markup-compatibility/2006" xmlns:aink="http://schemas.microsoft.com/office/drawing/2016/ink" xmlns:am3d="http://schemas.microsoft.com/office/drawing/2017/model3d" xmlns:o="urn:schemas-microsoft-com:office:office" xmlns:oel="http://schemas.microsoft.com/office/2019/extlst" xmlns:r="http://schemas.openxmlformats.org/officeDocument/2006/relationships" xmlns:m="http://schemas.openxmlformats.org/officeDocument/2006/math" xmlns:v="urn:schemas-microsoft-com:vml" xmlns:wp14="http://schemas.microsoft.com/office/word/2010/wordprocessingDrawing" xmlns:wp="http://schemas.openxmlformats.org/drawingml/2006/wordprocessingDrawing" xmlns:w10="urn:schemas-microsoft-com:office:word" xmlns:w="http://schemas.openxmlformats.org/wordprocessingml/2006/main" xmlns:w14="http://schemas.microsoft.com/office/word/2010/wordml" xmlns:w15="http://schemas.microsoft.com/office/word/2012/wordml" xmlns:w16cex="http://schemas.microsoft.com/office/word/2018/wordml/cex" xmlns:w16cid="http://schemas.microsoft.com/office/word/2016/wordml/cid" xmlns:w16="http://schemas.microsoft.com/office/word/2018/wordml" xmlns:w16du="http://schemas.microsoft.com/office/word/2023/wordml/word16du" xmlns:w16sdtdh="http://schemas.microsoft.com/office/word/2020/wordml/sdtdatahash" xmlns:w16sdtfl="http://schemas.microsoft.com/office/word/2024/wordml/sdtformatlock" xmlns:w16se="http://schemas.microsoft.com/office/word/2015/wordml/symex" xmlns:wpg="http://schemas.microsoft.com/office/word/2010/wordprocessingGroup" xmlns:wpi="http://schemas.microsoft.com/office/word/2010/wordprocessingInk" xmlns:wne="http://schemas.microsoft.com/office/word/2006/wordml" xmlns:wps="http://schemas.microsoft.com/office/word/2010/wordprocessingShape" mc:Ignorable="w14 w15 w16se w16cid w16 w16cex w16sdtdh w16sdtfl w16du wp14">
   <w:body>
     <w:p>
       <w:pPr>
@@ -58,6 +58,34 @@
                     </m:ctrlPr>
                   </m:sSubPr>
                   <m:e>
+                    <w:bookmarkStart w:id="0" w:name="_Hlk212127231"/>
+                    <m:sSub>
+                      <m:sSubPr>
+                        <m:ctrlPr>
+                          <w:rPr>
+                            <w:rFonts w:ascii="Cambria Math" w:hAnsi="Cambria Math"/>
+                            <w:i/>
+                          </w:rPr>
+                        </m:ctrlPr>
+                      </m:sSubPr>
+                      <m:e>
+                        <m:r>
+                          <w:rPr>
+                            <w:rFonts w:ascii="Cambria Math" w:hAnsi="Cambria Math"/>
+                          </w:rPr>
+                          <m:t>K</m:t>
+                        </m:r>
+                      </m:e>
+                      <m:sub>
+                        <m:r>
+                          <w:rPr>
+                            <w:rFonts w:ascii="Cambria Math" w:hAnsi="Cambria Math"/>
+                          </w:rPr>
+                          <m:t>db</m:t>
+                        </m:r>
+                      </m:sub>
+                    </m:sSub>
+                    <w:bookmarkEnd w:id="0"/>
                     <m:r>
                       <w:rPr>
                         <w:rFonts w:ascii="Cambria Math" w:hAnsi="Cambria Math"/>
@@ -116,6 +144,32 @@
                     </m:ctrlPr>
                   </m:sSubPr>
                   <m:e>
+                    <m:sSub>
+                      <m:sSubPr>
+                        <m:ctrlPr>
+                          <w:rPr>
+                            <w:rFonts w:ascii="Cambria Math" w:hAnsi="Cambria Math"/>
+                            <w:i/>
+                          </w:rPr>
+                        </m:ctrlPr>
+                      </m:sSubPr>
+                      <m:e>
+                        <m:r>
+                          <w:rPr>
+                            <w:rFonts w:ascii="Cambria Math" w:hAnsi="Cambria Math"/>
+                          </w:rPr>
+                          <m:t>K</m:t>
+                        </m:r>
+                      </m:e>
+                      <m:sub>
+                        <m:r>
+                          <w:rPr>
+                            <w:rFonts w:ascii="Cambria Math" w:hAnsi="Cambria Math"/>
+                          </w:rPr>
+                          <m:t>ds</m:t>
+                        </m:r>
+                      </m:sub>
+                    </m:sSub>
                     <m:r>
                       <w:rPr>
                         <w:rFonts w:ascii="Cambria Math" w:hAnsi="Cambria Math"/>
@@ -555,6 +609,32 @@
                     </m:ctrlPr>
                   </m:sSubPr>
                   <m:e>
+                    <m:sSub>
+                      <m:sSubPr>
+                        <m:ctrlPr>
+                          <w:rPr>
+                            <w:rFonts w:ascii="Cambria Math" w:hAnsi="Cambria Math"/>
+                            <w:i/>
+                          </w:rPr>
+                        </m:ctrlPr>
+                      </m:sSubPr>
+                      <m:e>
+                        <m:r>
+                          <w:rPr>
+                            <w:rFonts w:ascii="Cambria Math" w:hAnsi="Cambria Math"/>
+                          </w:rPr>
+                          <m:t>K</m:t>
+                        </m:r>
+                      </m:e>
+                      <m:sub>
+                        <m:r>
+                          <w:rPr>
+                            <w:rFonts w:ascii="Cambria Math" w:hAnsi="Cambria Math"/>
+                          </w:rPr>
+                          <m:t>db</m:t>
+                        </m:r>
+                      </m:sub>
+                    </m:sSub>
                     <m:r>
                       <w:rPr>
                         <w:rFonts w:ascii="Cambria Math" w:hAnsi="Cambria Math"/>
@@ -613,6 +693,32 @@
                     </m:ctrlPr>
                   </m:sSubPr>
                   <m:e>
+                    <m:sSub>
+                      <m:sSubPr>
+                        <m:ctrlPr>
+                          <w:rPr>
+                            <w:rFonts w:ascii="Cambria Math" w:hAnsi="Cambria Math"/>
+                            <w:i/>
+                          </w:rPr>
+                        </m:ctrlPr>
+                      </m:sSubPr>
+                      <m:e>
+                        <m:r>
+                          <w:rPr>
+                            <w:rFonts w:ascii="Cambria Math" w:hAnsi="Cambria Math"/>
+                          </w:rPr>
+                          <m:t>K</m:t>
+                        </m:r>
+                      </m:e>
+                      <m:sub>
+                        <m:r>
+                          <w:rPr>
+                            <w:rFonts w:ascii="Cambria Math" w:hAnsi="Cambria Math"/>
+                          </w:rPr>
+                          <m:t>ds</m:t>
+                        </m:r>
+                      </m:sub>
+                    </m:sSub>
                     <m:r>
                       <w:rPr>
                         <w:rFonts w:ascii="Cambria Math" w:hAnsi="Cambria Math"/>
@@ -902,6 +1008,32 @@
                     </m:ctrlPr>
                   </m:sSubPr>
                   <m:e>
+                    <m:sSub>
+                      <m:sSubPr>
+                        <m:ctrlPr>
+                          <w:rPr>
+                            <w:rFonts w:ascii="Cambria Math" w:hAnsi="Cambria Math"/>
+                            <w:i/>
+                          </w:rPr>
+                        </m:ctrlPr>
+                      </m:sSubPr>
+                      <m:e>
+                        <m:r>
+                          <w:rPr>
+                            <w:rFonts w:ascii="Cambria Math" w:hAnsi="Cambria Math"/>
+                          </w:rPr>
+                          <m:t>K</m:t>
+                        </m:r>
+                      </m:e>
+                      <m:sub>
+                        <m:r>
+                          <w:rPr>
+                            <w:rFonts w:ascii="Cambria Math" w:hAnsi="Cambria Math"/>
+                          </w:rPr>
+                          <m:t>db</m:t>
+                        </m:r>
+                      </m:sub>
+                    </m:sSub>
                     <m:r>
                       <w:rPr>
                         <w:rFonts w:ascii="Cambria Math" w:hAnsi="Cambria Math"/>
@@ -960,6 +1092,32 @@
                     </m:ctrlPr>
                   </m:sSubPr>
                   <m:e>
+                    <m:sSub>
+                      <m:sSubPr>
+                        <m:ctrlPr>
+                          <w:rPr>
+                            <w:rFonts w:ascii="Cambria Math" w:hAnsi="Cambria Math"/>
+                            <w:i/>
+                          </w:rPr>
+                        </m:ctrlPr>
+                      </m:sSubPr>
+                      <m:e>
+                        <m:r>
+                          <w:rPr>
+                            <w:rFonts w:ascii="Cambria Math" w:hAnsi="Cambria Math"/>
+                          </w:rPr>
+                          <m:t>K</m:t>
+                        </m:r>
+                      </m:e>
+                      <m:sub>
+                        <m:r>
+                          <w:rPr>
+                            <w:rFonts w:ascii="Cambria Math" w:hAnsi="Cambria Math"/>
+                          </w:rPr>
+                          <m:t>ds</m:t>
+                        </m:r>
+                      </m:sub>
+                    </m:sSub>
                     <m:r>
                       <w:rPr>
                         <w:rFonts w:ascii="Cambria Math" w:hAnsi="Cambria Math"/>
@@ -1385,6 +1543,32 @@
                     </m:ctrlPr>
                   </m:sSubPr>
                   <m:e>
+                    <m:sSub>
+                      <m:sSubPr>
+                        <m:ctrlPr>
+                          <w:rPr>
+                            <w:rFonts w:ascii="Cambria Math" w:hAnsi="Cambria Math"/>
+                            <w:i/>
+                          </w:rPr>
+                        </m:ctrlPr>
+                      </m:sSubPr>
+                      <m:e>
+                        <m:r>
+                          <w:rPr>
+                            <w:rFonts w:ascii="Cambria Math" w:hAnsi="Cambria Math"/>
+                          </w:rPr>
+                          <m:t>K</m:t>
+                        </m:r>
+                      </m:e>
+                      <m:sub>
+                        <m:r>
+                          <w:rPr>
+                            <w:rFonts w:ascii="Cambria Math" w:hAnsi="Cambria Math"/>
+                          </w:rPr>
+                          <m:t>db</m:t>
+                        </m:r>
+                      </m:sub>
+                    </m:sSub>
                     <m:r>
                       <w:rPr>
                         <w:rFonts w:ascii="Cambria Math" w:hAnsi="Cambria Math"/>
@@ -1443,6 +1627,32 @@
                     </m:ctrlPr>
                   </m:sSubPr>
                   <m:e>
+                    <m:sSub>
+                      <m:sSubPr>
+                        <m:ctrlPr>
+                          <w:rPr>
+                            <w:rFonts w:ascii="Cambria Math" w:hAnsi="Cambria Math"/>
+                            <w:i/>
+                          </w:rPr>
+                        </m:ctrlPr>
+                      </m:sSubPr>
+                      <m:e>
+                        <m:r>
+                          <w:rPr>
+                            <w:rFonts w:ascii="Cambria Math" w:hAnsi="Cambria Math"/>
+                          </w:rPr>
+                          <m:t>K</m:t>
+                        </m:r>
+                      </m:e>
+                      <m:sub>
+                        <m:r>
+                          <w:rPr>
+                            <w:rFonts w:ascii="Cambria Math" w:hAnsi="Cambria Math"/>
+                          </w:rPr>
+                          <m:t>ds</m:t>
+                        </m:r>
+                      </m:sub>
+                    </m:sSub>
                     <m:r>
                       <w:rPr>
                         <w:rFonts w:ascii="Cambria Math" w:hAnsi="Cambria Math"/>
@@ -1732,6 +1942,32 @@
                     </m:ctrlPr>
                   </m:sSubPr>
                   <m:e>
+                    <m:sSub>
+                      <m:sSubPr>
+                        <m:ctrlPr>
+                          <w:rPr>
+                            <w:rFonts w:ascii="Cambria Math" w:hAnsi="Cambria Math"/>
+                            <w:i/>
+                          </w:rPr>
+                        </m:ctrlPr>
+                      </m:sSubPr>
+                      <m:e>
+                        <m:r>
+                          <w:rPr>
+                            <w:rFonts w:ascii="Cambria Math" w:hAnsi="Cambria Math"/>
+                          </w:rPr>
+                          <m:t>K</m:t>
+                        </m:r>
+                      </m:e>
+                      <m:sub>
+                        <m:r>
+                          <w:rPr>
+                            <w:rFonts w:ascii="Cambria Math" w:hAnsi="Cambria Math"/>
+                          </w:rPr>
+                          <m:t>db</m:t>
+                        </m:r>
+                      </m:sub>
+                    </m:sSub>
                     <m:r>
                       <w:rPr>
                         <w:rFonts w:ascii="Cambria Math" w:hAnsi="Cambria Math"/>
@@ -1790,6 +2026,32 @@
                     </m:ctrlPr>
                   </m:sSubPr>
                   <m:e>
+                    <m:sSub>
+                      <m:sSubPr>
+                        <m:ctrlPr>
+                          <w:rPr>
+                            <w:rFonts w:ascii="Cambria Math" w:hAnsi="Cambria Math"/>
+                            <w:i/>
+                          </w:rPr>
+                        </m:ctrlPr>
+                      </m:sSubPr>
+                      <m:e>
+                        <m:r>
+                          <w:rPr>
+                            <w:rFonts w:ascii="Cambria Math" w:hAnsi="Cambria Math"/>
+                          </w:rPr>
+                          <m:t>K</m:t>
+                        </m:r>
+                      </m:e>
+                      <m:sub>
+                        <m:r>
+                          <w:rPr>
+                            <w:rFonts w:ascii="Cambria Math" w:hAnsi="Cambria Math"/>
+                          </w:rPr>
+                          <m:t>ds</m:t>
+                        </m:r>
+                      </m:sub>
+                    </m:sSub>
                     <m:r>
                       <w:rPr>
                         <w:rFonts w:ascii="Cambria Math" w:hAnsi="Cambria Math"/>
@@ -2287,6 +2549,32 @@
                     </m:ctrlPr>
                   </m:sSubPr>
                   <m:e>
+                    <m:sSub>
+                      <m:sSubPr>
+                        <m:ctrlPr>
+                          <w:rPr>
+                            <w:rFonts w:ascii="Cambria Math" w:hAnsi="Cambria Math"/>
+                            <w:i/>
+                          </w:rPr>
+                        </m:ctrlPr>
+                      </m:sSubPr>
+                      <m:e>
+                        <m:r>
+                          <w:rPr>
+                            <w:rFonts w:ascii="Cambria Math" w:hAnsi="Cambria Math"/>
+                          </w:rPr>
+                          <m:t>K</m:t>
+                        </m:r>
+                      </m:e>
+                      <m:sub>
+                        <m:r>
+                          <w:rPr>
+                            <w:rFonts w:ascii="Cambria Math" w:hAnsi="Cambria Math"/>
+                          </w:rPr>
+                          <m:t>db</m:t>
+                        </m:r>
+                      </m:sub>
+                    </m:sSub>
                     <m:r>
                       <w:rPr>
                         <w:rFonts w:ascii="Cambria Math" w:hAnsi="Cambria Math"/>
@@ -2345,6 +2633,32 @@
                     </m:ctrlPr>
                   </m:sSubPr>
                   <m:e>
+                    <m:sSub>
+                      <m:sSubPr>
+                        <m:ctrlPr>
+                          <w:rPr>
+                            <w:rFonts w:ascii="Cambria Math" w:hAnsi="Cambria Math"/>
+                            <w:i/>
+                          </w:rPr>
+                        </m:ctrlPr>
+                      </m:sSubPr>
+                      <m:e>
+                        <m:r>
+                          <w:rPr>
+                            <w:rFonts w:ascii="Cambria Math" w:hAnsi="Cambria Math"/>
+                          </w:rPr>
+                          <m:t>K</m:t>
+                        </m:r>
+                      </m:e>
+                      <m:sub>
+                        <m:r>
+                          <w:rPr>
+                            <w:rFonts w:ascii="Cambria Math" w:hAnsi="Cambria Math"/>
+                          </w:rPr>
+                          <m:t>ds</m:t>
+                        </m:r>
+                      </m:sub>
+                    </m:sSub>
                     <m:r>
                       <w:rPr>
                         <w:rFonts w:ascii="Cambria Math" w:hAnsi="Cambria Math"/>
@@ -2692,6 +3006,32 @@
                     </m:ctrlPr>
                   </m:sSubPr>
                   <m:e>
+                    <m:sSub>
+                      <m:sSubPr>
+                        <m:ctrlPr>
+                          <w:rPr>
+                            <w:rFonts w:ascii="Cambria Math" w:hAnsi="Cambria Math"/>
+                            <w:i/>
+                          </w:rPr>
+                        </m:ctrlPr>
+                      </m:sSubPr>
+                      <m:e>
+                        <m:r>
+                          <w:rPr>
+                            <w:rFonts w:ascii="Cambria Math" w:hAnsi="Cambria Math"/>
+                          </w:rPr>
+                          <m:t>K</m:t>
+                        </m:r>
+                      </m:e>
+                      <m:sub>
+                        <m:r>
+                          <w:rPr>
+                            <w:rFonts w:ascii="Cambria Math" w:hAnsi="Cambria Math"/>
+                          </w:rPr>
+                          <m:t>db</m:t>
+                        </m:r>
+                      </m:sub>
+                    </m:sSub>
                     <m:r>
                       <w:rPr>
                         <w:rFonts w:ascii="Cambria Math" w:hAnsi="Cambria Math"/>
@@ -2750,6 +3090,32 @@
                     </m:ctrlPr>
                   </m:sSubPr>
                   <m:e>
+                    <m:sSub>
+                      <m:sSubPr>
+                        <m:ctrlPr>
+                          <w:rPr>
+                            <w:rFonts w:ascii="Cambria Math" w:hAnsi="Cambria Math"/>
+                            <w:i/>
+                          </w:rPr>
+                        </m:ctrlPr>
+                      </m:sSubPr>
+                      <m:e>
+                        <m:r>
+                          <w:rPr>
+                            <w:rFonts w:ascii="Cambria Math" w:hAnsi="Cambria Math"/>
+                          </w:rPr>
+                          <m:t>K</m:t>
+                        </m:r>
+                      </m:e>
+                      <m:sub>
+                        <m:r>
+                          <w:rPr>
+                            <w:rFonts w:ascii="Cambria Math" w:hAnsi="Cambria Math"/>
+                          </w:rPr>
+                          <m:t>ds</m:t>
+                        </m:r>
+                      </m:sub>
+                    </m:sSub>
                     <m:r>
                       <w:rPr>
                         <w:rFonts w:ascii="Cambria Math" w:hAnsi="Cambria Math"/>
@@ -3233,6 +3599,32 @@
                     </m:ctrlPr>
                   </m:sSubPr>
                   <m:e>
+                    <m:sSub>
+                      <m:sSubPr>
+                        <m:ctrlPr>
+                          <w:rPr>
+                            <w:rFonts w:ascii="Cambria Math" w:hAnsi="Cambria Math"/>
+                            <w:i/>
+                          </w:rPr>
+                        </m:ctrlPr>
+                      </m:sSubPr>
+                      <m:e>
+                        <m:r>
+                          <w:rPr>
+                            <w:rFonts w:ascii="Cambria Math" w:hAnsi="Cambria Math"/>
+                          </w:rPr>
+                          <m:t>K</m:t>
+                        </m:r>
+                      </m:e>
+                      <m:sub>
+                        <m:r>
+                          <w:rPr>
+                            <w:rFonts w:ascii="Cambria Math" w:hAnsi="Cambria Math"/>
+                          </w:rPr>
+                          <m:t>db</m:t>
+                        </m:r>
+                      </m:sub>
+                    </m:sSub>
                     <m:r>
                       <w:rPr>
                         <w:rFonts w:ascii="Cambria Math" w:hAnsi="Cambria Math"/>
@@ -3291,6 +3683,32 @@
                     </m:ctrlPr>
                   </m:sSubPr>
                   <m:e>
+                    <m:sSub>
+                      <m:sSubPr>
+                        <m:ctrlPr>
+                          <w:rPr>
+                            <w:rFonts w:ascii="Cambria Math" w:hAnsi="Cambria Math"/>
+                            <w:i/>
+                          </w:rPr>
+                        </m:ctrlPr>
+                      </m:sSubPr>
+                      <m:e>
+                        <m:r>
+                          <w:rPr>
+                            <w:rFonts w:ascii="Cambria Math" w:hAnsi="Cambria Math"/>
+                          </w:rPr>
+                          <m:t>K</m:t>
+                        </m:r>
+                      </m:e>
+                      <m:sub>
+                        <m:r>
+                          <w:rPr>
+                            <w:rFonts w:ascii="Cambria Math" w:hAnsi="Cambria Math"/>
+                          </w:rPr>
+                          <m:t>ds</m:t>
+                        </m:r>
+                      </m:sub>
+                    </m:sSub>
                     <m:r>
                       <w:rPr>
                         <w:rFonts w:ascii="Cambria Math" w:hAnsi="Cambria Math"/>
@@ -3575,6 +3993,2090 @@
                     <w:rFonts w:ascii="Cambria Math" w:hAnsi="Cambria Math"/>
                   </w:rPr>
                   <m:t>5.8.3.5-2</m:t>
+                </m:r>
+              </m:e>
+            </m:mr>
+          </m:m>
+        </m:oMath>
+      </m:oMathPara>
+    </w:p>
+    <w:p>
+      <w:pPr>
+        <w:rPr>
+          <w:rFonts w:eastAsiaTheme="minorEastAsia"/>
+        </w:rPr>
+      </w:pPr>
+      <w:r>
+        <w:rPr>
+          <w:rFonts w:eastAsiaTheme="minorEastAsia"/>
+        </w:rPr>
+        <w:t>LRFD 20</w:t>
+      </w:r>
+      <w:r>
+        <w:rPr>
+          <w:rFonts w:eastAsiaTheme="minorEastAsia"/>
+        </w:rPr>
+        <w:t>17</w:t>
+      </w:r>
+      <w:r>
+        <w:rPr>
+          <w:rFonts w:eastAsiaTheme="minorEastAsia"/>
+        </w:rPr>
+        <w:t xml:space="preserve"> and later</w:t>
+      </w:r>
+    </w:p>
+    <w:p>
+      <w:pPr>
+        <w:rPr>
+          <w:rFonts w:eastAsiaTheme="minorEastAsia"/>
+        </w:rPr>
+      </w:pPr>
+      <m:oMathPara>
+        <m:oMath>
+          <m:m>
+            <m:mPr>
+              <m:mcs>
+                <m:mc>
+                  <m:mcPr>
+                    <m:count m:val="1"/>
+                    <m:mcJc m:val="left"/>
+                  </m:mcPr>
+                </m:mc>
+                <m:mc>
+                  <m:mcPr>
+                    <m:count m:val="1"/>
+                    <m:mcJc m:val="center"/>
+                  </m:mcPr>
+                </m:mc>
+              </m:mcs>
+              <m:ctrlPr>
+                <w:rPr>
+                  <w:rFonts w:ascii="Cambria Math" w:hAnsi="Cambria Math"/>
+                  <w:i/>
+                </w:rPr>
+              </m:ctrlPr>
+            </m:mPr>
+            <m:mr>
+              <m:e>
+                <m:sSub>
+                  <m:sSubPr>
+                    <m:ctrlPr>
+                      <w:rPr>
+                        <w:rFonts w:ascii="Cambria Math" w:hAnsi="Cambria Math"/>
+                        <w:i/>
+                      </w:rPr>
+                    </m:ctrlPr>
+                  </m:sSubPr>
+                  <m:e>
+                    <m:sSub>
+                      <m:sSubPr>
+                        <m:ctrlPr>
+                          <w:rPr>
+                            <w:rFonts w:ascii="Cambria Math" w:hAnsi="Cambria Math"/>
+                            <w:i/>
+                          </w:rPr>
+                        </m:ctrlPr>
+                      </m:sSubPr>
+                      <m:e>
+                        <m:r>
+                          <w:rPr>
+                            <w:rFonts w:ascii="Cambria Math" w:hAnsi="Cambria Math"/>
+                          </w:rPr>
+                          <m:t>K</m:t>
+                        </m:r>
+                      </m:e>
+                      <m:sub>
+                        <m:r>
+                          <w:rPr>
+                            <w:rFonts w:ascii="Cambria Math" w:hAnsi="Cambria Math"/>
+                          </w:rPr>
+                          <m:t>db</m:t>
+                        </m:r>
+                      </m:sub>
+                    </m:sSub>
+                    <m:r>
+                      <w:rPr>
+                        <w:rFonts w:ascii="Cambria Math" w:hAnsi="Cambria Math"/>
+                      </w:rPr>
+                      <m:t>A</m:t>
+                    </m:r>
+                  </m:e>
+                  <m:sub>
+                    <m:r>
+                      <w:rPr>
+                        <w:rFonts w:ascii="Cambria Math" w:hAnsi="Cambria Math"/>
+                      </w:rPr>
+                      <m:t>s</m:t>
+                    </m:r>
+                  </m:sub>
+                </m:sSub>
+                <m:sSub>
+                  <m:sSubPr>
+                    <m:ctrlPr>
+                      <w:rPr>
+                        <w:rFonts w:ascii="Cambria Math" w:hAnsi="Cambria Math"/>
+                        <w:i/>
+                      </w:rPr>
+                    </m:ctrlPr>
+                  </m:sSubPr>
+                  <m:e>
+                    <m:r>
+                      <w:rPr>
+                        <w:rFonts w:ascii="Cambria Math" w:hAnsi="Cambria Math"/>
+                      </w:rPr>
+                      <m:t>f</m:t>
+                    </m:r>
+                  </m:e>
+                  <m:sub>
+                    <m:r>
+                      <w:rPr>
+                        <w:rFonts w:ascii="Cambria Math" w:hAnsi="Cambria Math"/>
+                      </w:rPr>
+                      <m:t>y</m:t>
+                    </m:r>
+                  </m:sub>
+                </m:sSub>
+                <m:r>
+                  <w:rPr>
+                    <w:rFonts w:ascii="Cambria Math" w:hAnsi="Cambria Math"/>
+                  </w:rPr>
+                  <m:t>+</m:t>
+                </m:r>
+                <m:sSub>
+                  <m:sSubPr>
+                    <m:ctrlPr>
+                      <w:rPr>
+                        <w:rFonts w:ascii="Cambria Math" w:hAnsi="Cambria Math"/>
+                        <w:i/>
+                      </w:rPr>
+                    </m:ctrlPr>
+                  </m:sSubPr>
+                  <m:e>
+                    <m:sSub>
+                      <m:sSubPr>
+                        <m:ctrlPr>
+                          <w:rPr>
+                            <w:rFonts w:ascii="Cambria Math" w:hAnsi="Cambria Math"/>
+                            <w:i/>
+                          </w:rPr>
+                        </m:ctrlPr>
+                      </m:sSubPr>
+                      <m:e>
+                        <m:r>
+                          <w:rPr>
+                            <w:rFonts w:ascii="Cambria Math" w:hAnsi="Cambria Math"/>
+                          </w:rPr>
+                          <m:t>K</m:t>
+                        </m:r>
+                      </m:e>
+                      <m:sub>
+                        <m:r>
+                          <w:rPr>
+                            <w:rFonts w:ascii="Cambria Math" w:hAnsi="Cambria Math"/>
+                          </w:rPr>
+                          <m:t>ds</m:t>
+                        </m:r>
+                      </m:sub>
+                    </m:sSub>
+                    <m:r>
+                      <w:rPr>
+                        <w:rFonts w:ascii="Cambria Math" w:hAnsi="Cambria Math"/>
+                      </w:rPr>
+                      <m:t>A</m:t>
+                    </m:r>
+                  </m:e>
+                  <m:sub>
+                    <m:r>
+                      <w:rPr>
+                        <w:rFonts w:ascii="Cambria Math" w:hAnsi="Cambria Math"/>
+                      </w:rPr>
+                      <m:t>ps</m:t>
+                    </m:r>
+                  </m:sub>
+                </m:sSub>
+                <m:sSub>
+                  <m:sSubPr>
+                    <m:ctrlPr>
+                      <w:rPr>
+                        <w:rFonts w:ascii="Cambria Math" w:hAnsi="Cambria Math"/>
+                        <w:i/>
+                      </w:rPr>
+                    </m:ctrlPr>
+                  </m:sSubPr>
+                  <m:e>
+                    <m:r>
+                      <w:rPr>
+                        <w:rFonts w:ascii="Cambria Math" w:hAnsi="Cambria Math"/>
+                      </w:rPr>
+                      <m:t>f</m:t>
+                    </m:r>
+                  </m:e>
+                  <m:sub>
+                    <m:r>
+                      <w:rPr>
+                        <w:rFonts w:ascii="Cambria Math" w:hAnsi="Cambria Math"/>
+                      </w:rPr>
+                      <m:t>ps</m:t>
+                    </m:r>
+                  </m:sub>
+                </m:sSub>
+                <m:r>
+                  <w:rPr>
+                    <w:rFonts w:ascii="Cambria Math" w:hAnsi="Cambria Math"/>
+                  </w:rPr>
+                  <m:t>≥</m:t>
+                </m:r>
+                <m:d>
+                  <m:dPr>
+                    <m:begChr m:val="["/>
+                    <m:endChr m:val="]"/>
+                    <m:ctrlPr>
+                      <w:rPr>
+                        <w:rFonts w:ascii="Cambria Math" w:hAnsi="Cambria Math"/>
+                        <w:i/>
+                      </w:rPr>
+                    </m:ctrlPr>
+                  </m:dPr>
+                  <m:e>
+                    <m:f>
+                      <m:fPr>
+                        <m:ctrlPr>
+                          <w:rPr>
+                            <w:rFonts w:ascii="Cambria Math" w:hAnsi="Cambria Math"/>
+                            <w:i/>
+                          </w:rPr>
+                        </m:ctrlPr>
+                      </m:fPr>
+                      <m:num>
+                        <m:sSub>
+                          <m:sSubPr>
+                            <m:ctrlPr>
+                              <w:rPr>
+                                <w:rFonts w:ascii="Cambria Math" w:hAnsi="Cambria Math"/>
+                                <w:i/>
+                              </w:rPr>
+                            </m:ctrlPr>
+                          </m:sSubPr>
+                          <m:e>
+                            <m:r>
+                              <w:rPr>
+                                <w:rFonts w:ascii="Cambria Math" w:hAnsi="Cambria Math"/>
+                              </w:rPr>
+                              <m:t>M</m:t>
+                            </m:r>
+                          </m:e>
+                          <m:sub>
+                            <m:r>
+                              <w:rPr>
+                                <w:rFonts w:ascii="Cambria Math" w:hAnsi="Cambria Math"/>
+                              </w:rPr>
+                              <m:t>u</m:t>
+                            </m:r>
+                          </m:sub>
+                        </m:sSub>
+                      </m:num>
+                      <m:den>
+                        <m:sSub>
+                          <m:sSubPr>
+                            <m:ctrlPr>
+                              <w:rPr>
+                                <w:rFonts w:ascii="Cambria Math" w:hAnsi="Cambria Math"/>
+                                <w:i/>
+                              </w:rPr>
+                            </m:ctrlPr>
+                          </m:sSubPr>
+                          <m:e>
+                            <m:r>
+                              <w:rPr>
+                                <w:rFonts w:ascii="Cambria Math" w:hAnsi="Cambria Math"/>
+                              </w:rPr>
+                              <m:t>d</m:t>
+                            </m:r>
+                          </m:e>
+                          <m:sub>
+                            <m:r>
+                              <w:rPr>
+                                <w:rFonts w:ascii="Cambria Math" w:hAnsi="Cambria Math"/>
+                              </w:rPr>
+                              <m:t>v</m:t>
+                            </m:r>
+                          </m:sub>
+                        </m:sSub>
+                        <m:sSub>
+                          <m:sSubPr>
+                            <m:ctrlPr>
+                              <w:rPr>
+                                <w:rFonts w:ascii="Cambria Math" w:hAnsi="Cambria Math"/>
+                                <w:i/>
+                              </w:rPr>
+                            </m:ctrlPr>
+                          </m:sSubPr>
+                          <m:e>
+                            <m:r>
+                              <w:rPr>
+                                <w:rFonts w:ascii="Cambria Math" w:hAnsi="Cambria Math"/>
+                              </w:rPr>
+                              <m:t>φ</m:t>
+                            </m:r>
+                          </m:e>
+                          <m:sub>
+                            <m:r>
+                              <w:rPr>
+                                <w:rFonts w:ascii="Cambria Math" w:hAnsi="Cambria Math"/>
+                              </w:rPr>
+                              <m:t>f</m:t>
+                            </m:r>
+                          </m:sub>
+                        </m:sSub>
+                      </m:den>
+                    </m:f>
+                    <m:r>
+                      <w:rPr>
+                        <w:rFonts w:ascii="Cambria Math" w:hAnsi="Cambria Math"/>
+                      </w:rPr>
+                      <m:t>+0.5</m:t>
+                    </m:r>
+                    <m:f>
+                      <m:fPr>
+                        <m:ctrlPr>
+                          <w:rPr>
+                            <w:rFonts w:ascii="Cambria Math" w:hAnsi="Cambria Math"/>
+                            <w:i/>
+                          </w:rPr>
+                        </m:ctrlPr>
+                      </m:fPr>
+                      <m:num>
+                        <m:sSub>
+                          <m:sSubPr>
+                            <m:ctrlPr>
+                              <w:rPr>
+                                <w:rFonts w:ascii="Cambria Math" w:hAnsi="Cambria Math"/>
+                                <w:i/>
+                              </w:rPr>
+                            </m:ctrlPr>
+                          </m:sSubPr>
+                          <m:e>
+                            <m:r>
+                              <w:rPr>
+                                <w:rFonts w:ascii="Cambria Math" w:hAnsi="Cambria Math"/>
+                              </w:rPr>
+                              <m:t>N</m:t>
+                            </m:r>
+                          </m:e>
+                          <m:sub>
+                            <m:r>
+                              <w:rPr>
+                                <w:rFonts w:ascii="Cambria Math" w:hAnsi="Cambria Math"/>
+                              </w:rPr>
+                              <m:t>u</m:t>
+                            </m:r>
+                          </m:sub>
+                        </m:sSub>
+                      </m:num>
+                      <m:den>
+                        <m:sSub>
+                          <m:sSubPr>
+                            <m:ctrlPr>
+                              <w:rPr>
+                                <w:rFonts w:ascii="Cambria Math" w:hAnsi="Cambria Math"/>
+                                <w:i/>
+                              </w:rPr>
+                            </m:ctrlPr>
+                          </m:sSubPr>
+                          <m:e>
+                            <m:r>
+                              <w:rPr>
+                                <w:rFonts w:ascii="Cambria Math" w:hAnsi="Cambria Math"/>
+                              </w:rPr>
+                              <m:t>φ</m:t>
+                            </m:r>
+                          </m:e>
+                          <m:sub>
+                            <m:r>
+                              <w:rPr>
+                                <w:rFonts w:ascii="Cambria Math" w:hAnsi="Cambria Math"/>
+                              </w:rPr>
+                              <m:t>a</m:t>
+                            </m:r>
+                          </m:sub>
+                        </m:sSub>
+                      </m:den>
+                    </m:f>
+                    <m:r>
+                      <w:rPr>
+                        <w:rFonts w:ascii="Cambria Math" w:hAnsi="Cambria Math"/>
+                      </w:rPr>
+                      <m:t>+</m:t>
+                    </m:r>
+                    <m:d>
+                      <m:dPr>
+                        <m:ctrlPr>
+                          <w:rPr>
+                            <w:rFonts w:ascii="Cambria Math" w:hAnsi="Cambria Math"/>
+                            <w:i/>
+                          </w:rPr>
+                        </m:ctrlPr>
+                      </m:dPr>
+                      <m:e>
+                        <m:d>
+                          <m:dPr>
+                            <m:begChr m:val="|"/>
+                            <m:endChr m:val="|"/>
+                            <m:ctrlPr>
+                              <w:rPr>
+                                <w:rFonts w:ascii="Cambria Math" w:hAnsi="Cambria Math"/>
+                                <w:i/>
+                              </w:rPr>
+                            </m:ctrlPr>
+                          </m:dPr>
+                          <m:e>
+                            <m:f>
+                              <m:fPr>
+                                <m:ctrlPr>
+                                  <w:rPr>
+                                    <w:rFonts w:ascii="Cambria Math" w:hAnsi="Cambria Math"/>
+                                    <w:i/>
+                                  </w:rPr>
+                                </m:ctrlPr>
+                              </m:fPr>
+                              <m:num>
+                                <m:sSub>
+                                  <m:sSubPr>
+                                    <m:ctrlPr>
+                                      <w:rPr>
+                                        <w:rFonts w:ascii="Cambria Math" w:hAnsi="Cambria Math"/>
+                                        <w:i/>
+                                      </w:rPr>
+                                    </m:ctrlPr>
+                                  </m:sSubPr>
+                                  <m:e>
+                                    <m:r>
+                                      <w:rPr>
+                                        <w:rFonts w:ascii="Cambria Math" w:hAnsi="Cambria Math"/>
+                                      </w:rPr>
+                                      <m:t>V</m:t>
+                                    </m:r>
+                                  </m:e>
+                                  <m:sub>
+                                    <m:r>
+                                      <w:rPr>
+                                        <w:rFonts w:ascii="Cambria Math" w:hAnsi="Cambria Math"/>
+                                      </w:rPr>
+                                      <m:t>u</m:t>
+                                    </m:r>
+                                  </m:sub>
+                                </m:sSub>
+                              </m:num>
+                              <m:den>
+                                <m:sSub>
+                                  <m:sSubPr>
+                                    <m:ctrlPr>
+                                      <w:rPr>
+                                        <w:rFonts w:ascii="Cambria Math" w:hAnsi="Cambria Math"/>
+                                        <w:i/>
+                                      </w:rPr>
+                                    </m:ctrlPr>
+                                  </m:sSubPr>
+                                  <m:e>
+                                    <m:r>
+                                      <w:rPr>
+                                        <w:rFonts w:ascii="Cambria Math" w:hAnsi="Cambria Math"/>
+                                      </w:rPr>
+                                      <m:t>φ</m:t>
+                                    </m:r>
+                                  </m:e>
+                                  <m:sub>
+                                    <m:r>
+                                      <w:rPr>
+                                        <w:rFonts w:ascii="Cambria Math" w:hAnsi="Cambria Math"/>
+                                      </w:rPr>
+                                      <m:t>v</m:t>
+                                    </m:r>
+                                  </m:sub>
+                                </m:sSub>
+                              </m:den>
+                            </m:f>
+                            <m:r>
+                              <w:rPr>
+                                <w:rFonts w:ascii="Cambria Math" w:hAnsi="Cambria Math"/>
+                              </w:rPr>
+                              <m:t>-</m:t>
+                            </m:r>
+                            <m:sSub>
+                              <m:sSubPr>
+                                <m:ctrlPr>
+                                  <w:rPr>
+                                    <w:rFonts w:ascii="Cambria Math" w:hAnsi="Cambria Math"/>
+                                    <w:i/>
+                                  </w:rPr>
+                                </m:ctrlPr>
+                              </m:sSubPr>
+                              <m:e>
+                                <m:r>
+                                  <w:rPr>
+                                    <w:rFonts w:ascii="Cambria Math" w:hAnsi="Cambria Math"/>
+                                  </w:rPr>
+                                  <m:t>V</m:t>
+                                </m:r>
+                              </m:e>
+                              <m:sub>
+                                <m:r>
+                                  <w:rPr>
+                                    <w:rFonts w:ascii="Cambria Math" w:hAnsi="Cambria Math"/>
+                                  </w:rPr>
+                                  <m:t>p</m:t>
+                                </m:r>
+                              </m:sub>
+                            </m:sSub>
+                          </m:e>
+                        </m:d>
+                        <m:r>
+                          <w:rPr>
+                            <w:rFonts w:ascii="Cambria Math" w:hAnsi="Cambria Math"/>
+                          </w:rPr>
+                          <m:t>-0.5</m:t>
+                        </m:r>
+                        <m:sSub>
+                          <m:sSubPr>
+                            <m:ctrlPr>
+                              <w:rPr>
+                                <w:rFonts w:ascii="Cambria Math" w:hAnsi="Cambria Math"/>
+                                <w:i/>
+                              </w:rPr>
+                            </m:ctrlPr>
+                          </m:sSubPr>
+                          <m:e>
+                            <m:r>
+                              <w:rPr>
+                                <w:rFonts w:ascii="Cambria Math" w:hAnsi="Cambria Math"/>
+                              </w:rPr>
+                              <m:t>V</m:t>
+                            </m:r>
+                          </m:e>
+                          <m:sub>
+                            <m:r>
+                              <w:rPr>
+                                <w:rFonts w:ascii="Cambria Math" w:hAnsi="Cambria Math"/>
+                              </w:rPr>
+                              <m:t>s</m:t>
+                            </m:r>
+                          </m:sub>
+                        </m:sSub>
+                      </m:e>
+                    </m:d>
+                    <m:func>
+                      <m:funcPr>
+                        <m:ctrlPr>
+                          <w:rPr>
+                            <w:rFonts w:ascii="Cambria Math" w:hAnsi="Cambria Math"/>
+                            <w:i/>
+                          </w:rPr>
+                        </m:ctrlPr>
+                      </m:funcPr>
+                      <m:fName>
+                        <m:r>
+                          <m:rPr>
+                            <m:sty m:val="p"/>
+                          </m:rPr>
+                          <w:rPr>
+                            <w:rFonts w:ascii="Cambria Math" w:hAnsi="Cambria Math"/>
+                          </w:rPr>
+                          <m:t>cot</m:t>
+                        </m:r>
+                      </m:fName>
+                      <m:e>
+                        <m:r>
+                          <w:rPr>
+                            <w:rFonts w:ascii="Cambria Math" w:hAnsi="Cambria Math"/>
+                          </w:rPr>
+                          <m:t>θ</m:t>
+                        </m:r>
+                      </m:e>
+                    </m:func>
+                  </m:e>
+                </m:d>
+              </m:e>
+              <m:e>
+                <m:r>
+                  <w:rPr>
+                    <w:rFonts w:ascii="Cambria Math" w:hAnsi="Cambria Math"/>
+                  </w:rPr>
+                  <m:t>5.</m:t>
+                </m:r>
+                <m:r>
+                  <w:rPr>
+                    <w:rFonts w:ascii="Cambria Math" w:hAnsi="Cambria Math"/>
+                  </w:rPr>
+                  <m:t>7</m:t>
+                </m:r>
+                <m:r>
+                  <w:rPr>
+                    <w:rFonts w:ascii="Cambria Math" w:hAnsi="Cambria Math"/>
+                  </w:rPr>
+                  <m:t>.3.5-1</m:t>
+                </m:r>
+              </m:e>
+            </m:mr>
+            <m:mr>
+              <m:e>
+                <m:sSub>
+                  <m:sSubPr>
+                    <m:ctrlPr>
+                      <w:rPr>
+                        <w:rFonts w:ascii="Cambria Math" w:hAnsi="Cambria Math"/>
+                        <w:i/>
+                      </w:rPr>
+                    </m:ctrlPr>
+                  </m:sSubPr>
+                  <m:e>
+                    <m:sSub>
+                      <m:sSubPr>
+                        <m:ctrlPr>
+                          <w:rPr>
+                            <w:rFonts w:ascii="Cambria Math" w:hAnsi="Cambria Math"/>
+                            <w:i/>
+                          </w:rPr>
+                        </m:ctrlPr>
+                      </m:sSubPr>
+                      <m:e>
+                        <m:r>
+                          <w:rPr>
+                            <w:rFonts w:ascii="Cambria Math" w:hAnsi="Cambria Math"/>
+                          </w:rPr>
+                          <m:t>K</m:t>
+                        </m:r>
+                      </m:e>
+                      <m:sub>
+                        <m:r>
+                          <w:rPr>
+                            <w:rFonts w:ascii="Cambria Math" w:hAnsi="Cambria Math"/>
+                          </w:rPr>
+                          <m:t>db</m:t>
+                        </m:r>
+                      </m:sub>
+                    </m:sSub>
+                    <m:r>
+                      <w:rPr>
+                        <w:rFonts w:ascii="Cambria Math" w:hAnsi="Cambria Math"/>
+                      </w:rPr>
+                      <m:t>A</m:t>
+                    </m:r>
+                  </m:e>
+                  <m:sub>
+                    <m:r>
+                      <w:rPr>
+                        <w:rFonts w:ascii="Cambria Math" w:hAnsi="Cambria Math"/>
+                      </w:rPr>
+                      <m:t>s</m:t>
+                    </m:r>
+                  </m:sub>
+                </m:sSub>
+                <m:sSub>
+                  <m:sSubPr>
+                    <m:ctrlPr>
+                      <w:rPr>
+                        <w:rFonts w:ascii="Cambria Math" w:hAnsi="Cambria Math"/>
+                        <w:i/>
+                      </w:rPr>
+                    </m:ctrlPr>
+                  </m:sSubPr>
+                  <m:e>
+                    <m:r>
+                      <w:rPr>
+                        <w:rFonts w:ascii="Cambria Math" w:hAnsi="Cambria Math"/>
+                      </w:rPr>
+                      <m:t>f</m:t>
+                    </m:r>
+                  </m:e>
+                  <m:sub>
+                    <m:r>
+                      <w:rPr>
+                        <w:rFonts w:ascii="Cambria Math" w:hAnsi="Cambria Math"/>
+                      </w:rPr>
+                      <m:t>y</m:t>
+                    </m:r>
+                  </m:sub>
+                </m:sSub>
+                <m:r>
+                  <w:rPr>
+                    <w:rFonts w:ascii="Cambria Math" w:hAnsi="Cambria Math"/>
+                  </w:rPr>
+                  <m:t>+</m:t>
+                </m:r>
+                <m:sSub>
+                  <m:sSubPr>
+                    <m:ctrlPr>
+                      <w:rPr>
+                        <w:rFonts w:ascii="Cambria Math" w:hAnsi="Cambria Math"/>
+                        <w:i/>
+                      </w:rPr>
+                    </m:ctrlPr>
+                  </m:sSubPr>
+                  <m:e>
+                    <m:sSub>
+                      <m:sSubPr>
+                        <m:ctrlPr>
+                          <w:rPr>
+                            <w:rFonts w:ascii="Cambria Math" w:hAnsi="Cambria Math"/>
+                            <w:i/>
+                          </w:rPr>
+                        </m:ctrlPr>
+                      </m:sSubPr>
+                      <m:e>
+                        <m:r>
+                          <w:rPr>
+                            <w:rFonts w:ascii="Cambria Math" w:hAnsi="Cambria Math"/>
+                          </w:rPr>
+                          <m:t>K</m:t>
+                        </m:r>
+                      </m:e>
+                      <m:sub>
+                        <m:r>
+                          <w:rPr>
+                            <w:rFonts w:ascii="Cambria Math" w:hAnsi="Cambria Math"/>
+                          </w:rPr>
+                          <m:t>ds</m:t>
+                        </m:r>
+                      </m:sub>
+                    </m:sSub>
+                    <m:r>
+                      <w:rPr>
+                        <w:rFonts w:ascii="Cambria Math" w:hAnsi="Cambria Math"/>
+                      </w:rPr>
+                      <m:t>A</m:t>
+                    </m:r>
+                  </m:e>
+                  <m:sub>
+                    <m:r>
+                      <w:rPr>
+                        <w:rFonts w:ascii="Cambria Math" w:hAnsi="Cambria Math"/>
+                      </w:rPr>
+                      <m:t>ps</m:t>
+                    </m:r>
+                  </m:sub>
+                </m:sSub>
+                <m:sSub>
+                  <m:sSubPr>
+                    <m:ctrlPr>
+                      <w:rPr>
+                        <w:rFonts w:ascii="Cambria Math" w:hAnsi="Cambria Math"/>
+                        <w:i/>
+                      </w:rPr>
+                    </m:ctrlPr>
+                  </m:sSubPr>
+                  <m:e>
+                    <m:r>
+                      <w:rPr>
+                        <w:rFonts w:ascii="Cambria Math" w:hAnsi="Cambria Math"/>
+                      </w:rPr>
+                      <m:t>f</m:t>
+                    </m:r>
+                  </m:e>
+                  <m:sub>
+                    <m:r>
+                      <w:rPr>
+                        <w:rFonts w:ascii="Cambria Math" w:hAnsi="Cambria Math"/>
+                      </w:rPr>
+                      <m:t>ps</m:t>
+                    </m:r>
+                  </m:sub>
+                </m:sSub>
+                <m:r>
+                  <w:rPr>
+                    <w:rFonts w:ascii="Cambria Math" w:hAnsi="Cambria Math"/>
+                  </w:rPr>
+                  <m:t>≥</m:t>
+                </m:r>
+                <m:d>
+                  <m:dPr>
+                    <m:ctrlPr>
+                      <w:rPr>
+                        <w:rFonts w:ascii="Cambria Math" w:hAnsi="Cambria Math"/>
+                        <w:i/>
+                      </w:rPr>
+                    </m:ctrlPr>
+                  </m:dPr>
+                  <m:e>
+                    <m:f>
+                      <m:fPr>
+                        <m:ctrlPr>
+                          <w:rPr>
+                            <w:rFonts w:ascii="Cambria Math" w:hAnsi="Cambria Math"/>
+                            <w:i/>
+                          </w:rPr>
+                        </m:ctrlPr>
+                      </m:fPr>
+                      <m:num>
+                        <m:sSub>
+                          <m:sSubPr>
+                            <m:ctrlPr>
+                              <w:rPr>
+                                <w:rFonts w:ascii="Cambria Math" w:hAnsi="Cambria Math"/>
+                                <w:i/>
+                              </w:rPr>
+                            </m:ctrlPr>
+                          </m:sSubPr>
+                          <m:e>
+                            <m:r>
+                              <w:rPr>
+                                <w:rFonts w:ascii="Cambria Math" w:hAnsi="Cambria Math"/>
+                              </w:rPr>
+                              <m:t>V</m:t>
+                            </m:r>
+                          </m:e>
+                          <m:sub>
+                            <m:r>
+                              <w:rPr>
+                                <w:rFonts w:ascii="Cambria Math" w:hAnsi="Cambria Math"/>
+                              </w:rPr>
+                              <m:t>u</m:t>
+                            </m:r>
+                          </m:sub>
+                        </m:sSub>
+                      </m:num>
+                      <m:den>
+                        <m:sSub>
+                          <m:sSubPr>
+                            <m:ctrlPr>
+                              <w:rPr>
+                                <w:rFonts w:ascii="Cambria Math" w:hAnsi="Cambria Math"/>
+                                <w:i/>
+                              </w:rPr>
+                            </m:ctrlPr>
+                          </m:sSubPr>
+                          <m:e>
+                            <m:r>
+                              <w:rPr>
+                                <w:rFonts w:ascii="Cambria Math" w:hAnsi="Cambria Math"/>
+                              </w:rPr>
+                              <m:t>φ</m:t>
+                            </m:r>
+                          </m:e>
+                          <m:sub>
+                            <m:r>
+                              <w:rPr>
+                                <w:rFonts w:ascii="Cambria Math" w:hAnsi="Cambria Math"/>
+                              </w:rPr>
+                              <m:t>v</m:t>
+                            </m:r>
+                          </m:sub>
+                        </m:sSub>
+                      </m:den>
+                    </m:f>
+                    <m:r>
+                      <w:rPr>
+                        <w:rFonts w:ascii="Cambria Math" w:hAnsi="Cambria Math"/>
+                      </w:rPr>
+                      <m:t>-</m:t>
+                    </m:r>
+                    <m:sSub>
+                      <m:sSubPr>
+                        <m:ctrlPr>
+                          <w:rPr>
+                            <w:rFonts w:ascii="Cambria Math" w:hAnsi="Cambria Math"/>
+                            <w:i/>
+                          </w:rPr>
+                        </m:ctrlPr>
+                      </m:sSubPr>
+                      <m:e>
+                        <m:r>
+                          <w:rPr>
+                            <w:rFonts w:ascii="Cambria Math" w:hAnsi="Cambria Math"/>
+                          </w:rPr>
+                          <m:t>V</m:t>
+                        </m:r>
+                      </m:e>
+                      <m:sub>
+                        <m:r>
+                          <w:rPr>
+                            <w:rFonts w:ascii="Cambria Math" w:hAnsi="Cambria Math"/>
+                          </w:rPr>
+                          <m:t>p</m:t>
+                        </m:r>
+                      </m:sub>
+                    </m:sSub>
+                    <m:r>
+                      <w:rPr>
+                        <w:rFonts w:ascii="Cambria Math" w:hAnsi="Cambria Math"/>
+                      </w:rPr>
+                      <m:t>-0.5</m:t>
+                    </m:r>
+                    <m:sSub>
+                      <m:sSubPr>
+                        <m:ctrlPr>
+                          <w:rPr>
+                            <w:rFonts w:ascii="Cambria Math" w:hAnsi="Cambria Math"/>
+                            <w:i/>
+                          </w:rPr>
+                        </m:ctrlPr>
+                      </m:sSubPr>
+                      <m:e>
+                        <m:r>
+                          <w:rPr>
+                            <w:rFonts w:ascii="Cambria Math" w:hAnsi="Cambria Math"/>
+                          </w:rPr>
+                          <m:t>V</m:t>
+                        </m:r>
+                      </m:e>
+                      <m:sub>
+                        <m:r>
+                          <w:rPr>
+                            <w:rFonts w:ascii="Cambria Math" w:hAnsi="Cambria Math"/>
+                          </w:rPr>
+                          <m:t>s</m:t>
+                        </m:r>
+                      </m:sub>
+                    </m:sSub>
+                  </m:e>
+                </m:d>
+                <m:func>
+                  <m:funcPr>
+                    <m:ctrlPr>
+                      <w:rPr>
+                        <w:rFonts w:ascii="Cambria Math" w:hAnsi="Cambria Math"/>
+                        <w:i/>
+                      </w:rPr>
+                    </m:ctrlPr>
+                  </m:funcPr>
+                  <m:fName>
+                    <m:r>
+                      <m:rPr>
+                        <m:sty m:val="p"/>
+                      </m:rPr>
+                      <w:rPr>
+                        <w:rFonts w:ascii="Cambria Math" w:hAnsi="Cambria Math"/>
+                      </w:rPr>
+                      <m:t>cot</m:t>
+                    </m:r>
+                  </m:fName>
+                  <m:e>
+                    <m:r>
+                      <w:rPr>
+                        <w:rFonts w:ascii="Cambria Math" w:hAnsi="Cambria Math"/>
+                      </w:rPr>
+                      <m:t>θ</m:t>
+                    </m:r>
+                  </m:e>
+                </m:func>
+              </m:e>
+              <m:e>
+                <m:r>
+                  <w:rPr>
+                    <w:rFonts w:ascii="Cambria Math" w:hAnsi="Cambria Math"/>
+                  </w:rPr>
+                  <m:t>5.</m:t>
+                </m:r>
+                <m:r>
+                  <w:rPr>
+                    <w:rFonts w:ascii="Cambria Math" w:hAnsi="Cambria Math"/>
+                  </w:rPr>
+                  <m:t>7</m:t>
+                </m:r>
+                <m:r>
+                  <w:rPr>
+                    <w:rFonts w:ascii="Cambria Math" w:hAnsi="Cambria Math"/>
+                  </w:rPr>
+                  <m:t>.3.5-2</m:t>
+                </m:r>
+              </m:e>
+            </m:mr>
+          </m:m>
+        </m:oMath>
+      </m:oMathPara>
+    </w:p>
+    <w:p>
+      <w:pPr>
+        <w:rPr>
+          <w:rFonts w:eastAsiaTheme="minorEastAsia"/>
+        </w:rPr>
+      </w:pPr>
+      <w:r>
+        <w:rPr>
+          <w:rFonts w:eastAsiaTheme="minorEastAsia"/>
+        </w:rPr>
+        <w:t>LRFD 20</w:t>
+      </w:r>
+      <w:r>
+        <w:rPr>
+          <w:rFonts w:eastAsiaTheme="minorEastAsia"/>
+        </w:rPr>
+        <w:t>17</w:t>
+      </w:r>
+      <w:r>
+        <w:rPr>
+          <w:rFonts w:eastAsiaTheme="minorEastAsia"/>
+        </w:rPr>
+        <w:t xml:space="preserve"> and later with PT</w:t>
+      </w:r>
+    </w:p>
+    <w:p>
+      <w:pPr>
+        <w:rPr>
+          <w:rFonts w:eastAsiaTheme="minorEastAsia"/>
+        </w:rPr>
+      </w:pPr>
+      <m:oMathPara>
+        <m:oMath>
+          <m:m>
+            <m:mPr>
+              <m:mcs>
+                <m:mc>
+                  <m:mcPr>
+                    <m:count m:val="1"/>
+                    <m:mcJc m:val="left"/>
+                  </m:mcPr>
+                </m:mc>
+                <m:mc>
+                  <m:mcPr>
+                    <m:count m:val="1"/>
+                    <m:mcJc m:val="center"/>
+                  </m:mcPr>
+                </m:mc>
+              </m:mcs>
+              <m:ctrlPr>
+                <w:rPr>
+                  <w:rFonts w:ascii="Cambria Math" w:hAnsi="Cambria Math"/>
+                  <w:i/>
+                </w:rPr>
+              </m:ctrlPr>
+            </m:mPr>
+            <m:mr>
+              <m:e>
+                <m:sSub>
+                  <m:sSubPr>
+                    <m:ctrlPr>
+                      <w:rPr>
+                        <w:rFonts w:ascii="Cambria Math" w:hAnsi="Cambria Math"/>
+                        <w:i/>
+                      </w:rPr>
+                    </m:ctrlPr>
+                  </m:sSubPr>
+                  <m:e>
+                    <m:sSub>
+                      <m:sSubPr>
+                        <m:ctrlPr>
+                          <w:rPr>
+                            <w:rFonts w:ascii="Cambria Math" w:hAnsi="Cambria Math"/>
+                            <w:i/>
+                          </w:rPr>
+                        </m:ctrlPr>
+                      </m:sSubPr>
+                      <m:e>
+                        <m:r>
+                          <w:rPr>
+                            <w:rFonts w:ascii="Cambria Math" w:hAnsi="Cambria Math"/>
+                          </w:rPr>
+                          <m:t>K</m:t>
+                        </m:r>
+                      </m:e>
+                      <m:sub>
+                        <m:r>
+                          <w:rPr>
+                            <w:rFonts w:ascii="Cambria Math" w:hAnsi="Cambria Math"/>
+                          </w:rPr>
+                          <m:t>db</m:t>
+                        </m:r>
+                      </m:sub>
+                    </m:sSub>
+                    <m:r>
+                      <w:rPr>
+                        <w:rFonts w:ascii="Cambria Math" w:hAnsi="Cambria Math"/>
+                      </w:rPr>
+                      <m:t>A</m:t>
+                    </m:r>
+                  </m:e>
+                  <m:sub>
+                    <m:r>
+                      <w:rPr>
+                        <w:rFonts w:ascii="Cambria Math" w:hAnsi="Cambria Math"/>
+                      </w:rPr>
+                      <m:t>s</m:t>
+                    </m:r>
+                  </m:sub>
+                </m:sSub>
+                <m:sSub>
+                  <m:sSubPr>
+                    <m:ctrlPr>
+                      <w:rPr>
+                        <w:rFonts w:ascii="Cambria Math" w:hAnsi="Cambria Math"/>
+                        <w:i/>
+                      </w:rPr>
+                    </m:ctrlPr>
+                  </m:sSubPr>
+                  <m:e>
+                    <m:r>
+                      <w:rPr>
+                        <w:rFonts w:ascii="Cambria Math" w:hAnsi="Cambria Math"/>
+                      </w:rPr>
+                      <m:t>f</m:t>
+                    </m:r>
+                  </m:e>
+                  <m:sub>
+                    <m:r>
+                      <w:rPr>
+                        <w:rFonts w:ascii="Cambria Math" w:hAnsi="Cambria Math"/>
+                      </w:rPr>
+                      <m:t>y</m:t>
+                    </m:r>
+                  </m:sub>
+                </m:sSub>
+                <m:r>
+                  <w:rPr>
+                    <w:rFonts w:ascii="Cambria Math" w:hAnsi="Cambria Math"/>
+                  </w:rPr>
+                  <m:t>+</m:t>
+                </m:r>
+                <m:sSub>
+                  <m:sSubPr>
+                    <m:ctrlPr>
+                      <w:rPr>
+                        <w:rFonts w:ascii="Cambria Math" w:hAnsi="Cambria Math"/>
+                        <w:i/>
+                      </w:rPr>
+                    </m:ctrlPr>
+                  </m:sSubPr>
+                  <m:e>
+                    <m:sSub>
+                      <m:sSubPr>
+                        <m:ctrlPr>
+                          <w:rPr>
+                            <w:rFonts w:ascii="Cambria Math" w:hAnsi="Cambria Math"/>
+                            <w:i/>
+                          </w:rPr>
+                        </m:ctrlPr>
+                      </m:sSubPr>
+                      <m:e>
+                        <m:r>
+                          <w:rPr>
+                            <w:rFonts w:ascii="Cambria Math" w:hAnsi="Cambria Math"/>
+                          </w:rPr>
+                          <m:t>K</m:t>
+                        </m:r>
+                      </m:e>
+                      <m:sub>
+                        <m:r>
+                          <w:rPr>
+                            <w:rFonts w:ascii="Cambria Math" w:hAnsi="Cambria Math"/>
+                          </w:rPr>
+                          <m:t>ds</m:t>
+                        </m:r>
+                      </m:sub>
+                    </m:sSub>
+                    <m:r>
+                      <w:rPr>
+                        <w:rFonts w:ascii="Cambria Math" w:hAnsi="Cambria Math"/>
+                      </w:rPr>
+                      <m:t>A</m:t>
+                    </m:r>
+                  </m:e>
+                  <m:sub>
+                    <m:r>
+                      <w:rPr>
+                        <w:rFonts w:ascii="Cambria Math" w:hAnsi="Cambria Math"/>
+                      </w:rPr>
+                      <m:t>ps</m:t>
+                    </m:r>
+                  </m:sub>
+                </m:sSub>
+                <m:sSub>
+                  <m:sSubPr>
+                    <m:ctrlPr>
+                      <w:rPr>
+                        <w:rFonts w:ascii="Cambria Math" w:hAnsi="Cambria Math"/>
+                        <w:i/>
+                      </w:rPr>
+                    </m:ctrlPr>
+                  </m:sSubPr>
+                  <m:e>
+                    <m:r>
+                      <w:rPr>
+                        <w:rFonts w:ascii="Cambria Math" w:hAnsi="Cambria Math"/>
+                      </w:rPr>
+                      <m:t>f</m:t>
+                    </m:r>
+                  </m:e>
+                  <m:sub>
+                    <m:r>
+                      <w:rPr>
+                        <w:rFonts w:ascii="Cambria Math" w:hAnsi="Cambria Math"/>
+                      </w:rPr>
+                      <m:t>ps</m:t>
+                    </m:r>
+                  </m:sub>
+                </m:sSub>
+                <m:r>
+                  <w:rPr>
+                    <w:rFonts w:ascii="Cambria Math" w:hAnsi="Cambria Math"/>
+                  </w:rPr>
+                  <m:t>+</m:t>
+                </m:r>
+                <m:sSub>
+                  <m:sSubPr>
+                    <m:ctrlPr>
+                      <w:rPr>
+                        <w:rFonts w:ascii="Cambria Math" w:hAnsi="Cambria Math"/>
+                        <w:i/>
+                      </w:rPr>
+                    </m:ctrlPr>
+                  </m:sSubPr>
+                  <m:e>
+                    <m:r>
+                      <w:rPr>
+                        <w:rFonts w:ascii="Cambria Math" w:hAnsi="Cambria Math"/>
+                      </w:rPr>
+                      <m:t>A</m:t>
+                    </m:r>
+                  </m:e>
+                  <m:sub>
+                    <m:r>
+                      <w:rPr>
+                        <w:rFonts w:ascii="Cambria Math" w:hAnsi="Cambria Math"/>
+                      </w:rPr>
+                      <m:t>pt</m:t>
+                    </m:r>
+                  </m:sub>
+                </m:sSub>
+                <m:sSub>
+                  <m:sSubPr>
+                    <m:ctrlPr>
+                      <w:rPr>
+                        <w:rFonts w:ascii="Cambria Math" w:hAnsi="Cambria Math"/>
+                        <w:i/>
+                      </w:rPr>
+                    </m:ctrlPr>
+                  </m:sSubPr>
+                  <m:e>
+                    <m:r>
+                      <w:rPr>
+                        <w:rFonts w:ascii="Cambria Math" w:hAnsi="Cambria Math"/>
+                      </w:rPr>
+                      <m:t>f</m:t>
+                    </m:r>
+                  </m:e>
+                  <m:sub>
+                    <m:r>
+                      <w:rPr>
+                        <w:rFonts w:ascii="Cambria Math" w:hAnsi="Cambria Math"/>
+                      </w:rPr>
+                      <m:t>pt</m:t>
+                    </m:r>
+                  </m:sub>
+                </m:sSub>
+                <m:r>
+                  <w:rPr>
+                    <w:rFonts w:ascii="Cambria Math" w:hAnsi="Cambria Math"/>
+                  </w:rPr>
+                  <m:t>≥</m:t>
+                </m:r>
+                <m:d>
+                  <m:dPr>
+                    <m:begChr m:val="["/>
+                    <m:endChr m:val="]"/>
+                    <m:ctrlPr>
+                      <w:rPr>
+                        <w:rFonts w:ascii="Cambria Math" w:hAnsi="Cambria Math"/>
+                        <w:i/>
+                      </w:rPr>
+                    </m:ctrlPr>
+                  </m:dPr>
+                  <m:e>
+                    <m:f>
+                      <m:fPr>
+                        <m:ctrlPr>
+                          <w:rPr>
+                            <w:rFonts w:ascii="Cambria Math" w:hAnsi="Cambria Math"/>
+                            <w:i/>
+                          </w:rPr>
+                        </m:ctrlPr>
+                      </m:fPr>
+                      <m:num>
+                        <m:sSub>
+                          <m:sSubPr>
+                            <m:ctrlPr>
+                              <w:rPr>
+                                <w:rFonts w:ascii="Cambria Math" w:hAnsi="Cambria Math"/>
+                                <w:i/>
+                              </w:rPr>
+                            </m:ctrlPr>
+                          </m:sSubPr>
+                          <m:e>
+                            <m:r>
+                              <w:rPr>
+                                <w:rFonts w:ascii="Cambria Math" w:hAnsi="Cambria Math"/>
+                              </w:rPr>
+                              <m:t>M</m:t>
+                            </m:r>
+                          </m:e>
+                          <m:sub>
+                            <m:r>
+                              <w:rPr>
+                                <w:rFonts w:ascii="Cambria Math" w:hAnsi="Cambria Math"/>
+                              </w:rPr>
+                              <m:t>u</m:t>
+                            </m:r>
+                          </m:sub>
+                        </m:sSub>
+                      </m:num>
+                      <m:den>
+                        <m:sSub>
+                          <m:sSubPr>
+                            <m:ctrlPr>
+                              <w:rPr>
+                                <w:rFonts w:ascii="Cambria Math" w:hAnsi="Cambria Math"/>
+                                <w:i/>
+                              </w:rPr>
+                            </m:ctrlPr>
+                          </m:sSubPr>
+                          <m:e>
+                            <m:r>
+                              <w:rPr>
+                                <w:rFonts w:ascii="Cambria Math" w:hAnsi="Cambria Math"/>
+                              </w:rPr>
+                              <m:t>d</m:t>
+                            </m:r>
+                          </m:e>
+                          <m:sub>
+                            <m:r>
+                              <w:rPr>
+                                <w:rFonts w:ascii="Cambria Math" w:hAnsi="Cambria Math"/>
+                              </w:rPr>
+                              <m:t>v</m:t>
+                            </m:r>
+                          </m:sub>
+                        </m:sSub>
+                        <m:sSub>
+                          <m:sSubPr>
+                            <m:ctrlPr>
+                              <w:rPr>
+                                <w:rFonts w:ascii="Cambria Math" w:hAnsi="Cambria Math"/>
+                                <w:i/>
+                              </w:rPr>
+                            </m:ctrlPr>
+                          </m:sSubPr>
+                          <m:e>
+                            <m:r>
+                              <w:rPr>
+                                <w:rFonts w:ascii="Cambria Math" w:hAnsi="Cambria Math"/>
+                              </w:rPr>
+                              <m:t>φ</m:t>
+                            </m:r>
+                          </m:e>
+                          <m:sub>
+                            <m:r>
+                              <w:rPr>
+                                <w:rFonts w:ascii="Cambria Math" w:hAnsi="Cambria Math"/>
+                              </w:rPr>
+                              <m:t>f</m:t>
+                            </m:r>
+                          </m:sub>
+                        </m:sSub>
+                      </m:den>
+                    </m:f>
+                    <m:r>
+                      <w:rPr>
+                        <w:rFonts w:ascii="Cambria Math" w:hAnsi="Cambria Math"/>
+                      </w:rPr>
+                      <m:t>+0.5</m:t>
+                    </m:r>
+                    <m:f>
+                      <m:fPr>
+                        <m:ctrlPr>
+                          <w:rPr>
+                            <w:rFonts w:ascii="Cambria Math" w:hAnsi="Cambria Math"/>
+                            <w:i/>
+                          </w:rPr>
+                        </m:ctrlPr>
+                      </m:fPr>
+                      <m:num>
+                        <m:sSub>
+                          <m:sSubPr>
+                            <m:ctrlPr>
+                              <w:rPr>
+                                <w:rFonts w:ascii="Cambria Math" w:hAnsi="Cambria Math"/>
+                                <w:i/>
+                              </w:rPr>
+                            </m:ctrlPr>
+                          </m:sSubPr>
+                          <m:e>
+                            <m:r>
+                              <w:rPr>
+                                <w:rFonts w:ascii="Cambria Math" w:hAnsi="Cambria Math"/>
+                              </w:rPr>
+                              <m:t>N</m:t>
+                            </m:r>
+                          </m:e>
+                          <m:sub>
+                            <m:r>
+                              <w:rPr>
+                                <w:rFonts w:ascii="Cambria Math" w:hAnsi="Cambria Math"/>
+                              </w:rPr>
+                              <m:t>u</m:t>
+                            </m:r>
+                          </m:sub>
+                        </m:sSub>
+                      </m:num>
+                      <m:den>
+                        <m:sSub>
+                          <m:sSubPr>
+                            <m:ctrlPr>
+                              <w:rPr>
+                                <w:rFonts w:ascii="Cambria Math" w:hAnsi="Cambria Math"/>
+                                <w:i/>
+                              </w:rPr>
+                            </m:ctrlPr>
+                          </m:sSubPr>
+                          <m:e>
+                            <m:r>
+                              <w:rPr>
+                                <w:rFonts w:ascii="Cambria Math" w:hAnsi="Cambria Math"/>
+                              </w:rPr>
+                              <m:t>φ</m:t>
+                            </m:r>
+                          </m:e>
+                          <m:sub>
+                            <m:r>
+                              <w:rPr>
+                                <w:rFonts w:ascii="Cambria Math" w:hAnsi="Cambria Math"/>
+                              </w:rPr>
+                              <m:t>a</m:t>
+                            </m:r>
+                          </m:sub>
+                        </m:sSub>
+                      </m:den>
+                    </m:f>
+                    <m:r>
+                      <w:rPr>
+                        <w:rFonts w:ascii="Cambria Math" w:hAnsi="Cambria Math"/>
+                      </w:rPr>
+                      <m:t>+</m:t>
+                    </m:r>
+                    <m:d>
+                      <m:dPr>
+                        <m:ctrlPr>
+                          <w:rPr>
+                            <w:rFonts w:ascii="Cambria Math" w:hAnsi="Cambria Math"/>
+                            <w:i/>
+                          </w:rPr>
+                        </m:ctrlPr>
+                      </m:dPr>
+                      <m:e>
+                        <m:d>
+                          <m:dPr>
+                            <m:begChr m:val="|"/>
+                            <m:endChr m:val="|"/>
+                            <m:ctrlPr>
+                              <w:rPr>
+                                <w:rFonts w:ascii="Cambria Math" w:hAnsi="Cambria Math"/>
+                                <w:i/>
+                              </w:rPr>
+                            </m:ctrlPr>
+                          </m:dPr>
+                          <m:e>
+                            <m:f>
+                              <m:fPr>
+                                <m:ctrlPr>
+                                  <w:rPr>
+                                    <w:rFonts w:ascii="Cambria Math" w:hAnsi="Cambria Math"/>
+                                    <w:i/>
+                                  </w:rPr>
+                                </m:ctrlPr>
+                              </m:fPr>
+                              <m:num>
+                                <m:sSub>
+                                  <m:sSubPr>
+                                    <m:ctrlPr>
+                                      <w:rPr>
+                                        <w:rFonts w:ascii="Cambria Math" w:hAnsi="Cambria Math"/>
+                                        <w:i/>
+                                      </w:rPr>
+                                    </m:ctrlPr>
+                                  </m:sSubPr>
+                                  <m:e>
+                                    <m:r>
+                                      <w:rPr>
+                                        <w:rFonts w:ascii="Cambria Math" w:hAnsi="Cambria Math"/>
+                                      </w:rPr>
+                                      <m:t>V</m:t>
+                                    </m:r>
+                                  </m:e>
+                                  <m:sub>
+                                    <m:r>
+                                      <w:rPr>
+                                        <w:rFonts w:ascii="Cambria Math" w:hAnsi="Cambria Math"/>
+                                      </w:rPr>
+                                      <m:t>u</m:t>
+                                    </m:r>
+                                  </m:sub>
+                                </m:sSub>
+                              </m:num>
+                              <m:den>
+                                <m:sSub>
+                                  <m:sSubPr>
+                                    <m:ctrlPr>
+                                      <w:rPr>
+                                        <w:rFonts w:ascii="Cambria Math" w:hAnsi="Cambria Math"/>
+                                        <w:i/>
+                                      </w:rPr>
+                                    </m:ctrlPr>
+                                  </m:sSubPr>
+                                  <m:e>
+                                    <m:r>
+                                      <w:rPr>
+                                        <w:rFonts w:ascii="Cambria Math" w:hAnsi="Cambria Math"/>
+                                      </w:rPr>
+                                      <m:t>φ</m:t>
+                                    </m:r>
+                                  </m:e>
+                                  <m:sub>
+                                    <m:r>
+                                      <w:rPr>
+                                        <w:rFonts w:ascii="Cambria Math" w:hAnsi="Cambria Math"/>
+                                      </w:rPr>
+                                      <m:t>v</m:t>
+                                    </m:r>
+                                  </m:sub>
+                                </m:sSub>
+                              </m:den>
+                            </m:f>
+                            <m:r>
+                              <w:rPr>
+                                <w:rFonts w:ascii="Cambria Math" w:hAnsi="Cambria Math"/>
+                              </w:rPr>
+                              <m:t>-</m:t>
+                            </m:r>
+                            <m:sSub>
+                              <m:sSubPr>
+                                <m:ctrlPr>
+                                  <w:rPr>
+                                    <w:rFonts w:ascii="Cambria Math" w:hAnsi="Cambria Math"/>
+                                    <w:i/>
+                                  </w:rPr>
+                                </m:ctrlPr>
+                              </m:sSubPr>
+                              <m:e>
+                                <m:r>
+                                  <w:rPr>
+                                    <w:rFonts w:ascii="Cambria Math" w:hAnsi="Cambria Math"/>
+                                  </w:rPr>
+                                  <m:t>V</m:t>
+                                </m:r>
+                              </m:e>
+                              <m:sub>
+                                <m:r>
+                                  <w:rPr>
+                                    <w:rFonts w:ascii="Cambria Math" w:hAnsi="Cambria Math"/>
+                                  </w:rPr>
+                                  <m:t>p</m:t>
+                                </m:r>
+                              </m:sub>
+                            </m:sSub>
+                          </m:e>
+                        </m:d>
+                        <m:r>
+                          <w:rPr>
+                            <w:rFonts w:ascii="Cambria Math" w:hAnsi="Cambria Math"/>
+                          </w:rPr>
+                          <m:t>-0.5</m:t>
+                        </m:r>
+                        <m:sSub>
+                          <m:sSubPr>
+                            <m:ctrlPr>
+                              <w:rPr>
+                                <w:rFonts w:ascii="Cambria Math" w:hAnsi="Cambria Math"/>
+                                <w:i/>
+                              </w:rPr>
+                            </m:ctrlPr>
+                          </m:sSubPr>
+                          <m:e>
+                            <m:r>
+                              <w:rPr>
+                                <w:rFonts w:ascii="Cambria Math" w:hAnsi="Cambria Math"/>
+                              </w:rPr>
+                              <m:t>V</m:t>
+                            </m:r>
+                          </m:e>
+                          <m:sub>
+                            <m:r>
+                              <w:rPr>
+                                <w:rFonts w:ascii="Cambria Math" w:hAnsi="Cambria Math"/>
+                              </w:rPr>
+                              <m:t>s</m:t>
+                            </m:r>
+                          </m:sub>
+                        </m:sSub>
+                      </m:e>
+                    </m:d>
+                    <m:func>
+                      <m:funcPr>
+                        <m:ctrlPr>
+                          <w:rPr>
+                            <w:rFonts w:ascii="Cambria Math" w:hAnsi="Cambria Math"/>
+                            <w:i/>
+                          </w:rPr>
+                        </m:ctrlPr>
+                      </m:funcPr>
+                      <m:fName>
+                        <m:r>
+                          <m:rPr>
+                            <m:sty m:val="p"/>
+                          </m:rPr>
+                          <w:rPr>
+                            <w:rFonts w:ascii="Cambria Math" w:hAnsi="Cambria Math"/>
+                          </w:rPr>
+                          <m:t>cot</m:t>
+                        </m:r>
+                      </m:fName>
+                      <m:e>
+                        <m:r>
+                          <w:rPr>
+                            <w:rFonts w:ascii="Cambria Math" w:hAnsi="Cambria Math"/>
+                          </w:rPr>
+                          <m:t>θ</m:t>
+                        </m:r>
+                      </m:e>
+                    </m:func>
+                  </m:e>
+                </m:d>
+              </m:e>
+              <m:e>
+                <m:r>
+                  <w:rPr>
+                    <w:rFonts w:ascii="Cambria Math" w:hAnsi="Cambria Math"/>
+                  </w:rPr>
+                  <m:t>5.</m:t>
+                </m:r>
+                <m:r>
+                  <w:rPr>
+                    <w:rFonts w:ascii="Cambria Math" w:hAnsi="Cambria Math"/>
+                  </w:rPr>
+                  <m:t>7</m:t>
+                </m:r>
+                <m:r>
+                  <w:rPr>
+                    <w:rFonts w:ascii="Cambria Math" w:hAnsi="Cambria Math"/>
+                  </w:rPr>
+                  <m:t>.3.5-1</m:t>
+                </m:r>
+              </m:e>
+            </m:mr>
+            <m:mr>
+              <m:e>
+                <m:sSub>
+                  <m:sSubPr>
+                    <m:ctrlPr>
+                      <w:rPr>
+                        <w:rFonts w:ascii="Cambria Math" w:hAnsi="Cambria Math"/>
+                        <w:i/>
+                      </w:rPr>
+                    </m:ctrlPr>
+                  </m:sSubPr>
+                  <m:e>
+                    <m:sSub>
+                      <m:sSubPr>
+                        <m:ctrlPr>
+                          <w:rPr>
+                            <w:rFonts w:ascii="Cambria Math" w:hAnsi="Cambria Math"/>
+                            <w:i/>
+                          </w:rPr>
+                        </m:ctrlPr>
+                      </m:sSubPr>
+                      <m:e>
+                        <m:r>
+                          <w:rPr>
+                            <w:rFonts w:ascii="Cambria Math" w:hAnsi="Cambria Math"/>
+                          </w:rPr>
+                          <m:t>K</m:t>
+                        </m:r>
+                      </m:e>
+                      <m:sub>
+                        <m:r>
+                          <w:rPr>
+                            <w:rFonts w:ascii="Cambria Math" w:hAnsi="Cambria Math"/>
+                          </w:rPr>
+                          <m:t>db</m:t>
+                        </m:r>
+                      </m:sub>
+                    </m:sSub>
+                    <m:r>
+                      <w:rPr>
+                        <w:rFonts w:ascii="Cambria Math" w:hAnsi="Cambria Math"/>
+                      </w:rPr>
+                      <m:t>A</m:t>
+                    </m:r>
+                  </m:e>
+                  <m:sub>
+                    <m:r>
+                      <w:rPr>
+                        <w:rFonts w:ascii="Cambria Math" w:hAnsi="Cambria Math"/>
+                      </w:rPr>
+                      <m:t>s</m:t>
+                    </m:r>
+                  </m:sub>
+                </m:sSub>
+                <m:sSub>
+                  <m:sSubPr>
+                    <m:ctrlPr>
+                      <w:rPr>
+                        <w:rFonts w:ascii="Cambria Math" w:hAnsi="Cambria Math"/>
+                        <w:i/>
+                      </w:rPr>
+                    </m:ctrlPr>
+                  </m:sSubPr>
+                  <m:e>
+                    <m:r>
+                      <w:rPr>
+                        <w:rFonts w:ascii="Cambria Math" w:hAnsi="Cambria Math"/>
+                      </w:rPr>
+                      <m:t>f</m:t>
+                    </m:r>
+                  </m:e>
+                  <m:sub>
+                    <m:r>
+                      <w:rPr>
+                        <w:rFonts w:ascii="Cambria Math" w:hAnsi="Cambria Math"/>
+                      </w:rPr>
+                      <m:t>y</m:t>
+                    </m:r>
+                  </m:sub>
+                </m:sSub>
+                <m:r>
+                  <w:rPr>
+                    <w:rFonts w:ascii="Cambria Math" w:hAnsi="Cambria Math"/>
+                  </w:rPr>
+                  <m:t>+</m:t>
+                </m:r>
+                <m:sSub>
+                  <m:sSubPr>
+                    <m:ctrlPr>
+                      <w:rPr>
+                        <w:rFonts w:ascii="Cambria Math" w:hAnsi="Cambria Math"/>
+                        <w:i/>
+                      </w:rPr>
+                    </m:ctrlPr>
+                  </m:sSubPr>
+                  <m:e>
+                    <m:sSub>
+                      <m:sSubPr>
+                        <m:ctrlPr>
+                          <w:rPr>
+                            <w:rFonts w:ascii="Cambria Math" w:hAnsi="Cambria Math"/>
+                            <w:i/>
+                          </w:rPr>
+                        </m:ctrlPr>
+                      </m:sSubPr>
+                      <m:e>
+                        <m:r>
+                          <w:rPr>
+                            <w:rFonts w:ascii="Cambria Math" w:hAnsi="Cambria Math"/>
+                          </w:rPr>
+                          <m:t>K</m:t>
+                        </m:r>
+                      </m:e>
+                      <m:sub>
+                        <m:r>
+                          <w:rPr>
+                            <w:rFonts w:ascii="Cambria Math" w:hAnsi="Cambria Math"/>
+                          </w:rPr>
+                          <m:t>ds</m:t>
+                        </m:r>
+                      </m:sub>
+                    </m:sSub>
+                    <m:r>
+                      <w:rPr>
+                        <w:rFonts w:ascii="Cambria Math" w:hAnsi="Cambria Math"/>
+                      </w:rPr>
+                      <m:t>A</m:t>
+                    </m:r>
+                  </m:e>
+                  <m:sub>
+                    <m:r>
+                      <w:rPr>
+                        <w:rFonts w:ascii="Cambria Math" w:hAnsi="Cambria Math"/>
+                      </w:rPr>
+                      <m:t>ps</m:t>
+                    </m:r>
+                  </m:sub>
+                </m:sSub>
+                <m:sSub>
+                  <m:sSubPr>
+                    <m:ctrlPr>
+                      <w:rPr>
+                        <w:rFonts w:ascii="Cambria Math" w:hAnsi="Cambria Math"/>
+                        <w:i/>
+                      </w:rPr>
+                    </m:ctrlPr>
+                  </m:sSubPr>
+                  <m:e>
+                    <m:r>
+                      <w:rPr>
+                        <w:rFonts w:ascii="Cambria Math" w:hAnsi="Cambria Math"/>
+                      </w:rPr>
+                      <m:t>f</m:t>
+                    </m:r>
+                  </m:e>
+                  <m:sub>
+                    <m:r>
+                      <w:rPr>
+                        <w:rFonts w:ascii="Cambria Math" w:hAnsi="Cambria Math"/>
+                      </w:rPr>
+                      <m:t>ps</m:t>
+                    </m:r>
+                  </m:sub>
+                </m:sSub>
+                <m:r>
+                  <w:rPr>
+                    <w:rFonts w:ascii="Cambria Math" w:hAnsi="Cambria Math"/>
+                  </w:rPr>
+                  <m:t>+</m:t>
+                </m:r>
+                <m:sSub>
+                  <m:sSubPr>
+                    <m:ctrlPr>
+                      <w:rPr>
+                        <w:rFonts w:ascii="Cambria Math" w:hAnsi="Cambria Math"/>
+                        <w:i/>
+                      </w:rPr>
+                    </m:ctrlPr>
+                  </m:sSubPr>
+                  <m:e>
+                    <m:r>
+                      <w:rPr>
+                        <w:rFonts w:ascii="Cambria Math" w:hAnsi="Cambria Math"/>
+                      </w:rPr>
+                      <m:t>A</m:t>
+                    </m:r>
+                  </m:e>
+                  <m:sub>
+                    <m:r>
+                      <w:rPr>
+                        <w:rFonts w:ascii="Cambria Math" w:hAnsi="Cambria Math"/>
+                      </w:rPr>
+                      <m:t>pt</m:t>
+                    </m:r>
+                  </m:sub>
+                </m:sSub>
+                <m:sSub>
+                  <m:sSubPr>
+                    <m:ctrlPr>
+                      <w:rPr>
+                        <w:rFonts w:ascii="Cambria Math" w:hAnsi="Cambria Math"/>
+                        <w:i/>
+                      </w:rPr>
+                    </m:ctrlPr>
+                  </m:sSubPr>
+                  <m:e>
+                    <m:r>
+                      <w:rPr>
+                        <w:rFonts w:ascii="Cambria Math" w:hAnsi="Cambria Math"/>
+                      </w:rPr>
+                      <m:t>f</m:t>
+                    </m:r>
+                  </m:e>
+                  <m:sub>
+                    <m:r>
+                      <w:rPr>
+                        <w:rFonts w:ascii="Cambria Math" w:hAnsi="Cambria Math"/>
+                      </w:rPr>
+                      <m:t>pt</m:t>
+                    </m:r>
+                  </m:sub>
+                </m:sSub>
+                <m:r>
+                  <w:rPr>
+                    <w:rFonts w:ascii="Cambria Math" w:hAnsi="Cambria Math"/>
+                  </w:rPr>
+                  <m:t>≥</m:t>
+                </m:r>
+                <m:d>
+                  <m:dPr>
+                    <m:ctrlPr>
+                      <w:rPr>
+                        <w:rFonts w:ascii="Cambria Math" w:hAnsi="Cambria Math"/>
+                        <w:i/>
+                      </w:rPr>
+                    </m:ctrlPr>
+                  </m:dPr>
+                  <m:e>
+                    <m:f>
+                      <m:fPr>
+                        <m:ctrlPr>
+                          <w:rPr>
+                            <w:rFonts w:ascii="Cambria Math" w:hAnsi="Cambria Math"/>
+                            <w:i/>
+                          </w:rPr>
+                        </m:ctrlPr>
+                      </m:fPr>
+                      <m:num>
+                        <m:sSub>
+                          <m:sSubPr>
+                            <m:ctrlPr>
+                              <w:rPr>
+                                <w:rFonts w:ascii="Cambria Math" w:hAnsi="Cambria Math"/>
+                                <w:i/>
+                              </w:rPr>
+                            </m:ctrlPr>
+                          </m:sSubPr>
+                          <m:e>
+                            <m:r>
+                              <w:rPr>
+                                <w:rFonts w:ascii="Cambria Math" w:hAnsi="Cambria Math"/>
+                              </w:rPr>
+                              <m:t>V</m:t>
+                            </m:r>
+                          </m:e>
+                          <m:sub>
+                            <m:r>
+                              <w:rPr>
+                                <w:rFonts w:ascii="Cambria Math" w:hAnsi="Cambria Math"/>
+                              </w:rPr>
+                              <m:t>u</m:t>
+                            </m:r>
+                          </m:sub>
+                        </m:sSub>
+                      </m:num>
+                      <m:den>
+                        <m:sSub>
+                          <m:sSubPr>
+                            <m:ctrlPr>
+                              <w:rPr>
+                                <w:rFonts w:ascii="Cambria Math" w:hAnsi="Cambria Math"/>
+                                <w:i/>
+                              </w:rPr>
+                            </m:ctrlPr>
+                          </m:sSubPr>
+                          <m:e>
+                            <m:r>
+                              <w:rPr>
+                                <w:rFonts w:ascii="Cambria Math" w:hAnsi="Cambria Math"/>
+                              </w:rPr>
+                              <m:t>φ</m:t>
+                            </m:r>
+                          </m:e>
+                          <m:sub>
+                            <m:r>
+                              <w:rPr>
+                                <w:rFonts w:ascii="Cambria Math" w:hAnsi="Cambria Math"/>
+                              </w:rPr>
+                              <m:t>v</m:t>
+                            </m:r>
+                          </m:sub>
+                        </m:sSub>
+                      </m:den>
+                    </m:f>
+                    <m:r>
+                      <w:rPr>
+                        <w:rFonts w:ascii="Cambria Math" w:hAnsi="Cambria Math"/>
+                      </w:rPr>
+                      <m:t>-</m:t>
+                    </m:r>
+                    <m:sSub>
+                      <m:sSubPr>
+                        <m:ctrlPr>
+                          <w:rPr>
+                            <w:rFonts w:ascii="Cambria Math" w:hAnsi="Cambria Math"/>
+                            <w:i/>
+                          </w:rPr>
+                        </m:ctrlPr>
+                      </m:sSubPr>
+                      <m:e>
+                        <m:r>
+                          <w:rPr>
+                            <w:rFonts w:ascii="Cambria Math" w:hAnsi="Cambria Math"/>
+                          </w:rPr>
+                          <m:t>V</m:t>
+                        </m:r>
+                      </m:e>
+                      <m:sub>
+                        <m:r>
+                          <w:rPr>
+                            <w:rFonts w:ascii="Cambria Math" w:hAnsi="Cambria Math"/>
+                          </w:rPr>
+                          <m:t>p</m:t>
+                        </m:r>
+                      </m:sub>
+                    </m:sSub>
+                    <m:r>
+                      <w:rPr>
+                        <w:rFonts w:ascii="Cambria Math" w:hAnsi="Cambria Math"/>
+                      </w:rPr>
+                      <m:t>-0.5</m:t>
+                    </m:r>
+                    <m:sSub>
+                      <m:sSubPr>
+                        <m:ctrlPr>
+                          <w:rPr>
+                            <w:rFonts w:ascii="Cambria Math" w:hAnsi="Cambria Math"/>
+                            <w:i/>
+                          </w:rPr>
+                        </m:ctrlPr>
+                      </m:sSubPr>
+                      <m:e>
+                        <m:r>
+                          <w:rPr>
+                            <w:rFonts w:ascii="Cambria Math" w:hAnsi="Cambria Math"/>
+                          </w:rPr>
+                          <m:t>V</m:t>
+                        </m:r>
+                      </m:e>
+                      <m:sub>
+                        <m:r>
+                          <w:rPr>
+                            <w:rFonts w:ascii="Cambria Math" w:hAnsi="Cambria Math"/>
+                          </w:rPr>
+                          <m:t>s</m:t>
+                        </m:r>
+                      </m:sub>
+                    </m:sSub>
+                  </m:e>
+                </m:d>
+                <m:func>
+                  <m:funcPr>
+                    <m:ctrlPr>
+                      <w:rPr>
+                        <w:rFonts w:ascii="Cambria Math" w:hAnsi="Cambria Math"/>
+                        <w:i/>
+                      </w:rPr>
+                    </m:ctrlPr>
+                  </m:funcPr>
+                  <m:fName>
+                    <m:r>
+                      <m:rPr>
+                        <m:sty m:val="p"/>
+                      </m:rPr>
+                      <w:rPr>
+                        <w:rFonts w:ascii="Cambria Math" w:hAnsi="Cambria Math"/>
+                      </w:rPr>
+                      <m:t>cot</m:t>
+                    </m:r>
+                  </m:fName>
+                  <m:e>
+                    <m:r>
+                      <w:rPr>
+                        <w:rFonts w:ascii="Cambria Math" w:hAnsi="Cambria Math"/>
+                      </w:rPr>
+                      <m:t>θ</m:t>
+                    </m:r>
+                  </m:e>
+                </m:func>
+              </m:e>
+              <m:e>
+                <m:r>
+                  <w:rPr>
+                    <w:rFonts w:ascii="Cambria Math" w:hAnsi="Cambria Math"/>
+                  </w:rPr>
+                  <m:t>5.</m:t>
+                </m:r>
+                <m:r>
+                  <w:rPr>
+                    <w:rFonts w:ascii="Cambria Math" w:hAnsi="Cambria Math"/>
+                  </w:rPr>
+                  <m:t>7</m:t>
+                </m:r>
+                <m:r>
+                  <w:rPr>
+                    <w:rFonts w:ascii="Cambria Math" w:hAnsi="Cambria Math"/>
+                  </w:rPr>
+                  <m:t>.3.5-2</m:t>
                 </m:r>
               </m:e>
             </m:mr>
@@ -3610,6 +6112,32 @@
               </m:ctrlPr>
             </m:sSubPr>
             <m:e>
+              <m:sSub>
+                <m:sSubPr>
+                  <m:ctrlPr>
+                    <w:rPr>
+                      <w:rFonts w:ascii="Cambria Math" w:hAnsi="Cambria Math"/>
+                      <w:i/>
+                    </w:rPr>
+                  </m:ctrlPr>
+                </m:sSubPr>
+                <m:e>
+                  <m:r>
+                    <w:rPr>
+                      <w:rFonts w:ascii="Cambria Math" w:hAnsi="Cambria Math"/>
+                    </w:rPr>
+                    <m:t>K</m:t>
+                  </m:r>
+                </m:e>
+                <m:sub>
+                  <m:r>
+                    <w:rPr>
+                      <w:rFonts w:ascii="Cambria Math" w:hAnsi="Cambria Math"/>
+                    </w:rPr>
+                    <m:t>ds</m:t>
+                  </m:r>
+                </m:sub>
+              </m:sSub>
               <m:r>
                 <w:rPr>
                   <w:rFonts w:ascii="Cambria Math" w:hAnsi="Cambria Math"/>
@@ -3668,6 +6196,32 @@
               </m:ctrlPr>
             </m:sSubPr>
             <m:e>
+              <m:sSub>
+                <m:sSubPr>
+                  <m:ctrlPr>
+                    <w:rPr>
+                      <w:rFonts w:ascii="Cambria Math" w:hAnsi="Cambria Math"/>
+                      <w:i/>
+                    </w:rPr>
+                  </m:ctrlPr>
+                </m:sSubPr>
+                <m:e>
+                  <m:r>
+                    <w:rPr>
+                      <w:rFonts w:ascii="Cambria Math" w:hAnsi="Cambria Math"/>
+                    </w:rPr>
+                    <m:t>K</m:t>
+                  </m:r>
+                </m:e>
+                <m:sub>
+                  <m:r>
+                    <w:rPr>
+                      <w:rFonts w:ascii="Cambria Math" w:hAnsi="Cambria Math"/>
+                    </w:rPr>
+                    <m:t>db</m:t>
+                  </m:r>
+                </m:sub>
+              </m:sSub>
               <m:r>
                 <w:rPr>
                   <w:rFonts w:ascii="Cambria Math" w:hAnsi="Cambria Math"/>
@@ -3724,7 +6278,7 @@
 </file>
 
 <file path=word/styles.xml><?xml version="1.0" encoding="utf-8"?>
-<w:styles xmlns:mc="http://schemas.openxmlformats.org/markup-compatibility/2006" xmlns:r="http://schemas.openxmlformats.org/officeDocument/2006/relationships" xmlns:w="http://schemas.openxmlformats.org/wordprocessingml/2006/main" xmlns:w14="http://schemas.microsoft.com/office/word/2010/wordml" xmlns:w15="http://schemas.microsoft.com/office/word/2012/wordml" xmlns:w16cex="http://schemas.microsoft.com/office/word/2018/wordml/cex" xmlns:w16cid="http://schemas.microsoft.com/office/word/2016/wordml/cid" xmlns:w16="http://schemas.microsoft.com/office/word/2018/wordml" xmlns:w16se="http://schemas.microsoft.com/office/word/2015/wordml/symex" mc:Ignorable="w14 w15 w16se w16cid w16 w16cex">
+<w:styles xmlns:mc="http://schemas.openxmlformats.org/markup-compatibility/2006" xmlns:r="http://schemas.openxmlformats.org/officeDocument/2006/relationships" xmlns:w="http://schemas.openxmlformats.org/wordprocessingml/2006/main" xmlns:w14="http://schemas.microsoft.com/office/word/2010/wordml" xmlns:w15="http://schemas.microsoft.com/office/word/2012/wordml" xmlns:w16cex="http://schemas.microsoft.com/office/word/2018/wordml/cex" xmlns:w16cid="http://schemas.microsoft.com/office/word/2016/wordml/cid" xmlns:w16="http://schemas.microsoft.com/office/word/2018/wordml" xmlns:w16du="http://schemas.microsoft.com/office/word/2023/wordml/word16du" xmlns:w16sdtdh="http://schemas.microsoft.com/office/word/2020/wordml/sdtdatahash" xmlns:w16sdtfl="http://schemas.microsoft.com/office/word/2024/wordml/sdtformatlock" xmlns:w16se="http://schemas.microsoft.com/office/word/2015/wordml/symex" mc:Ignorable="w14 w15 w16se w16cid w16 w16cex w16sdtdh w16sdtfl w16du">
   <w:docDefaults>
     <w:rPrDefault>
       <w:rPr>
@@ -3895,7 +6449,7 @@
     <w:lsdException w:name="Table Web 2" w:semiHidden="1" w:unhideWhenUsed="1"/>
     <w:lsdException w:name="Table Web 3" w:semiHidden="1" w:unhideWhenUsed="1"/>
     <w:lsdException w:name="Balloon Text" w:semiHidden="1" w:unhideWhenUsed="1"/>
-    <w:lsdException w:name="Table Grid" w:semiHidden="1" w:uiPriority="59" w:unhideWhenUsed="1"/>
+    <w:lsdException w:name="Table Grid" w:uiPriority="59"/>
     <w:lsdException w:name="Table Theme" w:semiHidden="1" w:unhideWhenUsed="1"/>
     <w:lsdException w:name="Placeholder Text" w:semiHidden="1"/>
     <w:lsdException w:name="No Spacing" w:uiPriority="1" w:qFormat="1"/>

</xml_diff>

<commit_message>
adds Kdb and Kds factors to AASHTO 5.7.3.5-1&2 (#34)
* adds Kdb and Kds factors to AASHTO 5.7.3.5-1&2

* Changes effective prestress table to use Kdt

---------

Co-authored-by: Richard Brice <37087370+RickBrice@users.noreply.github.com>
</commit_message>
<xml_diff>
--- a/Equations/LongitudinalReinforcementForShear.docx
+++ b/Equations/LongitudinalReinforcementForShear.docx
@@ -1,6 +1,6 @@
 
 <file path=word/document.xml><?xml version="1.0" encoding="utf-8"?>
-<w:document xmlns:wpc="http://schemas.microsoft.com/office/word/2010/wordprocessingCanvas" xmlns:cx="http://schemas.microsoft.com/office/drawing/2014/chartex" xmlns:cx1="http://schemas.microsoft.com/office/drawing/2015/9/8/chartex" xmlns:cx2="http://schemas.microsoft.com/office/drawing/2015/10/21/chartex" xmlns:cx3="http://schemas.microsoft.com/office/drawing/2016/5/9/chartex" xmlns:cx4="http://schemas.microsoft.com/office/drawing/2016/5/10/chartex" xmlns:cx5="http://schemas.microsoft.com/office/drawing/2016/5/11/chartex" xmlns:cx6="http://schemas.microsoft.com/office/drawing/2016/5/12/chartex" xmlns:cx7="http://schemas.microsoft.com/office/drawing/2016/5/13/chartex" xmlns:cx8="http://schemas.microsoft.com/office/drawing/2016/5/14/chartex" xmlns:mc="http://schemas.openxmlformats.org/markup-compatibility/2006" xmlns:aink="http://schemas.microsoft.com/office/drawing/2016/ink" xmlns:am3d="http://schemas.microsoft.com/office/drawing/2017/model3d" xmlns:o="urn:schemas-microsoft-com:office:office" xmlns:r="http://schemas.openxmlformats.org/officeDocument/2006/relationships" xmlns:m="http://schemas.openxmlformats.org/officeDocument/2006/math" xmlns:v="urn:schemas-microsoft-com:vml" xmlns:wp14="http://schemas.microsoft.com/office/word/2010/wordprocessingDrawing" xmlns:wp="http://schemas.openxmlformats.org/drawingml/2006/wordprocessingDrawing" xmlns:w10="urn:schemas-microsoft-com:office:word" xmlns:w="http://schemas.openxmlformats.org/wordprocessingml/2006/main" xmlns:w14="http://schemas.microsoft.com/office/word/2010/wordml" xmlns:w15="http://schemas.microsoft.com/office/word/2012/wordml" xmlns:w16cex="http://schemas.microsoft.com/office/word/2018/wordml/cex" xmlns:w16cid="http://schemas.microsoft.com/office/word/2016/wordml/cid" xmlns:w16="http://schemas.microsoft.com/office/word/2018/wordml" xmlns:w16se="http://schemas.microsoft.com/office/word/2015/wordml/symex" xmlns:wpg="http://schemas.microsoft.com/office/word/2010/wordprocessingGroup" xmlns:wpi="http://schemas.microsoft.com/office/word/2010/wordprocessingInk" xmlns:wne="http://schemas.microsoft.com/office/word/2006/wordml" xmlns:wps="http://schemas.microsoft.com/office/word/2010/wordprocessingShape" mc:Ignorable="w14 w15 w16se w16cid w16 w16cex wp14">
+<w:document xmlns:wpc="http://schemas.microsoft.com/office/word/2010/wordprocessingCanvas" xmlns:cx="http://schemas.microsoft.com/office/drawing/2014/chartex" xmlns:cx1="http://schemas.microsoft.com/office/drawing/2015/9/8/chartex" xmlns:cx2="http://schemas.microsoft.com/office/drawing/2015/10/21/chartex" xmlns:cx3="http://schemas.microsoft.com/office/drawing/2016/5/9/chartex" xmlns:cx4="http://schemas.microsoft.com/office/drawing/2016/5/10/chartex" xmlns:cx5="http://schemas.microsoft.com/office/drawing/2016/5/11/chartex" xmlns:cx6="http://schemas.microsoft.com/office/drawing/2016/5/12/chartex" xmlns:cx7="http://schemas.microsoft.com/office/drawing/2016/5/13/chartex" xmlns:cx8="http://schemas.microsoft.com/office/drawing/2016/5/14/chartex" xmlns:mc="http://schemas.openxmlformats.org/markup-compatibility/2006" xmlns:aink="http://schemas.microsoft.com/office/drawing/2016/ink" xmlns:am3d="http://schemas.microsoft.com/office/drawing/2017/model3d" xmlns:o="urn:schemas-microsoft-com:office:office" xmlns:oel="http://schemas.microsoft.com/office/2019/extlst" xmlns:r="http://schemas.openxmlformats.org/officeDocument/2006/relationships" xmlns:m="http://schemas.openxmlformats.org/officeDocument/2006/math" xmlns:v="urn:schemas-microsoft-com:vml" xmlns:wp14="http://schemas.microsoft.com/office/word/2010/wordprocessingDrawing" xmlns:wp="http://schemas.openxmlformats.org/drawingml/2006/wordprocessingDrawing" xmlns:w10="urn:schemas-microsoft-com:office:word" xmlns:w="http://schemas.openxmlformats.org/wordprocessingml/2006/main" xmlns:w14="http://schemas.microsoft.com/office/word/2010/wordml" xmlns:w15="http://schemas.microsoft.com/office/word/2012/wordml" xmlns:w16cex="http://schemas.microsoft.com/office/word/2018/wordml/cex" xmlns:w16cid="http://schemas.microsoft.com/office/word/2016/wordml/cid" xmlns:w16="http://schemas.microsoft.com/office/word/2018/wordml" xmlns:w16du="http://schemas.microsoft.com/office/word/2023/wordml/word16du" xmlns:w16sdtdh="http://schemas.microsoft.com/office/word/2020/wordml/sdtdatahash" xmlns:w16sdtfl="http://schemas.microsoft.com/office/word/2024/wordml/sdtformatlock" xmlns:w16se="http://schemas.microsoft.com/office/word/2015/wordml/symex" xmlns:wpg="http://schemas.microsoft.com/office/word/2010/wordprocessingGroup" xmlns:wpi="http://schemas.microsoft.com/office/word/2010/wordprocessingInk" xmlns:wne="http://schemas.microsoft.com/office/word/2006/wordml" xmlns:wps="http://schemas.microsoft.com/office/word/2010/wordprocessingShape" mc:Ignorable="w14 w15 w16se w16cid w16 w16cex w16sdtdh w16sdtfl w16du wp14">
   <w:body>
     <w:p>
       <w:pPr>
@@ -58,6 +58,34 @@
                     </m:ctrlPr>
                   </m:sSubPr>
                   <m:e>
+                    <w:bookmarkStart w:id="0" w:name="_Hlk212127231"/>
+                    <m:sSub>
+                      <m:sSubPr>
+                        <m:ctrlPr>
+                          <w:rPr>
+                            <w:rFonts w:ascii="Cambria Math" w:hAnsi="Cambria Math"/>
+                            <w:i/>
+                          </w:rPr>
+                        </m:ctrlPr>
+                      </m:sSubPr>
+                      <m:e>
+                        <m:r>
+                          <w:rPr>
+                            <w:rFonts w:ascii="Cambria Math" w:hAnsi="Cambria Math"/>
+                          </w:rPr>
+                          <m:t>K</m:t>
+                        </m:r>
+                      </m:e>
+                      <m:sub>
+                        <m:r>
+                          <w:rPr>
+                            <w:rFonts w:ascii="Cambria Math" w:hAnsi="Cambria Math"/>
+                          </w:rPr>
+                          <m:t>db</m:t>
+                        </m:r>
+                      </m:sub>
+                    </m:sSub>
+                    <w:bookmarkEnd w:id="0"/>
                     <m:r>
                       <w:rPr>
                         <w:rFonts w:ascii="Cambria Math" w:hAnsi="Cambria Math"/>
@@ -116,6 +144,32 @@
                     </m:ctrlPr>
                   </m:sSubPr>
                   <m:e>
+                    <m:sSub>
+                      <m:sSubPr>
+                        <m:ctrlPr>
+                          <w:rPr>
+                            <w:rFonts w:ascii="Cambria Math" w:hAnsi="Cambria Math"/>
+                            <w:i/>
+                          </w:rPr>
+                        </m:ctrlPr>
+                      </m:sSubPr>
+                      <m:e>
+                        <m:r>
+                          <w:rPr>
+                            <w:rFonts w:ascii="Cambria Math" w:hAnsi="Cambria Math"/>
+                          </w:rPr>
+                          <m:t>K</m:t>
+                        </m:r>
+                      </m:e>
+                      <m:sub>
+                        <m:r>
+                          <w:rPr>
+                            <w:rFonts w:ascii="Cambria Math" w:hAnsi="Cambria Math"/>
+                          </w:rPr>
+                          <m:t>ds</m:t>
+                        </m:r>
+                      </m:sub>
+                    </m:sSub>
                     <m:r>
                       <w:rPr>
                         <w:rFonts w:ascii="Cambria Math" w:hAnsi="Cambria Math"/>
@@ -555,6 +609,32 @@
                     </m:ctrlPr>
                   </m:sSubPr>
                   <m:e>
+                    <m:sSub>
+                      <m:sSubPr>
+                        <m:ctrlPr>
+                          <w:rPr>
+                            <w:rFonts w:ascii="Cambria Math" w:hAnsi="Cambria Math"/>
+                            <w:i/>
+                          </w:rPr>
+                        </m:ctrlPr>
+                      </m:sSubPr>
+                      <m:e>
+                        <m:r>
+                          <w:rPr>
+                            <w:rFonts w:ascii="Cambria Math" w:hAnsi="Cambria Math"/>
+                          </w:rPr>
+                          <m:t>K</m:t>
+                        </m:r>
+                      </m:e>
+                      <m:sub>
+                        <m:r>
+                          <w:rPr>
+                            <w:rFonts w:ascii="Cambria Math" w:hAnsi="Cambria Math"/>
+                          </w:rPr>
+                          <m:t>db</m:t>
+                        </m:r>
+                      </m:sub>
+                    </m:sSub>
                     <m:r>
                       <w:rPr>
                         <w:rFonts w:ascii="Cambria Math" w:hAnsi="Cambria Math"/>
@@ -613,6 +693,32 @@
                     </m:ctrlPr>
                   </m:sSubPr>
                   <m:e>
+                    <m:sSub>
+                      <m:sSubPr>
+                        <m:ctrlPr>
+                          <w:rPr>
+                            <w:rFonts w:ascii="Cambria Math" w:hAnsi="Cambria Math"/>
+                            <w:i/>
+                          </w:rPr>
+                        </m:ctrlPr>
+                      </m:sSubPr>
+                      <m:e>
+                        <m:r>
+                          <w:rPr>
+                            <w:rFonts w:ascii="Cambria Math" w:hAnsi="Cambria Math"/>
+                          </w:rPr>
+                          <m:t>K</m:t>
+                        </m:r>
+                      </m:e>
+                      <m:sub>
+                        <m:r>
+                          <w:rPr>
+                            <w:rFonts w:ascii="Cambria Math" w:hAnsi="Cambria Math"/>
+                          </w:rPr>
+                          <m:t>ds</m:t>
+                        </m:r>
+                      </m:sub>
+                    </m:sSub>
                     <m:r>
                       <w:rPr>
                         <w:rFonts w:ascii="Cambria Math" w:hAnsi="Cambria Math"/>
@@ -902,6 +1008,32 @@
                     </m:ctrlPr>
                   </m:sSubPr>
                   <m:e>
+                    <m:sSub>
+                      <m:sSubPr>
+                        <m:ctrlPr>
+                          <w:rPr>
+                            <w:rFonts w:ascii="Cambria Math" w:hAnsi="Cambria Math"/>
+                            <w:i/>
+                          </w:rPr>
+                        </m:ctrlPr>
+                      </m:sSubPr>
+                      <m:e>
+                        <m:r>
+                          <w:rPr>
+                            <w:rFonts w:ascii="Cambria Math" w:hAnsi="Cambria Math"/>
+                          </w:rPr>
+                          <m:t>K</m:t>
+                        </m:r>
+                      </m:e>
+                      <m:sub>
+                        <m:r>
+                          <w:rPr>
+                            <w:rFonts w:ascii="Cambria Math" w:hAnsi="Cambria Math"/>
+                          </w:rPr>
+                          <m:t>db</m:t>
+                        </m:r>
+                      </m:sub>
+                    </m:sSub>
                     <m:r>
                       <w:rPr>
                         <w:rFonts w:ascii="Cambria Math" w:hAnsi="Cambria Math"/>
@@ -960,6 +1092,32 @@
                     </m:ctrlPr>
                   </m:sSubPr>
                   <m:e>
+                    <m:sSub>
+                      <m:sSubPr>
+                        <m:ctrlPr>
+                          <w:rPr>
+                            <w:rFonts w:ascii="Cambria Math" w:hAnsi="Cambria Math"/>
+                            <w:i/>
+                          </w:rPr>
+                        </m:ctrlPr>
+                      </m:sSubPr>
+                      <m:e>
+                        <m:r>
+                          <w:rPr>
+                            <w:rFonts w:ascii="Cambria Math" w:hAnsi="Cambria Math"/>
+                          </w:rPr>
+                          <m:t>K</m:t>
+                        </m:r>
+                      </m:e>
+                      <m:sub>
+                        <m:r>
+                          <w:rPr>
+                            <w:rFonts w:ascii="Cambria Math" w:hAnsi="Cambria Math"/>
+                          </w:rPr>
+                          <m:t>ds</m:t>
+                        </m:r>
+                      </m:sub>
+                    </m:sSub>
                     <m:r>
                       <w:rPr>
                         <w:rFonts w:ascii="Cambria Math" w:hAnsi="Cambria Math"/>
@@ -1385,6 +1543,32 @@
                     </m:ctrlPr>
                   </m:sSubPr>
                   <m:e>
+                    <m:sSub>
+                      <m:sSubPr>
+                        <m:ctrlPr>
+                          <w:rPr>
+                            <w:rFonts w:ascii="Cambria Math" w:hAnsi="Cambria Math"/>
+                            <w:i/>
+                          </w:rPr>
+                        </m:ctrlPr>
+                      </m:sSubPr>
+                      <m:e>
+                        <m:r>
+                          <w:rPr>
+                            <w:rFonts w:ascii="Cambria Math" w:hAnsi="Cambria Math"/>
+                          </w:rPr>
+                          <m:t>K</m:t>
+                        </m:r>
+                      </m:e>
+                      <m:sub>
+                        <m:r>
+                          <w:rPr>
+                            <w:rFonts w:ascii="Cambria Math" w:hAnsi="Cambria Math"/>
+                          </w:rPr>
+                          <m:t>db</m:t>
+                        </m:r>
+                      </m:sub>
+                    </m:sSub>
                     <m:r>
                       <w:rPr>
                         <w:rFonts w:ascii="Cambria Math" w:hAnsi="Cambria Math"/>
@@ -1443,6 +1627,32 @@
                     </m:ctrlPr>
                   </m:sSubPr>
                   <m:e>
+                    <m:sSub>
+                      <m:sSubPr>
+                        <m:ctrlPr>
+                          <w:rPr>
+                            <w:rFonts w:ascii="Cambria Math" w:hAnsi="Cambria Math"/>
+                            <w:i/>
+                          </w:rPr>
+                        </m:ctrlPr>
+                      </m:sSubPr>
+                      <m:e>
+                        <m:r>
+                          <w:rPr>
+                            <w:rFonts w:ascii="Cambria Math" w:hAnsi="Cambria Math"/>
+                          </w:rPr>
+                          <m:t>K</m:t>
+                        </m:r>
+                      </m:e>
+                      <m:sub>
+                        <m:r>
+                          <w:rPr>
+                            <w:rFonts w:ascii="Cambria Math" w:hAnsi="Cambria Math"/>
+                          </w:rPr>
+                          <m:t>ds</m:t>
+                        </m:r>
+                      </m:sub>
+                    </m:sSub>
                     <m:r>
                       <w:rPr>
                         <w:rFonts w:ascii="Cambria Math" w:hAnsi="Cambria Math"/>
@@ -1732,6 +1942,32 @@
                     </m:ctrlPr>
                   </m:sSubPr>
                   <m:e>
+                    <m:sSub>
+                      <m:sSubPr>
+                        <m:ctrlPr>
+                          <w:rPr>
+                            <w:rFonts w:ascii="Cambria Math" w:hAnsi="Cambria Math"/>
+                            <w:i/>
+                          </w:rPr>
+                        </m:ctrlPr>
+                      </m:sSubPr>
+                      <m:e>
+                        <m:r>
+                          <w:rPr>
+                            <w:rFonts w:ascii="Cambria Math" w:hAnsi="Cambria Math"/>
+                          </w:rPr>
+                          <m:t>K</m:t>
+                        </m:r>
+                      </m:e>
+                      <m:sub>
+                        <m:r>
+                          <w:rPr>
+                            <w:rFonts w:ascii="Cambria Math" w:hAnsi="Cambria Math"/>
+                          </w:rPr>
+                          <m:t>db</m:t>
+                        </m:r>
+                      </m:sub>
+                    </m:sSub>
                     <m:r>
                       <w:rPr>
                         <w:rFonts w:ascii="Cambria Math" w:hAnsi="Cambria Math"/>
@@ -1790,6 +2026,32 @@
                     </m:ctrlPr>
                   </m:sSubPr>
                   <m:e>
+                    <m:sSub>
+                      <m:sSubPr>
+                        <m:ctrlPr>
+                          <w:rPr>
+                            <w:rFonts w:ascii="Cambria Math" w:hAnsi="Cambria Math"/>
+                            <w:i/>
+                          </w:rPr>
+                        </m:ctrlPr>
+                      </m:sSubPr>
+                      <m:e>
+                        <m:r>
+                          <w:rPr>
+                            <w:rFonts w:ascii="Cambria Math" w:hAnsi="Cambria Math"/>
+                          </w:rPr>
+                          <m:t>K</m:t>
+                        </m:r>
+                      </m:e>
+                      <m:sub>
+                        <m:r>
+                          <w:rPr>
+                            <w:rFonts w:ascii="Cambria Math" w:hAnsi="Cambria Math"/>
+                          </w:rPr>
+                          <m:t>ds</m:t>
+                        </m:r>
+                      </m:sub>
+                    </m:sSub>
                     <m:r>
                       <w:rPr>
                         <w:rFonts w:ascii="Cambria Math" w:hAnsi="Cambria Math"/>
@@ -2287,6 +2549,32 @@
                     </m:ctrlPr>
                   </m:sSubPr>
                   <m:e>
+                    <m:sSub>
+                      <m:sSubPr>
+                        <m:ctrlPr>
+                          <w:rPr>
+                            <w:rFonts w:ascii="Cambria Math" w:hAnsi="Cambria Math"/>
+                            <w:i/>
+                          </w:rPr>
+                        </m:ctrlPr>
+                      </m:sSubPr>
+                      <m:e>
+                        <m:r>
+                          <w:rPr>
+                            <w:rFonts w:ascii="Cambria Math" w:hAnsi="Cambria Math"/>
+                          </w:rPr>
+                          <m:t>K</m:t>
+                        </m:r>
+                      </m:e>
+                      <m:sub>
+                        <m:r>
+                          <w:rPr>
+                            <w:rFonts w:ascii="Cambria Math" w:hAnsi="Cambria Math"/>
+                          </w:rPr>
+                          <m:t>db</m:t>
+                        </m:r>
+                      </m:sub>
+                    </m:sSub>
                     <m:r>
                       <w:rPr>
                         <w:rFonts w:ascii="Cambria Math" w:hAnsi="Cambria Math"/>
@@ -2345,6 +2633,32 @@
                     </m:ctrlPr>
                   </m:sSubPr>
                   <m:e>
+                    <m:sSub>
+                      <m:sSubPr>
+                        <m:ctrlPr>
+                          <w:rPr>
+                            <w:rFonts w:ascii="Cambria Math" w:hAnsi="Cambria Math"/>
+                            <w:i/>
+                          </w:rPr>
+                        </m:ctrlPr>
+                      </m:sSubPr>
+                      <m:e>
+                        <m:r>
+                          <w:rPr>
+                            <w:rFonts w:ascii="Cambria Math" w:hAnsi="Cambria Math"/>
+                          </w:rPr>
+                          <m:t>K</m:t>
+                        </m:r>
+                      </m:e>
+                      <m:sub>
+                        <m:r>
+                          <w:rPr>
+                            <w:rFonts w:ascii="Cambria Math" w:hAnsi="Cambria Math"/>
+                          </w:rPr>
+                          <m:t>ds</m:t>
+                        </m:r>
+                      </m:sub>
+                    </m:sSub>
                     <m:r>
                       <w:rPr>
                         <w:rFonts w:ascii="Cambria Math" w:hAnsi="Cambria Math"/>
@@ -2692,6 +3006,32 @@
                     </m:ctrlPr>
                   </m:sSubPr>
                   <m:e>
+                    <m:sSub>
+                      <m:sSubPr>
+                        <m:ctrlPr>
+                          <w:rPr>
+                            <w:rFonts w:ascii="Cambria Math" w:hAnsi="Cambria Math"/>
+                            <w:i/>
+                          </w:rPr>
+                        </m:ctrlPr>
+                      </m:sSubPr>
+                      <m:e>
+                        <m:r>
+                          <w:rPr>
+                            <w:rFonts w:ascii="Cambria Math" w:hAnsi="Cambria Math"/>
+                          </w:rPr>
+                          <m:t>K</m:t>
+                        </m:r>
+                      </m:e>
+                      <m:sub>
+                        <m:r>
+                          <w:rPr>
+                            <w:rFonts w:ascii="Cambria Math" w:hAnsi="Cambria Math"/>
+                          </w:rPr>
+                          <m:t>db</m:t>
+                        </m:r>
+                      </m:sub>
+                    </m:sSub>
                     <m:r>
                       <w:rPr>
                         <w:rFonts w:ascii="Cambria Math" w:hAnsi="Cambria Math"/>
@@ -2750,6 +3090,32 @@
                     </m:ctrlPr>
                   </m:sSubPr>
                   <m:e>
+                    <m:sSub>
+                      <m:sSubPr>
+                        <m:ctrlPr>
+                          <w:rPr>
+                            <w:rFonts w:ascii="Cambria Math" w:hAnsi="Cambria Math"/>
+                            <w:i/>
+                          </w:rPr>
+                        </m:ctrlPr>
+                      </m:sSubPr>
+                      <m:e>
+                        <m:r>
+                          <w:rPr>
+                            <w:rFonts w:ascii="Cambria Math" w:hAnsi="Cambria Math"/>
+                          </w:rPr>
+                          <m:t>K</m:t>
+                        </m:r>
+                      </m:e>
+                      <m:sub>
+                        <m:r>
+                          <w:rPr>
+                            <w:rFonts w:ascii="Cambria Math" w:hAnsi="Cambria Math"/>
+                          </w:rPr>
+                          <m:t>ds</m:t>
+                        </m:r>
+                      </m:sub>
+                    </m:sSub>
                     <m:r>
                       <w:rPr>
                         <w:rFonts w:ascii="Cambria Math" w:hAnsi="Cambria Math"/>
@@ -3233,6 +3599,32 @@
                     </m:ctrlPr>
                   </m:sSubPr>
                   <m:e>
+                    <m:sSub>
+                      <m:sSubPr>
+                        <m:ctrlPr>
+                          <w:rPr>
+                            <w:rFonts w:ascii="Cambria Math" w:hAnsi="Cambria Math"/>
+                            <w:i/>
+                          </w:rPr>
+                        </m:ctrlPr>
+                      </m:sSubPr>
+                      <m:e>
+                        <m:r>
+                          <w:rPr>
+                            <w:rFonts w:ascii="Cambria Math" w:hAnsi="Cambria Math"/>
+                          </w:rPr>
+                          <m:t>K</m:t>
+                        </m:r>
+                      </m:e>
+                      <m:sub>
+                        <m:r>
+                          <w:rPr>
+                            <w:rFonts w:ascii="Cambria Math" w:hAnsi="Cambria Math"/>
+                          </w:rPr>
+                          <m:t>db</m:t>
+                        </m:r>
+                      </m:sub>
+                    </m:sSub>
                     <m:r>
                       <w:rPr>
                         <w:rFonts w:ascii="Cambria Math" w:hAnsi="Cambria Math"/>
@@ -3291,6 +3683,32 @@
                     </m:ctrlPr>
                   </m:sSubPr>
                   <m:e>
+                    <m:sSub>
+                      <m:sSubPr>
+                        <m:ctrlPr>
+                          <w:rPr>
+                            <w:rFonts w:ascii="Cambria Math" w:hAnsi="Cambria Math"/>
+                            <w:i/>
+                          </w:rPr>
+                        </m:ctrlPr>
+                      </m:sSubPr>
+                      <m:e>
+                        <m:r>
+                          <w:rPr>
+                            <w:rFonts w:ascii="Cambria Math" w:hAnsi="Cambria Math"/>
+                          </w:rPr>
+                          <m:t>K</m:t>
+                        </m:r>
+                      </m:e>
+                      <m:sub>
+                        <m:r>
+                          <w:rPr>
+                            <w:rFonts w:ascii="Cambria Math" w:hAnsi="Cambria Math"/>
+                          </w:rPr>
+                          <m:t>ds</m:t>
+                        </m:r>
+                      </m:sub>
+                    </m:sSub>
                     <m:r>
                       <w:rPr>
                         <w:rFonts w:ascii="Cambria Math" w:hAnsi="Cambria Math"/>
@@ -3575,6 +3993,2090 @@
                     <w:rFonts w:ascii="Cambria Math" w:hAnsi="Cambria Math"/>
                   </w:rPr>
                   <m:t>5.8.3.5-2</m:t>
+                </m:r>
+              </m:e>
+            </m:mr>
+          </m:m>
+        </m:oMath>
+      </m:oMathPara>
+    </w:p>
+    <w:p>
+      <w:pPr>
+        <w:rPr>
+          <w:rFonts w:eastAsiaTheme="minorEastAsia"/>
+        </w:rPr>
+      </w:pPr>
+      <w:r>
+        <w:rPr>
+          <w:rFonts w:eastAsiaTheme="minorEastAsia"/>
+        </w:rPr>
+        <w:t>LRFD 20</w:t>
+      </w:r>
+      <w:r>
+        <w:rPr>
+          <w:rFonts w:eastAsiaTheme="minorEastAsia"/>
+        </w:rPr>
+        <w:t>17</w:t>
+      </w:r>
+      <w:r>
+        <w:rPr>
+          <w:rFonts w:eastAsiaTheme="minorEastAsia"/>
+        </w:rPr>
+        <w:t xml:space="preserve"> and later</w:t>
+      </w:r>
+    </w:p>
+    <w:p>
+      <w:pPr>
+        <w:rPr>
+          <w:rFonts w:eastAsiaTheme="minorEastAsia"/>
+        </w:rPr>
+      </w:pPr>
+      <m:oMathPara>
+        <m:oMath>
+          <m:m>
+            <m:mPr>
+              <m:mcs>
+                <m:mc>
+                  <m:mcPr>
+                    <m:count m:val="1"/>
+                    <m:mcJc m:val="left"/>
+                  </m:mcPr>
+                </m:mc>
+                <m:mc>
+                  <m:mcPr>
+                    <m:count m:val="1"/>
+                    <m:mcJc m:val="center"/>
+                  </m:mcPr>
+                </m:mc>
+              </m:mcs>
+              <m:ctrlPr>
+                <w:rPr>
+                  <w:rFonts w:ascii="Cambria Math" w:hAnsi="Cambria Math"/>
+                  <w:i/>
+                </w:rPr>
+              </m:ctrlPr>
+            </m:mPr>
+            <m:mr>
+              <m:e>
+                <m:sSub>
+                  <m:sSubPr>
+                    <m:ctrlPr>
+                      <w:rPr>
+                        <w:rFonts w:ascii="Cambria Math" w:hAnsi="Cambria Math"/>
+                        <w:i/>
+                      </w:rPr>
+                    </m:ctrlPr>
+                  </m:sSubPr>
+                  <m:e>
+                    <m:sSub>
+                      <m:sSubPr>
+                        <m:ctrlPr>
+                          <w:rPr>
+                            <w:rFonts w:ascii="Cambria Math" w:hAnsi="Cambria Math"/>
+                            <w:i/>
+                          </w:rPr>
+                        </m:ctrlPr>
+                      </m:sSubPr>
+                      <m:e>
+                        <m:r>
+                          <w:rPr>
+                            <w:rFonts w:ascii="Cambria Math" w:hAnsi="Cambria Math"/>
+                          </w:rPr>
+                          <m:t>K</m:t>
+                        </m:r>
+                      </m:e>
+                      <m:sub>
+                        <m:r>
+                          <w:rPr>
+                            <w:rFonts w:ascii="Cambria Math" w:hAnsi="Cambria Math"/>
+                          </w:rPr>
+                          <m:t>db</m:t>
+                        </m:r>
+                      </m:sub>
+                    </m:sSub>
+                    <m:r>
+                      <w:rPr>
+                        <w:rFonts w:ascii="Cambria Math" w:hAnsi="Cambria Math"/>
+                      </w:rPr>
+                      <m:t>A</m:t>
+                    </m:r>
+                  </m:e>
+                  <m:sub>
+                    <m:r>
+                      <w:rPr>
+                        <w:rFonts w:ascii="Cambria Math" w:hAnsi="Cambria Math"/>
+                      </w:rPr>
+                      <m:t>s</m:t>
+                    </m:r>
+                  </m:sub>
+                </m:sSub>
+                <m:sSub>
+                  <m:sSubPr>
+                    <m:ctrlPr>
+                      <w:rPr>
+                        <w:rFonts w:ascii="Cambria Math" w:hAnsi="Cambria Math"/>
+                        <w:i/>
+                      </w:rPr>
+                    </m:ctrlPr>
+                  </m:sSubPr>
+                  <m:e>
+                    <m:r>
+                      <w:rPr>
+                        <w:rFonts w:ascii="Cambria Math" w:hAnsi="Cambria Math"/>
+                      </w:rPr>
+                      <m:t>f</m:t>
+                    </m:r>
+                  </m:e>
+                  <m:sub>
+                    <m:r>
+                      <w:rPr>
+                        <w:rFonts w:ascii="Cambria Math" w:hAnsi="Cambria Math"/>
+                      </w:rPr>
+                      <m:t>y</m:t>
+                    </m:r>
+                  </m:sub>
+                </m:sSub>
+                <m:r>
+                  <w:rPr>
+                    <w:rFonts w:ascii="Cambria Math" w:hAnsi="Cambria Math"/>
+                  </w:rPr>
+                  <m:t>+</m:t>
+                </m:r>
+                <m:sSub>
+                  <m:sSubPr>
+                    <m:ctrlPr>
+                      <w:rPr>
+                        <w:rFonts w:ascii="Cambria Math" w:hAnsi="Cambria Math"/>
+                        <w:i/>
+                      </w:rPr>
+                    </m:ctrlPr>
+                  </m:sSubPr>
+                  <m:e>
+                    <m:sSub>
+                      <m:sSubPr>
+                        <m:ctrlPr>
+                          <w:rPr>
+                            <w:rFonts w:ascii="Cambria Math" w:hAnsi="Cambria Math"/>
+                            <w:i/>
+                          </w:rPr>
+                        </m:ctrlPr>
+                      </m:sSubPr>
+                      <m:e>
+                        <m:r>
+                          <w:rPr>
+                            <w:rFonts w:ascii="Cambria Math" w:hAnsi="Cambria Math"/>
+                          </w:rPr>
+                          <m:t>K</m:t>
+                        </m:r>
+                      </m:e>
+                      <m:sub>
+                        <m:r>
+                          <w:rPr>
+                            <w:rFonts w:ascii="Cambria Math" w:hAnsi="Cambria Math"/>
+                          </w:rPr>
+                          <m:t>ds</m:t>
+                        </m:r>
+                      </m:sub>
+                    </m:sSub>
+                    <m:r>
+                      <w:rPr>
+                        <w:rFonts w:ascii="Cambria Math" w:hAnsi="Cambria Math"/>
+                      </w:rPr>
+                      <m:t>A</m:t>
+                    </m:r>
+                  </m:e>
+                  <m:sub>
+                    <m:r>
+                      <w:rPr>
+                        <w:rFonts w:ascii="Cambria Math" w:hAnsi="Cambria Math"/>
+                      </w:rPr>
+                      <m:t>ps</m:t>
+                    </m:r>
+                  </m:sub>
+                </m:sSub>
+                <m:sSub>
+                  <m:sSubPr>
+                    <m:ctrlPr>
+                      <w:rPr>
+                        <w:rFonts w:ascii="Cambria Math" w:hAnsi="Cambria Math"/>
+                        <w:i/>
+                      </w:rPr>
+                    </m:ctrlPr>
+                  </m:sSubPr>
+                  <m:e>
+                    <m:r>
+                      <w:rPr>
+                        <w:rFonts w:ascii="Cambria Math" w:hAnsi="Cambria Math"/>
+                      </w:rPr>
+                      <m:t>f</m:t>
+                    </m:r>
+                  </m:e>
+                  <m:sub>
+                    <m:r>
+                      <w:rPr>
+                        <w:rFonts w:ascii="Cambria Math" w:hAnsi="Cambria Math"/>
+                      </w:rPr>
+                      <m:t>ps</m:t>
+                    </m:r>
+                  </m:sub>
+                </m:sSub>
+                <m:r>
+                  <w:rPr>
+                    <w:rFonts w:ascii="Cambria Math" w:hAnsi="Cambria Math"/>
+                  </w:rPr>
+                  <m:t>≥</m:t>
+                </m:r>
+                <m:d>
+                  <m:dPr>
+                    <m:begChr m:val="["/>
+                    <m:endChr m:val="]"/>
+                    <m:ctrlPr>
+                      <w:rPr>
+                        <w:rFonts w:ascii="Cambria Math" w:hAnsi="Cambria Math"/>
+                        <w:i/>
+                      </w:rPr>
+                    </m:ctrlPr>
+                  </m:dPr>
+                  <m:e>
+                    <m:f>
+                      <m:fPr>
+                        <m:ctrlPr>
+                          <w:rPr>
+                            <w:rFonts w:ascii="Cambria Math" w:hAnsi="Cambria Math"/>
+                            <w:i/>
+                          </w:rPr>
+                        </m:ctrlPr>
+                      </m:fPr>
+                      <m:num>
+                        <m:sSub>
+                          <m:sSubPr>
+                            <m:ctrlPr>
+                              <w:rPr>
+                                <w:rFonts w:ascii="Cambria Math" w:hAnsi="Cambria Math"/>
+                                <w:i/>
+                              </w:rPr>
+                            </m:ctrlPr>
+                          </m:sSubPr>
+                          <m:e>
+                            <m:r>
+                              <w:rPr>
+                                <w:rFonts w:ascii="Cambria Math" w:hAnsi="Cambria Math"/>
+                              </w:rPr>
+                              <m:t>M</m:t>
+                            </m:r>
+                          </m:e>
+                          <m:sub>
+                            <m:r>
+                              <w:rPr>
+                                <w:rFonts w:ascii="Cambria Math" w:hAnsi="Cambria Math"/>
+                              </w:rPr>
+                              <m:t>u</m:t>
+                            </m:r>
+                          </m:sub>
+                        </m:sSub>
+                      </m:num>
+                      <m:den>
+                        <m:sSub>
+                          <m:sSubPr>
+                            <m:ctrlPr>
+                              <w:rPr>
+                                <w:rFonts w:ascii="Cambria Math" w:hAnsi="Cambria Math"/>
+                                <w:i/>
+                              </w:rPr>
+                            </m:ctrlPr>
+                          </m:sSubPr>
+                          <m:e>
+                            <m:r>
+                              <w:rPr>
+                                <w:rFonts w:ascii="Cambria Math" w:hAnsi="Cambria Math"/>
+                              </w:rPr>
+                              <m:t>d</m:t>
+                            </m:r>
+                          </m:e>
+                          <m:sub>
+                            <m:r>
+                              <w:rPr>
+                                <w:rFonts w:ascii="Cambria Math" w:hAnsi="Cambria Math"/>
+                              </w:rPr>
+                              <m:t>v</m:t>
+                            </m:r>
+                          </m:sub>
+                        </m:sSub>
+                        <m:sSub>
+                          <m:sSubPr>
+                            <m:ctrlPr>
+                              <w:rPr>
+                                <w:rFonts w:ascii="Cambria Math" w:hAnsi="Cambria Math"/>
+                                <w:i/>
+                              </w:rPr>
+                            </m:ctrlPr>
+                          </m:sSubPr>
+                          <m:e>
+                            <m:r>
+                              <w:rPr>
+                                <w:rFonts w:ascii="Cambria Math" w:hAnsi="Cambria Math"/>
+                              </w:rPr>
+                              <m:t>φ</m:t>
+                            </m:r>
+                          </m:e>
+                          <m:sub>
+                            <m:r>
+                              <w:rPr>
+                                <w:rFonts w:ascii="Cambria Math" w:hAnsi="Cambria Math"/>
+                              </w:rPr>
+                              <m:t>f</m:t>
+                            </m:r>
+                          </m:sub>
+                        </m:sSub>
+                      </m:den>
+                    </m:f>
+                    <m:r>
+                      <w:rPr>
+                        <w:rFonts w:ascii="Cambria Math" w:hAnsi="Cambria Math"/>
+                      </w:rPr>
+                      <m:t>+0.5</m:t>
+                    </m:r>
+                    <m:f>
+                      <m:fPr>
+                        <m:ctrlPr>
+                          <w:rPr>
+                            <w:rFonts w:ascii="Cambria Math" w:hAnsi="Cambria Math"/>
+                            <w:i/>
+                          </w:rPr>
+                        </m:ctrlPr>
+                      </m:fPr>
+                      <m:num>
+                        <m:sSub>
+                          <m:sSubPr>
+                            <m:ctrlPr>
+                              <w:rPr>
+                                <w:rFonts w:ascii="Cambria Math" w:hAnsi="Cambria Math"/>
+                                <w:i/>
+                              </w:rPr>
+                            </m:ctrlPr>
+                          </m:sSubPr>
+                          <m:e>
+                            <m:r>
+                              <w:rPr>
+                                <w:rFonts w:ascii="Cambria Math" w:hAnsi="Cambria Math"/>
+                              </w:rPr>
+                              <m:t>N</m:t>
+                            </m:r>
+                          </m:e>
+                          <m:sub>
+                            <m:r>
+                              <w:rPr>
+                                <w:rFonts w:ascii="Cambria Math" w:hAnsi="Cambria Math"/>
+                              </w:rPr>
+                              <m:t>u</m:t>
+                            </m:r>
+                          </m:sub>
+                        </m:sSub>
+                      </m:num>
+                      <m:den>
+                        <m:sSub>
+                          <m:sSubPr>
+                            <m:ctrlPr>
+                              <w:rPr>
+                                <w:rFonts w:ascii="Cambria Math" w:hAnsi="Cambria Math"/>
+                                <w:i/>
+                              </w:rPr>
+                            </m:ctrlPr>
+                          </m:sSubPr>
+                          <m:e>
+                            <m:r>
+                              <w:rPr>
+                                <w:rFonts w:ascii="Cambria Math" w:hAnsi="Cambria Math"/>
+                              </w:rPr>
+                              <m:t>φ</m:t>
+                            </m:r>
+                          </m:e>
+                          <m:sub>
+                            <m:r>
+                              <w:rPr>
+                                <w:rFonts w:ascii="Cambria Math" w:hAnsi="Cambria Math"/>
+                              </w:rPr>
+                              <m:t>a</m:t>
+                            </m:r>
+                          </m:sub>
+                        </m:sSub>
+                      </m:den>
+                    </m:f>
+                    <m:r>
+                      <w:rPr>
+                        <w:rFonts w:ascii="Cambria Math" w:hAnsi="Cambria Math"/>
+                      </w:rPr>
+                      <m:t>+</m:t>
+                    </m:r>
+                    <m:d>
+                      <m:dPr>
+                        <m:ctrlPr>
+                          <w:rPr>
+                            <w:rFonts w:ascii="Cambria Math" w:hAnsi="Cambria Math"/>
+                            <w:i/>
+                          </w:rPr>
+                        </m:ctrlPr>
+                      </m:dPr>
+                      <m:e>
+                        <m:d>
+                          <m:dPr>
+                            <m:begChr m:val="|"/>
+                            <m:endChr m:val="|"/>
+                            <m:ctrlPr>
+                              <w:rPr>
+                                <w:rFonts w:ascii="Cambria Math" w:hAnsi="Cambria Math"/>
+                                <w:i/>
+                              </w:rPr>
+                            </m:ctrlPr>
+                          </m:dPr>
+                          <m:e>
+                            <m:f>
+                              <m:fPr>
+                                <m:ctrlPr>
+                                  <w:rPr>
+                                    <w:rFonts w:ascii="Cambria Math" w:hAnsi="Cambria Math"/>
+                                    <w:i/>
+                                  </w:rPr>
+                                </m:ctrlPr>
+                              </m:fPr>
+                              <m:num>
+                                <m:sSub>
+                                  <m:sSubPr>
+                                    <m:ctrlPr>
+                                      <w:rPr>
+                                        <w:rFonts w:ascii="Cambria Math" w:hAnsi="Cambria Math"/>
+                                        <w:i/>
+                                      </w:rPr>
+                                    </m:ctrlPr>
+                                  </m:sSubPr>
+                                  <m:e>
+                                    <m:r>
+                                      <w:rPr>
+                                        <w:rFonts w:ascii="Cambria Math" w:hAnsi="Cambria Math"/>
+                                      </w:rPr>
+                                      <m:t>V</m:t>
+                                    </m:r>
+                                  </m:e>
+                                  <m:sub>
+                                    <m:r>
+                                      <w:rPr>
+                                        <w:rFonts w:ascii="Cambria Math" w:hAnsi="Cambria Math"/>
+                                      </w:rPr>
+                                      <m:t>u</m:t>
+                                    </m:r>
+                                  </m:sub>
+                                </m:sSub>
+                              </m:num>
+                              <m:den>
+                                <m:sSub>
+                                  <m:sSubPr>
+                                    <m:ctrlPr>
+                                      <w:rPr>
+                                        <w:rFonts w:ascii="Cambria Math" w:hAnsi="Cambria Math"/>
+                                        <w:i/>
+                                      </w:rPr>
+                                    </m:ctrlPr>
+                                  </m:sSubPr>
+                                  <m:e>
+                                    <m:r>
+                                      <w:rPr>
+                                        <w:rFonts w:ascii="Cambria Math" w:hAnsi="Cambria Math"/>
+                                      </w:rPr>
+                                      <m:t>φ</m:t>
+                                    </m:r>
+                                  </m:e>
+                                  <m:sub>
+                                    <m:r>
+                                      <w:rPr>
+                                        <w:rFonts w:ascii="Cambria Math" w:hAnsi="Cambria Math"/>
+                                      </w:rPr>
+                                      <m:t>v</m:t>
+                                    </m:r>
+                                  </m:sub>
+                                </m:sSub>
+                              </m:den>
+                            </m:f>
+                            <m:r>
+                              <w:rPr>
+                                <w:rFonts w:ascii="Cambria Math" w:hAnsi="Cambria Math"/>
+                              </w:rPr>
+                              <m:t>-</m:t>
+                            </m:r>
+                            <m:sSub>
+                              <m:sSubPr>
+                                <m:ctrlPr>
+                                  <w:rPr>
+                                    <w:rFonts w:ascii="Cambria Math" w:hAnsi="Cambria Math"/>
+                                    <w:i/>
+                                  </w:rPr>
+                                </m:ctrlPr>
+                              </m:sSubPr>
+                              <m:e>
+                                <m:r>
+                                  <w:rPr>
+                                    <w:rFonts w:ascii="Cambria Math" w:hAnsi="Cambria Math"/>
+                                  </w:rPr>
+                                  <m:t>V</m:t>
+                                </m:r>
+                              </m:e>
+                              <m:sub>
+                                <m:r>
+                                  <w:rPr>
+                                    <w:rFonts w:ascii="Cambria Math" w:hAnsi="Cambria Math"/>
+                                  </w:rPr>
+                                  <m:t>p</m:t>
+                                </m:r>
+                              </m:sub>
+                            </m:sSub>
+                          </m:e>
+                        </m:d>
+                        <m:r>
+                          <w:rPr>
+                            <w:rFonts w:ascii="Cambria Math" w:hAnsi="Cambria Math"/>
+                          </w:rPr>
+                          <m:t>-0.5</m:t>
+                        </m:r>
+                        <m:sSub>
+                          <m:sSubPr>
+                            <m:ctrlPr>
+                              <w:rPr>
+                                <w:rFonts w:ascii="Cambria Math" w:hAnsi="Cambria Math"/>
+                                <w:i/>
+                              </w:rPr>
+                            </m:ctrlPr>
+                          </m:sSubPr>
+                          <m:e>
+                            <m:r>
+                              <w:rPr>
+                                <w:rFonts w:ascii="Cambria Math" w:hAnsi="Cambria Math"/>
+                              </w:rPr>
+                              <m:t>V</m:t>
+                            </m:r>
+                          </m:e>
+                          <m:sub>
+                            <m:r>
+                              <w:rPr>
+                                <w:rFonts w:ascii="Cambria Math" w:hAnsi="Cambria Math"/>
+                              </w:rPr>
+                              <m:t>s</m:t>
+                            </m:r>
+                          </m:sub>
+                        </m:sSub>
+                      </m:e>
+                    </m:d>
+                    <m:func>
+                      <m:funcPr>
+                        <m:ctrlPr>
+                          <w:rPr>
+                            <w:rFonts w:ascii="Cambria Math" w:hAnsi="Cambria Math"/>
+                            <w:i/>
+                          </w:rPr>
+                        </m:ctrlPr>
+                      </m:funcPr>
+                      <m:fName>
+                        <m:r>
+                          <m:rPr>
+                            <m:sty m:val="p"/>
+                          </m:rPr>
+                          <w:rPr>
+                            <w:rFonts w:ascii="Cambria Math" w:hAnsi="Cambria Math"/>
+                          </w:rPr>
+                          <m:t>cot</m:t>
+                        </m:r>
+                      </m:fName>
+                      <m:e>
+                        <m:r>
+                          <w:rPr>
+                            <w:rFonts w:ascii="Cambria Math" w:hAnsi="Cambria Math"/>
+                          </w:rPr>
+                          <m:t>θ</m:t>
+                        </m:r>
+                      </m:e>
+                    </m:func>
+                  </m:e>
+                </m:d>
+              </m:e>
+              <m:e>
+                <m:r>
+                  <w:rPr>
+                    <w:rFonts w:ascii="Cambria Math" w:hAnsi="Cambria Math"/>
+                  </w:rPr>
+                  <m:t>5.</m:t>
+                </m:r>
+                <m:r>
+                  <w:rPr>
+                    <w:rFonts w:ascii="Cambria Math" w:hAnsi="Cambria Math"/>
+                  </w:rPr>
+                  <m:t>7</m:t>
+                </m:r>
+                <m:r>
+                  <w:rPr>
+                    <w:rFonts w:ascii="Cambria Math" w:hAnsi="Cambria Math"/>
+                  </w:rPr>
+                  <m:t>.3.5-1</m:t>
+                </m:r>
+              </m:e>
+            </m:mr>
+            <m:mr>
+              <m:e>
+                <m:sSub>
+                  <m:sSubPr>
+                    <m:ctrlPr>
+                      <w:rPr>
+                        <w:rFonts w:ascii="Cambria Math" w:hAnsi="Cambria Math"/>
+                        <w:i/>
+                      </w:rPr>
+                    </m:ctrlPr>
+                  </m:sSubPr>
+                  <m:e>
+                    <m:sSub>
+                      <m:sSubPr>
+                        <m:ctrlPr>
+                          <w:rPr>
+                            <w:rFonts w:ascii="Cambria Math" w:hAnsi="Cambria Math"/>
+                            <w:i/>
+                          </w:rPr>
+                        </m:ctrlPr>
+                      </m:sSubPr>
+                      <m:e>
+                        <m:r>
+                          <w:rPr>
+                            <w:rFonts w:ascii="Cambria Math" w:hAnsi="Cambria Math"/>
+                          </w:rPr>
+                          <m:t>K</m:t>
+                        </m:r>
+                      </m:e>
+                      <m:sub>
+                        <m:r>
+                          <w:rPr>
+                            <w:rFonts w:ascii="Cambria Math" w:hAnsi="Cambria Math"/>
+                          </w:rPr>
+                          <m:t>db</m:t>
+                        </m:r>
+                      </m:sub>
+                    </m:sSub>
+                    <m:r>
+                      <w:rPr>
+                        <w:rFonts w:ascii="Cambria Math" w:hAnsi="Cambria Math"/>
+                      </w:rPr>
+                      <m:t>A</m:t>
+                    </m:r>
+                  </m:e>
+                  <m:sub>
+                    <m:r>
+                      <w:rPr>
+                        <w:rFonts w:ascii="Cambria Math" w:hAnsi="Cambria Math"/>
+                      </w:rPr>
+                      <m:t>s</m:t>
+                    </m:r>
+                  </m:sub>
+                </m:sSub>
+                <m:sSub>
+                  <m:sSubPr>
+                    <m:ctrlPr>
+                      <w:rPr>
+                        <w:rFonts w:ascii="Cambria Math" w:hAnsi="Cambria Math"/>
+                        <w:i/>
+                      </w:rPr>
+                    </m:ctrlPr>
+                  </m:sSubPr>
+                  <m:e>
+                    <m:r>
+                      <w:rPr>
+                        <w:rFonts w:ascii="Cambria Math" w:hAnsi="Cambria Math"/>
+                      </w:rPr>
+                      <m:t>f</m:t>
+                    </m:r>
+                  </m:e>
+                  <m:sub>
+                    <m:r>
+                      <w:rPr>
+                        <w:rFonts w:ascii="Cambria Math" w:hAnsi="Cambria Math"/>
+                      </w:rPr>
+                      <m:t>y</m:t>
+                    </m:r>
+                  </m:sub>
+                </m:sSub>
+                <m:r>
+                  <w:rPr>
+                    <w:rFonts w:ascii="Cambria Math" w:hAnsi="Cambria Math"/>
+                  </w:rPr>
+                  <m:t>+</m:t>
+                </m:r>
+                <m:sSub>
+                  <m:sSubPr>
+                    <m:ctrlPr>
+                      <w:rPr>
+                        <w:rFonts w:ascii="Cambria Math" w:hAnsi="Cambria Math"/>
+                        <w:i/>
+                      </w:rPr>
+                    </m:ctrlPr>
+                  </m:sSubPr>
+                  <m:e>
+                    <m:sSub>
+                      <m:sSubPr>
+                        <m:ctrlPr>
+                          <w:rPr>
+                            <w:rFonts w:ascii="Cambria Math" w:hAnsi="Cambria Math"/>
+                            <w:i/>
+                          </w:rPr>
+                        </m:ctrlPr>
+                      </m:sSubPr>
+                      <m:e>
+                        <m:r>
+                          <w:rPr>
+                            <w:rFonts w:ascii="Cambria Math" w:hAnsi="Cambria Math"/>
+                          </w:rPr>
+                          <m:t>K</m:t>
+                        </m:r>
+                      </m:e>
+                      <m:sub>
+                        <m:r>
+                          <w:rPr>
+                            <w:rFonts w:ascii="Cambria Math" w:hAnsi="Cambria Math"/>
+                          </w:rPr>
+                          <m:t>ds</m:t>
+                        </m:r>
+                      </m:sub>
+                    </m:sSub>
+                    <m:r>
+                      <w:rPr>
+                        <w:rFonts w:ascii="Cambria Math" w:hAnsi="Cambria Math"/>
+                      </w:rPr>
+                      <m:t>A</m:t>
+                    </m:r>
+                  </m:e>
+                  <m:sub>
+                    <m:r>
+                      <w:rPr>
+                        <w:rFonts w:ascii="Cambria Math" w:hAnsi="Cambria Math"/>
+                      </w:rPr>
+                      <m:t>ps</m:t>
+                    </m:r>
+                  </m:sub>
+                </m:sSub>
+                <m:sSub>
+                  <m:sSubPr>
+                    <m:ctrlPr>
+                      <w:rPr>
+                        <w:rFonts w:ascii="Cambria Math" w:hAnsi="Cambria Math"/>
+                        <w:i/>
+                      </w:rPr>
+                    </m:ctrlPr>
+                  </m:sSubPr>
+                  <m:e>
+                    <m:r>
+                      <w:rPr>
+                        <w:rFonts w:ascii="Cambria Math" w:hAnsi="Cambria Math"/>
+                      </w:rPr>
+                      <m:t>f</m:t>
+                    </m:r>
+                  </m:e>
+                  <m:sub>
+                    <m:r>
+                      <w:rPr>
+                        <w:rFonts w:ascii="Cambria Math" w:hAnsi="Cambria Math"/>
+                      </w:rPr>
+                      <m:t>ps</m:t>
+                    </m:r>
+                  </m:sub>
+                </m:sSub>
+                <m:r>
+                  <w:rPr>
+                    <w:rFonts w:ascii="Cambria Math" w:hAnsi="Cambria Math"/>
+                  </w:rPr>
+                  <m:t>≥</m:t>
+                </m:r>
+                <m:d>
+                  <m:dPr>
+                    <m:ctrlPr>
+                      <w:rPr>
+                        <w:rFonts w:ascii="Cambria Math" w:hAnsi="Cambria Math"/>
+                        <w:i/>
+                      </w:rPr>
+                    </m:ctrlPr>
+                  </m:dPr>
+                  <m:e>
+                    <m:f>
+                      <m:fPr>
+                        <m:ctrlPr>
+                          <w:rPr>
+                            <w:rFonts w:ascii="Cambria Math" w:hAnsi="Cambria Math"/>
+                            <w:i/>
+                          </w:rPr>
+                        </m:ctrlPr>
+                      </m:fPr>
+                      <m:num>
+                        <m:sSub>
+                          <m:sSubPr>
+                            <m:ctrlPr>
+                              <w:rPr>
+                                <w:rFonts w:ascii="Cambria Math" w:hAnsi="Cambria Math"/>
+                                <w:i/>
+                              </w:rPr>
+                            </m:ctrlPr>
+                          </m:sSubPr>
+                          <m:e>
+                            <m:r>
+                              <w:rPr>
+                                <w:rFonts w:ascii="Cambria Math" w:hAnsi="Cambria Math"/>
+                              </w:rPr>
+                              <m:t>V</m:t>
+                            </m:r>
+                          </m:e>
+                          <m:sub>
+                            <m:r>
+                              <w:rPr>
+                                <w:rFonts w:ascii="Cambria Math" w:hAnsi="Cambria Math"/>
+                              </w:rPr>
+                              <m:t>u</m:t>
+                            </m:r>
+                          </m:sub>
+                        </m:sSub>
+                      </m:num>
+                      <m:den>
+                        <m:sSub>
+                          <m:sSubPr>
+                            <m:ctrlPr>
+                              <w:rPr>
+                                <w:rFonts w:ascii="Cambria Math" w:hAnsi="Cambria Math"/>
+                                <w:i/>
+                              </w:rPr>
+                            </m:ctrlPr>
+                          </m:sSubPr>
+                          <m:e>
+                            <m:r>
+                              <w:rPr>
+                                <w:rFonts w:ascii="Cambria Math" w:hAnsi="Cambria Math"/>
+                              </w:rPr>
+                              <m:t>φ</m:t>
+                            </m:r>
+                          </m:e>
+                          <m:sub>
+                            <m:r>
+                              <w:rPr>
+                                <w:rFonts w:ascii="Cambria Math" w:hAnsi="Cambria Math"/>
+                              </w:rPr>
+                              <m:t>v</m:t>
+                            </m:r>
+                          </m:sub>
+                        </m:sSub>
+                      </m:den>
+                    </m:f>
+                    <m:r>
+                      <w:rPr>
+                        <w:rFonts w:ascii="Cambria Math" w:hAnsi="Cambria Math"/>
+                      </w:rPr>
+                      <m:t>-</m:t>
+                    </m:r>
+                    <m:sSub>
+                      <m:sSubPr>
+                        <m:ctrlPr>
+                          <w:rPr>
+                            <w:rFonts w:ascii="Cambria Math" w:hAnsi="Cambria Math"/>
+                            <w:i/>
+                          </w:rPr>
+                        </m:ctrlPr>
+                      </m:sSubPr>
+                      <m:e>
+                        <m:r>
+                          <w:rPr>
+                            <w:rFonts w:ascii="Cambria Math" w:hAnsi="Cambria Math"/>
+                          </w:rPr>
+                          <m:t>V</m:t>
+                        </m:r>
+                      </m:e>
+                      <m:sub>
+                        <m:r>
+                          <w:rPr>
+                            <w:rFonts w:ascii="Cambria Math" w:hAnsi="Cambria Math"/>
+                          </w:rPr>
+                          <m:t>p</m:t>
+                        </m:r>
+                      </m:sub>
+                    </m:sSub>
+                    <m:r>
+                      <w:rPr>
+                        <w:rFonts w:ascii="Cambria Math" w:hAnsi="Cambria Math"/>
+                      </w:rPr>
+                      <m:t>-0.5</m:t>
+                    </m:r>
+                    <m:sSub>
+                      <m:sSubPr>
+                        <m:ctrlPr>
+                          <w:rPr>
+                            <w:rFonts w:ascii="Cambria Math" w:hAnsi="Cambria Math"/>
+                            <w:i/>
+                          </w:rPr>
+                        </m:ctrlPr>
+                      </m:sSubPr>
+                      <m:e>
+                        <m:r>
+                          <w:rPr>
+                            <w:rFonts w:ascii="Cambria Math" w:hAnsi="Cambria Math"/>
+                          </w:rPr>
+                          <m:t>V</m:t>
+                        </m:r>
+                      </m:e>
+                      <m:sub>
+                        <m:r>
+                          <w:rPr>
+                            <w:rFonts w:ascii="Cambria Math" w:hAnsi="Cambria Math"/>
+                          </w:rPr>
+                          <m:t>s</m:t>
+                        </m:r>
+                      </m:sub>
+                    </m:sSub>
+                  </m:e>
+                </m:d>
+                <m:func>
+                  <m:funcPr>
+                    <m:ctrlPr>
+                      <w:rPr>
+                        <w:rFonts w:ascii="Cambria Math" w:hAnsi="Cambria Math"/>
+                        <w:i/>
+                      </w:rPr>
+                    </m:ctrlPr>
+                  </m:funcPr>
+                  <m:fName>
+                    <m:r>
+                      <m:rPr>
+                        <m:sty m:val="p"/>
+                      </m:rPr>
+                      <w:rPr>
+                        <w:rFonts w:ascii="Cambria Math" w:hAnsi="Cambria Math"/>
+                      </w:rPr>
+                      <m:t>cot</m:t>
+                    </m:r>
+                  </m:fName>
+                  <m:e>
+                    <m:r>
+                      <w:rPr>
+                        <w:rFonts w:ascii="Cambria Math" w:hAnsi="Cambria Math"/>
+                      </w:rPr>
+                      <m:t>θ</m:t>
+                    </m:r>
+                  </m:e>
+                </m:func>
+              </m:e>
+              <m:e>
+                <m:r>
+                  <w:rPr>
+                    <w:rFonts w:ascii="Cambria Math" w:hAnsi="Cambria Math"/>
+                  </w:rPr>
+                  <m:t>5.</m:t>
+                </m:r>
+                <m:r>
+                  <w:rPr>
+                    <w:rFonts w:ascii="Cambria Math" w:hAnsi="Cambria Math"/>
+                  </w:rPr>
+                  <m:t>7</m:t>
+                </m:r>
+                <m:r>
+                  <w:rPr>
+                    <w:rFonts w:ascii="Cambria Math" w:hAnsi="Cambria Math"/>
+                  </w:rPr>
+                  <m:t>.3.5-2</m:t>
+                </m:r>
+              </m:e>
+            </m:mr>
+          </m:m>
+        </m:oMath>
+      </m:oMathPara>
+    </w:p>
+    <w:p>
+      <w:pPr>
+        <w:rPr>
+          <w:rFonts w:eastAsiaTheme="minorEastAsia"/>
+        </w:rPr>
+      </w:pPr>
+      <w:r>
+        <w:rPr>
+          <w:rFonts w:eastAsiaTheme="minorEastAsia"/>
+        </w:rPr>
+        <w:t>LRFD 20</w:t>
+      </w:r>
+      <w:r>
+        <w:rPr>
+          <w:rFonts w:eastAsiaTheme="minorEastAsia"/>
+        </w:rPr>
+        <w:t>17</w:t>
+      </w:r>
+      <w:r>
+        <w:rPr>
+          <w:rFonts w:eastAsiaTheme="minorEastAsia"/>
+        </w:rPr>
+        <w:t xml:space="preserve"> and later with PT</w:t>
+      </w:r>
+    </w:p>
+    <w:p>
+      <w:pPr>
+        <w:rPr>
+          <w:rFonts w:eastAsiaTheme="minorEastAsia"/>
+        </w:rPr>
+      </w:pPr>
+      <m:oMathPara>
+        <m:oMath>
+          <m:m>
+            <m:mPr>
+              <m:mcs>
+                <m:mc>
+                  <m:mcPr>
+                    <m:count m:val="1"/>
+                    <m:mcJc m:val="left"/>
+                  </m:mcPr>
+                </m:mc>
+                <m:mc>
+                  <m:mcPr>
+                    <m:count m:val="1"/>
+                    <m:mcJc m:val="center"/>
+                  </m:mcPr>
+                </m:mc>
+              </m:mcs>
+              <m:ctrlPr>
+                <w:rPr>
+                  <w:rFonts w:ascii="Cambria Math" w:hAnsi="Cambria Math"/>
+                  <w:i/>
+                </w:rPr>
+              </m:ctrlPr>
+            </m:mPr>
+            <m:mr>
+              <m:e>
+                <m:sSub>
+                  <m:sSubPr>
+                    <m:ctrlPr>
+                      <w:rPr>
+                        <w:rFonts w:ascii="Cambria Math" w:hAnsi="Cambria Math"/>
+                        <w:i/>
+                      </w:rPr>
+                    </m:ctrlPr>
+                  </m:sSubPr>
+                  <m:e>
+                    <m:sSub>
+                      <m:sSubPr>
+                        <m:ctrlPr>
+                          <w:rPr>
+                            <w:rFonts w:ascii="Cambria Math" w:hAnsi="Cambria Math"/>
+                            <w:i/>
+                          </w:rPr>
+                        </m:ctrlPr>
+                      </m:sSubPr>
+                      <m:e>
+                        <m:r>
+                          <w:rPr>
+                            <w:rFonts w:ascii="Cambria Math" w:hAnsi="Cambria Math"/>
+                          </w:rPr>
+                          <m:t>K</m:t>
+                        </m:r>
+                      </m:e>
+                      <m:sub>
+                        <m:r>
+                          <w:rPr>
+                            <w:rFonts w:ascii="Cambria Math" w:hAnsi="Cambria Math"/>
+                          </w:rPr>
+                          <m:t>db</m:t>
+                        </m:r>
+                      </m:sub>
+                    </m:sSub>
+                    <m:r>
+                      <w:rPr>
+                        <w:rFonts w:ascii="Cambria Math" w:hAnsi="Cambria Math"/>
+                      </w:rPr>
+                      <m:t>A</m:t>
+                    </m:r>
+                  </m:e>
+                  <m:sub>
+                    <m:r>
+                      <w:rPr>
+                        <w:rFonts w:ascii="Cambria Math" w:hAnsi="Cambria Math"/>
+                      </w:rPr>
+                      <m:t>s</m:t>
+                    </m:r>
+                  </m:sub>
+                </m:sSub>
+                <m:sSub>
+                  <m:sSubPr>
+                    <m:ctrlPr>
+                      <w:rPr>
+                        <w:rFonts w:ascii="Cambria Math" w:hAnsi="Cambria Math"/>
+                        <w:i/>
+                      </w:rPr>
+                    </m:ctrlPr>
+                  </m:sSubPr>
+                  <m:e>
+                    <m:r>
+                      <w:rPr>
+                        <w:rFonts w:ascii="Cambria Math" w:hAnsi="Cambria Math"/>
+                      </w:rPr>
+                      <m:t>f</m:t>
+                    </m:r>
+                  </m:e>
+                  <m:sub>
+                    <m:r>
+                      <w:rPr>
+                        <w:rFonts w:ascii="Cambria Math" w:hAnsi="Cambria Math"/>
+                      </w:rPr>
+                      <m:t>y</m:t>
+                    </m:r>
+                  </m:sub>
+                </m:sSub>
+                <m:r>
+                  <w:rPr>
+                    <w:rFonts w:ascii="Cambria Math" w:hAnsi="Cambria Math"/>
+                  </w:rPr>
+                  <m:t>+</m:t>
+                </m:r>
+                <m:sSub>
+                  <m:sSubPr>
+                    <m:ctrlPr>
+                      <w:rPr>
+                        <w:rFonts w:ascii="Cambria Math" w:hAnsi="Cambria Math"/>
+                        <w:i/>
+                      </w:rPr>
+                    </m:ctrlPr>
+                  </m:sSubPr>
+                  <m:e>
+                    <m:sSub>
+                      <m:sSubPr>
+                        <m:ctrlPr>
+                          <w:rPr>
+                            <w:rFonts w:ascii="Cambria Math" w:hAnsi="Cambria Math"/>
+                            <w:i/>
+                          </w:rPr>
+                        </m:ctrlPr>
+                      </m:sSubPr>
+                      <m:e>
+                        <m:r>
+                          <w:rPr>
+                            <w:rFonts w:ascii="Cambria Math" w:hAnsi="Cambria Math"/>
+                          </w:rPr>
+                          <m:t>K</m:t>
+                        </m:r>
+                      </m:e>
+                      <m:sub>
+                        <m:r>
+                          <w:rPr>
+                            <w:rFonts w:ascii="Cambria Math" w:hAnsi="Cambria Math"/>
+                          </w:rPr>
+                          <m:t>ds</m:t>
+                        </m:r>
+                      </m:sub>
+                    </m:sSub>
+                    <m:r>
+                      <w:rPr>
+                        <w:rFonts w:ascii="Cambria Math" w:hAnsi="Cambria Math"/>
+                      </w:rPr>
+                      <m:t>A</m:t>
+                    </m:r>
+                  </m:e>
+                  <m:sub>
+                    <m:r>
+                      <w:rPr>
+                        <w:rFonts w:ascii="Cambria Math" w:hAnsi="Cambria Math"/>
+                      </w:rPr>
+                      <m:t>ps</m:t>
+                    </m:r>
+                  </m:sub>
+                </m:sSub>
+                <m:sSub>
+                  <m:sSubPr>
+                    <m:ctrlPr>
+                      <w:rPr>
+                        <w:rFonts w:ascii="Cambria Math" w:hAnsi="Cambria Math"/>
+                        <w:i/>
+                      </w:rPr>
+                    </m:ctrlPr>
+                  </m:sSubPr>
+                  <m:e>
+                    <m:r>
+                      <w:rPr>
+                        <w:rFonts w:ascii="Cambria Math" w:hAnsi="Cambria Math"/>
+                      </w:rPr>
+                      <m:t>f</m:t>
+                    </m:r>
+                  </m:e>
+                  <m:sub>
+                    <m:r>
+                      <w:rPr>
+                        <w:rFonts w:ascii="Cambria Math" w:hAnsi="Cambria Math"/>
+                      </w:rPr>
+                      <m:t>ps</m:t>
+                    </m:r>
+                  </m:sub>
+                </m:sSub>
+                <m:r>
+                  <w:rPr>
+                    <w:rFonts w:ascii="Cambria Math" w:hAnsi="Cambria Math"/>
+                  </w:rPr>
+                  <m:t>+</m:t>
+                </m:r>
+                <m:sSub>
+                  <m:sSubPr>
+                    <m:ctrlPr>
+                      <w:rPr>
+                        <w:rFonts w:ascii="Cambria Math" w:hAnsi="Cambria Math"/>
+                        <w:i/>
+                      </w:rPr>
+                    </m:ctrlPr>
+                  </m:sSubPr>
+                  <m:e>
+                    <m:r>
+                      <w:rPr>
+                        <w:rFonts w:ascii="Cambria Math" w:hAnsi="Cambria Math"/>
+                      </w:rPr>
+                      <m:t>A</m:t>
+                    </m:r>
+                  </m:e>
+                  <m:sub>
+                    <m:r>
+                      <w:rPr>
+                        <w:rFonts w:ascii="Cambria Math" w:hAnsi="Cambria Math"/>
+                      </w:rPr>
+                      <m:t>pt</m:t>
+                    </m:r>
+                  </m:sub>
+                </m:sSub>
+                <m:sSub>
+                  <m:sSubPr>
+                    <m:ctrlPr>
+                      <w:rPr>
+                        <w:rFonts w:ascii="Cambria Math" w:hAnsi="Cambria Math"/>
+                        <w:i/>
+                      </w:rPr>
+                    </m:ctrlPr>
+                  </m:sSubPr>
+                  <m:e>
+                    <m:r>
+                      <w:rPr>
+                        <w:rFonts w:ascii="Cambria Math" w:hAnsi="Cambria Math"/>
+                      </w:rPr>
+                      <m:t>f</m:t>
+                    </m:r>
+                  </m:e>
+                  <m:sub>
+                    <m:r>
+                      <w:rPr>
+                        <w:rFonts w:ascii="Cambria Math" w:hAnsi="Cambria Math"/>
+                      </w:rPr>
+                      <m:t>pt</m:t>
+                    </m:r>
+                  </m:sub>
+                </m:sSub>
+                <m:r>
+                  <w:rPr>
+                    <w:rFonts w:ascii="Cambria Math" w:hAnsi="Cambria Math"/>
+                  </w:rPr>
+                  <m:t>≥</m:t>
+                </m:r>
+                <m:d>
+                  <m:dPr>
+                    <m:begChr m:val="["/>
+                    <m:endChr m:val="]"/>
+                    <m:ctrlPr>
+                      <w:rPr>
+                        <w:rFonts w:ascii="Cambria Math" w:hAnsi="Cambria Math"/>
+                        <w:i/>
+                      </w:rPr>
+                    </m:ctrlPr>
+                  </m:dPr>
+                  <m:e>
+                    <m:f>
+                      <m:fPr>
+                        <m:ctrlPr>
+                          <w:rPr>
+                            <w:rFonts w:ascii="Cambria Math" w:hAnsi="Cambria Math"/>
+                            <w:i/>
+                          </w:rPr>
+                        </m:ctrlPr>
+                      </m:fPr>
+                      <m:num>
+                        <m:sSub>
+                          <m:sSubPr>
+                            <m:ctrlPr>
+                              <w:rPr>
+                                <w:rFonts w:ascii="Cambria Math" w:hAnsi="Cambria Math"/>
+                                <w:i/>
+                              </w:rPr>
+                            </m:ctrlPr>
+                          </m:sSubPr>
+                          <m:e>
+                            <m:r>
+                              <w:rPr>
+                                <w:rFonts w:ascii="Cambria Math" w:hAnsi="Cambria Math"/>
+                              </w:rPr>
+                              <m:t>M</m:t>
+                            </m:r>
+                          </m:e>
+                          <m:sub>
+                            <m:r>
+                              <w:rPr>
+                                <w:rFonts w:ascii="Cambria Math" w:hAnsi="Cambria Math"/>
+                              </w:rPr>
+                              <m:t>u</m:t>
+                            </m:r>
+                          </m:sub>
+                        </m:sSub>
+                      </m:num>
+                      <m:den>
+                        <m:sSub>
+                          <m:sSubPr>
+                            <m:ctrlPr>
+                              <w:rPr>
+                                <w:rFonts w:ascii="Cambria Math" w:hAnsi="Cambria Math"/>
+                                <w:i/>
+                              </w:rPr>
+                            </m:ctrlPr>
+                          </m:sSubPr>
+                          <m:e>
+                            <m:r>
+                              <w:rPr>
+                                <w:rFonts w:ascii="Cambria Math" w:hAnsi="Cambria Math"/>
+                              </w:rPr>
+                              <m:t>d</m:t>
+                            </m:r>
+                          </m:e>
+                          <m:sub>
+                            <m:r>
+                              <w:rPr>
+                                <w:rFonts w:ascii="Cambria Math" w:hAnsi="Cambria Math"/>
+                              </w:rPr>
+                              <m:t>v</m:t>
+                            </m:r>
+                          </m:sub>
+                        </m:sSub>
+                        <m:sSub>
+                          <m:sSubPr>
+                            <m:ctrlPr>
+                              <w:rPr>
+                                <w:rFonts w:ascii="Cambria Math" w:hAnsi="Cambria Math"/>
+                                <w:i/>
+                              </w:rPr>
+                            </m:ctrlPr>
+                          </m:sSubPr>
+                          <m:e>
+                            <m:r>
+                              <w:rPr>
+                                <w:rFonts w:ascii="Cambria Math" w:hAnsi="Cambria Math"/>
+                              </w:rPr>
+                              <m:t>φ</m:t>
+                            </m:r>
+                          </m:e>
+                          <m:sub>
+                            <m:r>
+                              <w:rPr>
+                                <w:rFonts w:ascii="Cambria Math" w:hAnsi="Cambria Math"/>
+                              </w:rPr>
+                              <m:t>f</m:t>
+                            </m:r>
+                          </m:sub>
+                        </m:sSub>
+                      </m:den>
+                    </m:f>
+                    <m:r>
+                      <w:rPr>
+                        <w:rFonts w:ascii="Cambria Math" w:hAnsi="Cambria Math"/>
+                      </w:rPr>
+                      <m:t>+0.5</m:t>
+                    </m:r>
+                    <m:f>
+                      <m:fPr>
+                        <m:ctrlPr>
+                          <w:rPr>
+                            <w:rFonts w:ascii="Cambria Math" w:hAnsi="Cambria Math"/>
+                            <w:i/>
+                          </w:rPr>
+                        </m:ctrlPr>
+                      </m:fPr>
+                      <m:num>
+                        <m:sSub>
+                          <m:sSubPr>
+                            <m:ctrlPr>
+                              <w:rPr>
+                                <w:rFonts w:ascii="Cambria Math" w:hAnsi="Cambria Math"/>
+                                <w:i/>
+                              </w:rPr>
+                            </m:ctrlPr>
+                          </m:sSubPr>
+                          <m:e>
+                            <m:r>
+                              <w:rPr>
+                                <w:rFonts w:ascii="Cambria Math" w:hAnsi="Cambria Math"/>
+                              </w:rPr>
+                              <m:t>N</m:t>
+                            </m:r>
+                          </m:e>
+                          <m:sub>
+                            <m:r>
+                              <w:rPr>
+                                <w:rFonts w:ascii="Cambria Math" w:hAnsi="Cambria Math"/>
+                              </w:rPr>
+                              <m:t>u</m:t>
+                            </m:r>
+                          </m:sub>
+                        </m:sSub>
+                      </m:num>
+                      <m:den>
+                        <m:sSub>
+                          <m:sSubPr>
+                            <m:ctrlPr>
+                              <w:rPr>
+                                <w:rFonts w:ascii="Cambria Math" w:hAnsi="Cambria Math"/>
+                                <w:i/>
+                              </w:rPr>
+                            </m:ctrlPr>
+                          </m:sSubPr>
+                          <m:e>
+                            <m:r>
+                              <w:rPr>
+                                <w:rFonts w:ascii="Cambria Math" w:hAnsi="Cambria Math"/>
+                              </w:rPr>
+                              <m:t>φ</m:t>
+                            </m:r>
+                          </m:e>
+                          <m:sub>
+                            <m:r>
+                              <w:rPr>
+                                <w:rFonts w:ascii="Cambria Math" w:hAnsi="Cambria Math"/>
+                              </w:rPr>
+                              <m:t>a</m:t>
+                            </m:r>
+                          </m:sub>
+                        </m:sSub>
+                      </m:den>
+                    </m:f>
+                    <m:r>
+                      <w:rPr>
+                        <w:rFonts w:ascii="Cambria Math" w:hAnsi="Cambria Math"/>
+                      </w:rPr>
+                      <m:t>+</m:t>
+                    </m:r>
+                    <m:d>
+                      <m:dPr>
+                        <m:ctrlPr>
+                          <w:rPr>
+                            <w:rFonts w:ascii="Cambria Math" w:hAnsi="Cambria Math"/>
+                            <w:i/>
+                          </w:rPr>
+                        </m:ctrlPr>
+                      </m:dPr>
+                      <m:e>
+                        <m:d>
+                          <m:dPr>
+                            <m:begChr m:val="|"/>
+                            <m:endChr m:val="|"/>
+                            <m:ctrlPr>
+                              <w:rPr>
+                                <w:rFonts w:ascii="Cambria Math" w:hAnsi="Cambria Math"/>
+                                <w:i/>
+                              </w:rPr>
+                            </m:ctrlPr>
+                          </m:dPr>
+                          <m:e>
+                            <m:f>
+                              <m:fPr>
+                                <m:ctrlPr>
+                                  <w:rPr>
+                                    <w:rFonts w:ascii="Cambria Math" w:hAnsi="Cambria Math"/>
+                                    <w:i/>
+                                  </w:rPr>
+                                </m:ctrlPr>
+                              </m:fPr>
+                              <m:num>
+                                <m:sSub>
+                                  <m:sSubPr>
+                                    <m:ctrlPr>
+                                      <w:rPr>
+                                        <w:rFonts w:ascii="Cambria Math" w:hAnsi="Cambria Math"/>
+                                        <w:i/>
+                                      </w:rPr>
+                                    </m:ctrlPr>
+                                  </m:sSubPr>
+                                  <m:e>
+                                    <m:r>
+                                      <w:rPr>
+                                        <w:rFonts w:ascii="Cambria Math" w:hAnsi="Cambria Math"/>
+                                      </w:rPr>
+                                      <m:t>V</m:t>
+                                    </m:r>
+                                  </m:e>
+                                  <m:sub>
+                                    <m:r>
+                                      <w:rPr>
+                                        <w:rFonts w:ascii="Cambria Math" w:hAnsi="Cambria Math"/>
+                                      </w:rPr>
+                                      <m:t>u</m:t>
+                                    </m:r>
+                                  </m:sub>
+                                </m:sSub>
+                              </m:num>
+                              <m:den>
+                                <m:sSub>
+                                  <m:sSubPr>
+                                    <m:ctrlPr>
+                                      <w:rPr>
+                                        <w:rFonts w:ascii="Cambria Math" w:hAnsi="Cambria Math"/>
+                                        <w:i/>
+                                      </w:rPr>
+                                    </m:ctrlPr>
+                                  </m:sSubPr>
+                                  <m:e>
+                                    <m:r>
+                                      <w:rPr>
+                                        <w:rFonts w:ascii="Cambria Math" w:hAnsi="Cambria Math"/>
+                                      </w:rPr>
+                                      <m:t>φ</m:t>
+                                    </m:r>
+                                  </m:e>
+                                  <m:sub>
+                                    <m:r>
+                                      <w:rPr>
+                                        <w:rFonts w:ascii="Cambria Math" w:hAnsi="Cambria Math"/>
+                                      </w:rPr>
+                                      <m:t>v</m:t>
+                                    </m:r>
+                                  </m:sub>
+                                </m:sSub>
+                              </m:den>
+                            </m:f>
+                            <m:r>
+                              <w:rPr>
+                                <w:rFonts w:ascii="Cambria Math" w:hAnsi="Cambria Math"/>
+                              </w:rPr>
+                              <m:t>-</m:t>
+                            </m:r>
+                            <m:sSub>
+                              <m:sSubPr>
+                                <m:ctrlPr>
+                                  <w:rPr>
+                                    <w:rFonts w:ascii="Cambria Math" w:hAnsi="Cambria Math"/>
+                                    <w:i/>
+                                  </w:rPr>
+                                </m:ctrlPr>
+                              </m:sSubPr>
+                              <m:e>
+                                <m:r>
+                                  <w:rPr>
+                                    <w:rFonts w:ascii="Cambria Math" w:hAnsi="Cambria Math"/>
+                                  </w:rPr>
+                                  <m:t>V</m:t>
+                                </m:r>
+                              </m:e>
+                              <m:sub>
+                                <m:r>
+                                  <w:rPr>
+                                    <w:rFonts w:ascii="Cambria Math" w:hAnsi="Cambria Math"/>
+                                  </w:rPr>
+                                  <m:t>p</m:t>
+                                </m:r>
+                              </m:sub>
+                            </m:sSub>
+                          </m:e>
+                        </m:d>
+                        <m:r>
+                          <w:rPr>
+                            <w:rFonts w:ascii="Cambria Math" w:hAnsi="Cambria Math"/>
+                          </w:rPr>
+                          <m:t>-0.5</m:t>
+                        </m:r>
+                        <m:sSub>
+                          <m:sSubPr>
+                            <m:ctrlPr>
+                              <w:rPr>
+                                <w:rFonts w:ascii="Cambria Math" w:hAnsi="Cambria Math"/>
+                                <w:i/>
+                              </w:rPr>
+                            </m:ctrlPr>
+                          </m:sSubPr>
+                          <m:e>
+                            <m:r>
+                              <w:rPr>
+                                <w:rFonts w:ascii="Cambria Math" w:hAnsi="Cambria Math"/>
+                              </w:rPr>
+                              <m:t>V</m:t>
+                            </m:r>
+                          </m:e>
+                          <m:sub>
+                            <m:r>
+                              <w:rPr>
+                                <w:rFonts w:ascii="Cambria Math" w:hAnsi="Cambria Math"/>
+                              </w:rPr>
+                              <m:t>s</m:t>
+                            </m:r>
+                          </m:sub>
+                        </m:sSub>
+                      </m:e>
+                    </m:d>
+                    <m:func>
+                      <m:funcPr>
+                        <m:ctrlPr>
+                          <w:rPr>
+                            <w:rFonts w:ascii="Cambria Math" w:hAnsi="Cambria Math"/>
+                            <w:i/>
+                          </w:rPr>
+                        </m:ctrlPr>
+                      </m:funcPr>
+                      <m:fName>
+                        <m:r>
+                          <m:rPr>
+                            <m:sty m:val="p"/>
+                          </m:rPr>
+                          <w:rPr>
+                            <w:rFonts w:ascii="Cambria Math" w:hAnsi="Cambria Math"/>
+                          </w:rPr>
+                          <m:t>cot</m:t>
+                        </m:r>
+                      </m:fName>
+                      <m:e>
+                        <m:r>
+                          <w:rPr>
+                            <w:rFonts w:ascii="Cambria Math" w:hAnsi="Cambria Math"/>
+                          </w:rPr>
+                          <m:t>θ</m:t>
+                        </m:r>
+                      </m:e>
+                    </m:func>
+                  </m:e>
+                </m:d>
+              </m:e>
+              <m:e>
+                <m:r>
+                  <w:rPr>
+                    <w:rFonts w:ascii="Cambria Math" w:hAnsi="Cambria Math"/>
+                  </w:rPr>
+                  <m:t>5.</m:t>
+                </m:r>
+                <m:r>
+                  <w:rPr>
+                    <w:rFonts w:ascii="Cambria Math" w:hAnsi="Cambria Math"/>
+                  </w:rPr>
+                  <m:t>7</m:t>
+                </m:r>
+                <m:r>
+                  <w:rPr>
+                    <w:rFonts w:ascii="Cambria Math" w:hAnsi="Cambria Math"/>
+                  </w:rPr>
+                  <m:t>.3.5-1</m:t>
+                </m:r>
+              </m:e>
+            </m:mr>
+            <m:mr>
+              <m:e>
+                <m:sSub>
+                  <m:sSubPr>
+                    <m:ctrlPr>
+                      <w:rPr>
+                        <w:rFonts w:ascii="Cambria Math" w:hAnsi="Cambria Math"/>
+                        <w:i/>
+                      </w:rPr>
+                    </m:ctrlPr>
+                  </m:sSubPr>
+                  <m:e>
+                    <m:sSub>
+                      <m:sSubPr>
+                        <m:ctrlPr>
+                          <w:rPr>
+                            <w:rFonts w:ascii="Cambria Math" w:hAnsi="Cambria Math"/>
+                            <w:i/>
+                          </w:rPr>
+                        </m:ctrlPr>
+                      </m:sSubPr>
+                      <m:e>
+                        <m:r>
+                          <w:rPr>
+                            <w:rFonts w:ascii="Cambria Math" w:hAnsi="Cambria Math"/>
+                          </w:rPr>
+                          <m:t>K</m:t>
+                        </m:r>
+                      </m:e>
+                      <m:sub>
+                        <m:r>
+                          <w:rPr>
+                            <w:rFonts w:ascii="Cambria Math" w:hAnsi="Cambria Math"/>
+                          </w:rPr>
+                          <m:t>db</m:t>
+                        </m:r>
+                      </m:sub>
+                    </m:sSub>
+                    <m:r>
+                      <w:rPr>
+                        <w:rFonts w:ascii="Cambria Math" w:hAnsi="Cambria Math"/>
+                      </w:rPr>
+                      <m:t>A</m:t>
+                    </m:r>
+                  </m:e>
+                  <m:sub>
+                    <m:r>
+                      <w:rPr>
+                        <w:rFonts w:ascii="Cambria Math" w:hAnsi="Cambria Math"/>
+                      </w:rPr>
+                      <m:t>s</m:t>
+                    </m:r>
+                  </m:sub>
+                </m:sSub>
+                <m:sSub>
+                  <m:sSubPr>
+                    <m:ctrlPr>
+                      <w:rPr>
+                        <w:rFonts w:ascii="Cambria Math" w:hAnsi="Cambria Math"/>
+                        <w:i/>
+                      </w:rPr>
+                    </m:ctrlPr>
+                  </m:sSubPr>
+                  <m:e>
+                    <m:r>
+                      <w:rPr>
+                        <w:rFonts w:ascii="Cambria Math" w:hAnsi="Cambria Math"/>
+                      </w:rPr>
+                      <m:t>f</m:t>
+                    </m:r>
+                  </m:e>
+                  <m:sub>
+                    <m:r>
+                      <w:rPr>
+                        <w:rFonts w:ascii="Cambria Math" w:hAnsi="Cambria Math"/>
+                      </w:rPr>
+                      <m:t>y</m:t>
+                    </m:r>
+                  </m:sub>
+                </m:sSub>
+                <m:r>
+                  <w:rPr>
+                    <w:rFonts w:ascii="Cambria Math" w:hAnsi="Cambria Math"/>
+                  </w:rPr>
+                  <m:t>+</m:t>
+                </m:r>
+                <m:sSub>
+                  <m:sSubPr>
+                    <m:ctrlPr>
+                      <w:rPr>
+                        <w:rFonts w:ascii="Cambria Math" w:hAnsi="Cambria Math"/>
+                        <w:i/>
+                      </w:rPr>
+                    </m:ctrlPr>
+                  </m:sSubPr>
+                  <m:e>
+                    <m:sSub>
+                      <m:sSubPr>
+                        <m:ctrlPr>
+                          <w:rPr>
+                            <w:rFonts w:ascii="Cambria Math" w:hAnsi="Cambria Math"/>
+                            <w:i/>
+                          </w:rPr>
+                        </m:ctrlPr>
+                      </m:sSubPr>
+                      <m:e>
+                        <m:r>
+                          <w:rPr>
+                            <w:rFonts w:ascii="Cambria Math" w:hAnsi="Cambria Math"/>
+                          </w:rPr>
+                          <m:t>K</m:t>
+                        </m:r>
+                      </m:e>
+                      <m:sub>
+                        <m:r>
+                          <w:rPr>
+                            <w:rFonts w:ascii="Cambria Math" w:hAnsi="Cambria Math"/>
+                          </w:rPr>
+                          <m:t>ds</m:t>
+                        </m:r>
+                      </m:sub>
+                    </m:sSub>
+                    <m:r>
+                      <w:rPr>
+                        <w:rFonts w:ascii="Cambria Math" w:hAnsi="Cambria Math"/>
+                      </w:rPr>
+                      <m:t>A</m:t>
+                    </m:r>
+                  </m:e>
+                  <m:sub>
+                    <m:r>
+                      <w:rPr>
+                        <w:rFonts w:ascii="Cambria Math" w:hAnsi="Cambria Math"/>
+                      </w:rPr>
+                      <m:t>ps</m:t>
+                    </m:r>
+                  </m:sub>
+                </m:sSub>
+                <m:sSub>
+                  <m:sSubPr>
+                    <m:ctrlPr>
+                      <w:rPr>
+                        <w:rFonts w:ascii="Cambria Math" w:hAnsi="Cambria Math"/>
+                        <w:i/>
+                      </w:rPr>
+                    </m:ctrlPr>
+                  </m:sSubPr>
+                  <m:e>
+                    <m:r>
+                      <w:rPr>
+                        <w:rFonts w:ascii="Cambria Math" w:hAnsi="Cambria Math"/>
+                      </w:rPr>
+                      <m:t>f</m:t>
+                    </m:r>
+                  </m:e>
+                  <m:sub>
+                    <m:r>
+                      <w:rPr>
+                        <w:rFonts w:ascii="Cambria Math" w:hAnsi="Cambria Math"/>
+                      </w:rPr>
+                      <m:t>ps</m:t>
+                    </m:r>
+                  </m:sub>
+                </m:sSub>
+                <m:r>
+                  <w:rPr>
+                    <w:rFonts w:ascii="Cambria Math" w:hAnsi="Cambria Math"/>
+                  </w:rPr>
+                  <m:t>+</m:t>
+                </m:r>
+                <m:sSub>
+                  <m:sSubPr>
+                    <m:ctrlPr>
+                      <w:rPr>
+                        <w:rFonts w:ascii="Cambria Math" w:hAnsi="Cambria Math"/>
+                        <w:i/>
+                      </w:rPr>
+                    </m:ctrlPr>
+                  </m:sSubPr>
+                  <m:e>
+                    <m:r>
+                      <w:rPr>
+                        <w:rFonts w:ascii="Cambria Math" w:hAnsi="Cambria Math"/>
+                      </w:rPr>
+                      <m:t>A</m:t>
+                    </m:r>
+                  </m:e>
+                  <m:sub>
+                    <m:r>
+                      <w:rPr>
+                        <w:rFonts w:ascii="Cambria Math" w:hAnsi="Cambria Math"/>
+                      </w:rPr>
+                      <m:t>pt</m:t>
+                    </m:r>
+                  </m:sub>
+                </m:sSub>
+                <m:sSub>
+                  <m:sSubPr>
+                    <m:ctrlPr>
+                      <w:rPr>
+                        <w:rFonts w:ascii="Cambria Math" w:hAnsi="Cambria Math"/>
+                        <w:i/>
+                      </w:rPr>
+                    </m:ctrlPr>
+                  </m:sSubPr>
+                  <m:e>
+                    <m:r>
+                      <w:rPr>
+                        <w:rFonts w:ascii="Cambria Math" w:hAnsi="Cambria Math"/>
+                      </w:rPr>
+                      <m:t>f</m:t>
+                    </m:r>
+                  </m:e>
+                  <m:sub>
+                    <m:r>
+                      <w:rPr>
+                        <w:rFonts w:ascii="Cambria Math" w:hAnsi="Cambria Math"/>
+                      </w:rPr>
+                      <m:t>pt</m:t>
+                    </m:r>
+                  </m:sub>
+                </m:sSub>
+                <m:r>
+                  <w:rPr>
+                    <w:rFonts w:ascii="Cambria Math" w:hAnsi="Cambria Math"/>
+                  </w:rPr>
+                  <m:t>≥</m:t>
+                </m:r>
+                <m:d>
+                  <m:dPr>
+                    <m:ctrlPr>
+                      <w:rPr>
+                        <w:rFonts w:ascii="Cambria Math" w:hAnsi="Cambria Math"/>
+                        <w:i/>
+                      </w:rPr>
+                    </m:ctrlPr>
+                  </m:dPr>
+                  <m:e>
+                    <m:f>
+                      <m:fPr>
+                        <m:ctrlPr>
+                          <w:rPr>
+                            <w:rFonts w:ascii="Cambria Math" w:hAnsi="Cambria Math"/>
+                            <w:i/>
+                          </w:rPr>
+                        </m:ctrlPr>
+                      </m:fPr>
+                      <m:num>
+                        <m:sSub>
+                          <m:sSubPr>
+                            <m:ctrlPr>
+                              <w:rPr>
+                                <w:rFonts w:ascii="Cambria Math" w:hAnsi="Cambria Math"/>
+                                <w:i/>
+                              </w:rPr>
+                            </m:ctrlPr>
+                          </m:sSubPr>
+                          <m:e>
+                            <m:r>
+                              <w:rPr>
+                                <w:rFonts w:ascii="Cambria Math" w:hAnsi="Cambria Math"/>
+                              </w:rPr>
+                              <m:t>V</m:t>
+                            </m:r>
+                          </m:e>
+                          <m:sub>
+                            <m:r>
+                              <w:rPr>
+                                <w:rFonts w:ascii="Cambria Math" w:hAnsi="Cambria Math"/>
+                              </w:rPr>
+                              <m:t>u</m:t>
+                            </m:r>
+                          </m:sub>
+                        </m:sSub>
+                      </m:num>
+                      <m:den>
+                        <m:sSub>
+                          <m:sSubPr>
+                            <m:ctrlPr>
+                              <w:rPr>
+                                <w:rFonts w:ascii="Cambria Math" w:hAnsi="Cambria Math"/>
+                                <w:i/>
+                              </w:rPr>
+                            </m:ctrlPr>
+                          </m:sSubPr>
+                          <m:e>
+                            <m:r>
+                              <w:rPr>
+                                <w:rFonts w:ascii="Cambria Math" w:hAnsi="Cambria Math"/>
+                              </w:rPr>
+                              <m:t>φ</m:t>
+                            </m:r>
+                          </m:e>
+                          <m:sub>
+                            <m:r>
+                              <w:rPr>
+                                <w:rFonts w:ascii="Cambria Math" w:hAnsi="Cambria Math"/>
+                              </w:rPr>
+                              <m:t>v</m:t>
+                            </m:r>
+                          </m:sub>
+                        </m:sSub>
+                      </m:den>
+                    </m:f>
+                    <m:r>
+                      <w:rPr>
+                        <w:rFonts w:ascii="Cambria Math" w:hAnsi="Cambria Math"/>
+                      </w:rPr>
+                      <m:t>-</m:t>
+                    </m:r>
+                    <m:sSub>
+                      <m:sSubPr>
+                        <m:ctrlPr>
+                          <w:rPr>
+                            <w:rFonts w:ascii="Cambria Math" w:hAnsi="Cambria Math"/>
+                            <w:i/>
+                          </w:rPr>
+                        </m:ctrlPr>
+                      </m:sSubPr>
+                      <m:e>
+                        <m:r>
+                          <w:rPr>
+                            <w:rFonts w:ascii="Cambria Math" w:hAnsi="Cambria Math"/>
+                          </w:rPr>
+                          <m:t>V</m:t>
+                        </m:r>
+                      </m:e>
+                      <m:sub>
+                        <m:r>
+                          <w:rPr>
+                            <w:rFonts w:ascii="Cambria Math" w:hAnsi="Cambria Math"/>
+                          </w:rPr>
+                          <m:t>p</m:t>
+                        </m:r>
+                      </m:sub>
+                    </m:sSub>
+                    <m:r>
+                      <w:rPr>
+                        <w:rFonts w:ascii="Cambria Math" w:hAnsi="Cambria Math"/>
+                      </w:rPr>
+                      <m:t>-0.5</m:t>
+                    </m:r>
+                    <m:sSub>
+                      <m:sSubPr>
+                        <m:ctrlPr>
+                          <w:rPr>
+                            <w:rFonts w:ascii="Cambria Math" w:hAnsi="Cambria Math"/>
+                            <w:i/>
+                          </w:rPr>
+                        </m:ctrlPr>
+                      </m:sSubPr>
+                      <m:e>
+                        <m:r>
+                          <w:rPr>
+                            <w:rFonts w:ascii="Cambria Math" w:hAnsi="Cambria Math"/>
+                          </w:rPr>
+                          <m:t>V</m:t>
+                        </m:r>
+                      </m:e>
+                      <m:sub>
+                        <m:r>
+                          <w:rPr>
+                            <w:rFonts w:ascii="Cambria Math" w:hAnsi="Cambria Math"/>
+                          </w:rPr>
+                          <m:t>s</m:t>
+                        </m:r>
+                      </m:sub>
+                    </m:sSub>
+                  </m:e>
+                </m:d>
+                <m:func>
+                  <m:funcPr>
+                    <m:ctrlPr>
+                      <w:rPr>
+                        <w:rFonts w:ascii="Cambria Math" w:hAnsi="Cambria Math"/>
+                        <w:i/>
+                      </w:rPr>
+                    </m:ctrlPr>
+                  </m:funcPr>
+                  <m:fName>
+                    <m:r>
+                      <m:rPr>
+                        <m:sty m:val="p"/>
+                      </m:rPr>
+                      <w:rPr>
+                        <w:rFonts w:ascii="Cambria Math" w:hAnsi="Cambria Math"/>
+                      </w:rPr>
+                      <m:t>cot</m:t>
+                    </m:r>
+                  </m:fName>
+                  <m:e>
+                    <m:r>
+                      <w:rPr>
+                        <w:rFonts w:ascii="Cambria Math" w:hAnsi="Cambria Math"/>
+                      </w:rPr>
+                      <m:t>θ</m:t>
+                    </m:r>
+                  </m:e>
+                </m:func>
+              </m:e>
+              <m:e>
+                <m:r>
+                  <w:rPr>
+                    <w:rFonts w:ascii="Cambria Math" w:hAnsi="Cambria Math"/>
+                  </w:rPr>
+                  <m:t>5.</m:t>
+                </m:r>
+                <m:r>
+                  <w:rPr>
+                    <w:rFonts w:ascii="Cambria Math" w:hAnsi="Cambria Math"/>
+                  </w:rPr>
+                  <m:t>7</m:t>
+                </m:r>
+                <m:r>
+                  <w:rPr>
+                    <w:rFonts w:ascii="Cambria Math" w:hAnsi="Cambria Math"/>
+                  </w:rPr>
+                  <m:t>.3.5-2</m:t>
                 </m:r>
               </m:e>
             </m:mr>
@@ -3610,6 +6112,32 @@
               </m:ctrlPr>
             </m:sSubPr>
             <m:e>
+              <m:sSub>
+                <m:sSubPr>
+                  <m:ctrlPr>
+                    <w:rPr>
+                      <w:rFonts w:ascii="Cambria Math" w:hAnsi="Cambria Math"/>
+                      <w:i/>
+                    </w:rPr>
+                  </m:ctrlPr>
+                </m:sSubPr>
+                <m:e>
+                  <m:r>
+                    <w:rPr>
+                      <w:rFonts w:ascii="Cambria Math" w:hAnsi="Cambria Math"/>
+                    </w:rPr>
+                    <m:t>K</m:t>
+                  </m:r>
+                </m:e>
+                <m:sub>
+                  <m:r>
+                    <w:rPr>
+                      <w:rFonts w:ascii="Cambria Math" w:hAnsi="Cambria Math"/>
+                    </w:rPr>
+                    <m:t>ds</m:t>
+                  </m:r>
+                </m:sub>
+              </m:sSub>
               <m:r>
                 <w:rPr>
                   <w:rFonts w:ascii="Cambria Math" w:hAnsi="Cambria Math"/>
@@ -3668,6 +6196,32 @@
               </m:ctrlPr>
             </m:sSubPr>
             <m:e>
+              <m:sSub>
+                <m:sSubPr>
+                  <m:ctrlPr>
+                    <w:rPr>
+                      <w:rFonts w:ascii="Cambria Math" w:hAnsi="Cambria Math"/>
+                      <w:i/>
+                    </w:rPr>
+                  </m:ctrlPr>
+                </m:sSubPr>
+                <m:e>
+                  <m:r>
+                    <w:rPr>
+                      <w:rFonts w:ascii="Cambria Math" w:hAnsi="Cambria Math"/>
+                    </w:rPr>
+                    <m:t>K</m:t>
+                  </m:r>
+                </m:e>
+                <m:sub>
+                  <m:r>
+                    <w:rPr>
+                      <w:rFonts w:ascii="Cambria Math" w:hAnsi="Cambria Math"/>
+                    </w:rPr>
+                    <m:t>db</m:t>
+                  </m:r>
+                </m:sub>
+              </m:sSub>
               <m:r>
                 <w:rPr>
                   <w:rFonts w:ascii="Cambria Math" w:hAnsi="Cambria Math"/>
@@ -3724,7 +6278,7 @@
 </file>
 
 <file path=word/styles.xml><?xml version="1.0" encoding="utf-8"?>
-<w:styles xmlns:mc="http://schemas.openxmlformats.org/markup-compatibility/2006" xmlns:r="http://schemas.openxmlformats.org/officeDocument/2006/relationships" xmlns:w="http://schemas.openxmlformats.org/wordprocessingml/2006/main" xmlns:w14="http://schemas.microsoft.com/office/word/2010/wordml" xmlns:w15="http://schemas.microsoft.com/office/word/2012/wordml" xmlns:w16cex="http://schemas.microsoft.com/office/word/2018/wordml/cex" xmlns:w16cid="http://schemas.microsoft.com/office/word/2016/wordml/cid" xmlns:w16="http://schemas.microsoft.com/office/word/2018/wordml" xmlns:w16se="http://schemas.microsoft.com/office/word/2015/wordml/symex" mc:Ignorable="w14 w15 w16se w16cid w16 w16cex">
+<w:styles xmlns:mc="http://schemas.openxmlformats.org/markup-compatibility/2006" xmlns:r="http://schemas.openxmlformats.org/officeDocument/2006/relationships" xmlns:w="http://schemas.openxmlformats.org/wordprocessingml/2006/main" xmlns:w14="http://schemas.microsoft.com/office/word/2010/wordml" xmlns:w15="http://schemas.microsoft.com/office/word/2012/wordml" xmlns:w16cex="http://schemas.microsoft.com/office/word/2018/wordml/cex" xmlns:w16cid="http://schemas.microsoft.com/office/word/2016/wordml/cid" xmlns:w16="http://schemas.microsoft.com/office/word/2018/wordml" xmlns:w16du="http://schemas.microsoft.com/office/word/2023/wordml/word16du" xmlns:w16sdtdh="http://schemas.microsoft.com/office/word/2020/wordml/sdtdatahash" xmlns:w16sdtfl="http://schemas.microsoft.com/office/word/2024/wordml/sdtformatlock" xmlns:w16se="http://schemas.microsoft.com/office/word/2015/wordml/symex" mc:Ignorable="w14 w15 w16se w16cid w16 w16cex w16sdtdh w16sdtfl w16du">
   <w:docDefaults>
     <w:rPrDefault>
       <w:rPr>
@@ -3895,7 +6449,7 @@
     <w:lsdException w:name="Table Web 2" w:semiHidden="1" w:unhideWhenUsed="1"/>
     <w:lsdException w:name="Table Web 3" w:semiHidden="1" w:unhideWhenUsed="1"/>
     <w:lsdException w:name="Balloon Text" w:semiHidden="1" w:unhideWhenUsed="1"/>
-    <w:lsdException w:name="Table Grid" w:semiHidden="1" w:uiPriority="59" w:unhideWhenUsed="1"/>
+    <w:lsdException w:name="Table Grid" w:uiPriority="59"/>
     <w:lsdException w:name="Table Theme" w:semiHidden="1" w:unhideWhenUsed="1"/>
     <w:lsdException w:name="Placeholder Text" w:semiHidden="1"/>
     <w:lsdException w:name="No Spacing" w:uiPriority="1" w:qFormat="1"/>

</xml_diff>